<commit_message>
React Phase 2: Hooks & State Management (7 topics, 3-YOE depth)
useEffect bugs (stale closure, races, AbortController), memoization set,
useRef, custom hooks, Context pitfalls, Redux/Zustand, lifting state

Co-Authored-By: Claude Fable 5 <noreply@anthropic.com>
Claude-Session: https://claude.ai/code/session_01Vm8nqoCZNTvUn3BNmW1Tgz
</commit_message>
<xml_diff>
--- a/React_Interview_Theory.docx
+++ b/React_Interview_Theory.docx
@@ -2276,6 +2276,2469 @@
           <w:szCs w:val="18"/>
         </w:rPr>
         <w:t xml:space="preserve">useEffect runs after render for outside-world work - fetching, timers, subscriptions - controlled by its dependency array: [] once, [x] when x changes. The returned cleanup runs before re-execution and at unmount, replacing all three class lifecycle methods. The real model is synchronization with external systems, and StrictMode's double-mount catches missing cleanup.</w:t>
+      </w:r>
+    </w:p>
+    <w:p>
+      <w:pPr>
+        <w:spacing w:before="200" w:after="60" w:line="230" w:lineRule="auto"/>
+      </w:pPr>
+      <w:r>
+        <w:rPr>
+          <w:b/>
+          <w:color w:val="1F4E79"/>
+          <w:sz w:val="26"/>
+          <w:szCs w:val="26"/>
+        </w:rPr>
+        <w:t xml:space="preserve">React Phase 2 - Hooks and State Management</w:t>
+      </w:r>
+    </w:p>
+    <w:p>
+      <w:pPr>
+        <w:spacing w:before="140" w:after="40" w:line="230" w:lineRule="auto"/>
+      </w:pPr>
+      <w:r>
+        <w:rPr>
+          <w:b/>
+          <w:sz w:val="21"/>
+          <w:szCs w:val="21"/>
+        </w:rPr>
+        <w:t xml:space="preserve">R2.1  useEffect Deep - Dependencies, Cleanup, Common Bugs</w:t>
+      </w:r>
+    </w:p>
+    <w:p>
+      <w:pPr>
+        <w:spacing w:before="0" w:after="40" w:line="230" w:lineRule="auto"/>
+      </w:pPr>
+      <w:r>
+        <w:rPr>
+          <w:b/>
+          <w:sz w:val="18"/>
+          <w:szCs w:val="18"/>
+        </w:rPr>
+        <w:t xml:space="preserve">What it is:  </w:t>
+      </w:r>
+      <w:r>
+        <w:rPr>
+          <w:sz w:val="18"/>
+          <w:szCs w:val="18"/>
+        </w:rPr>
+        <w:t xml:space="preserve">Most React bugs live in effect dependency arrays - stale closures, infinite loops, and race conditions on fetches.</w:t>
+      </w:r>
+    </w:p>
+    <w:p>
+      <w:pPr>
+        <w:ind w:left="260" w:hanging="200"/>
+        <w:spacing w:before="0" w:after="25" w:line="230" w:lineRule="auto"/>
+      </w:pPr>
+      <w:r>
+        <w:rPr>
+          <w:sz w:val="18"/>
+          <w:szCs w:val="18"/>
+        </w:rPr>
+        <w:t xml:space="preserve">•   </w:t>
+      </w:r>
+      <w:r>
+        <w:rPr>
+          <w:sz w:val="18"/>
+          <w:szCs w:val="18"/>
+        </w:rPr>
+        <w:t xml:space="preserve">Rule: every reactive value read inside the effect belongs in the deps array - the eslint exhaustive-deps rule enforces it; silencing it hides bugs.</w:t>
+      </w:r>
+    </w:p>
+    <w:p>
+      <w:pPr>
+        <w:ind w:left="260" w:hanging="200"/>
+        <w:spacing w:before="0" w:after="25" w:line="230" w:lineRule="auto"/>
+      </w:pPr>
+      <w:r>
+        <w:rPr>
+          <w:sz w:val="18"/>
+          <w:szCs w:val="18"/>
+        </w:rPr>
+        <w:t xml:space="preserve">•   </w:t>
+      </w:r>
+      <w:r>
+        <w:rPr>
+          <w:sz w:val="18"/>
+          <w:szCs w:val="18"/>
+        </w:rPr>
+        <w:t xml:space="preserve">Stale closure: [] deps with a callback reading state - the effect captured the first render's values forever. Fix: correct deps or functional setState.</w:t>
+      </w:r>
+    </w:p>
+    <w:p>
+      <w:pPr>
+        <w:ind w:left="260" w:hanging="200"/>
+        <w:spacing w:before="0" w:after="25" w:line="230" w:lineRule="auto"/>
+      </w:pPr>
+      <w:r>
+        <w:rPr>
+          <w:sz w:val="18"/>
+          <w:szCs w:val="18"/>
+        </w:rPr>
+        <w:t xml:space="preserve">•   </w:t>
+      </w:r>
+      <w:r>
+        <w:rPr>
+          <w:sz w:val="18"/>
+          <w:szCs w:val="18"/>
+        </w:rPr>
+        <w:t xml:space="preserve">Infinite loop: effect sets state that is in its own deps, or an object/array literal in deps (new reference every render). Fix: primitives in deps, useMemo/useCallback for stable references, or restructure.</w:t>
+      </w:r>
+    </w:p>
+    <w:p>
+      <w:pPr>
+        <w:ind w:left="260" w:hanging="200"/>
+        <w:spacing w:before="0" w:after="25" w:line="230" w:lineRule="auto"/>
+      </w:pPr>
+      <w:r>
+        <w:rPr>
+          <w:sz w:val="18"/>
+          <w:szCs w:val="18"/>
+        </w:rPr>
+        <w:t xml:space="preserve">•   </w:t>
+      </w:r>
+      <w:r>
+        <w:rPr>
+          <w:sz w:val="18"/>
+          <w:szCs w:val="18"/>
+        </w:rPr>
+        <w:t xml:space="preserve">Fetch race: id changes fast, older slow response lands last and overwrites newer data. Fix: cleanup with AbortController (or an ignore flag) - cancel the stale request.</w:t>
+      </w:r>
+    </w:p>
+    <w:p>
+      <w:pPr>
+        <w:ind w:left="260" w:hanging="200"/>
+        <w:spacing w:before="0" w:after="25" w:line="230" w:lineRule="auto"/>
+      </w:pPr>
+      <w:r>
+        <w:rPr>
+          <w:sz w:val="18"/>
+          <w:szCs w:val="18"/>
+        </w:rPr>
+        <w:t xml:space="preserve">•   </w:t>
+      </w:r>
+      <w:r>
+        <w:rPr>
+          <w:sz w:val="18"/>
+          <w:szCs w:val="18"/>
+        </w:rPr>
+        <w:t xml:space="preserve">Async directly in useEffect is invalid (effect must return cleanup, not a promise) - define an inner async function and call it.</w:t>
+      </w:r>
+    </w:p>
+    <w:p>
+      <w:pPr>
+        <w:ind w:left="260" w:hanging="200"/>
+        <w:spacing w:before="0" w:after="25" w:line="230" w:lineRule="auto"/>
+      </w:pPr>
+      <w:r>
+        <w:rPr>
+          <w:sz w:val="18"/>
+          <w:szCs w:val="18"/>
+        </w:rPr>
+        <w:t xml:space="preserve">•   </w:t>
+      </w:r>
+      <w:r>
+        <w:rPr>
+          <w:sz w:val="18"/>
+          <w:szCs w:val="18"/>
+        </w:rPr>
+        <w:t xml:space="preserve">Not everything is an effect: derived data is computed in render; event logic goes in handlers. Effects are only for external synchronization.</w:t>
+      </w:r>
+    </w:p>
+    <w:p>
+      <w:pPr>
+        <w:ind w:left="260" w:hanging="0"/>
+        <w:spacing w:before="0" w:after="15" w:line="230" w:lineRule="auto"/>
+        <w:shd w:val="clear" w:color="auto" w:fill="F2F2F2"/>
+      </w:pPr>
+      <w:r>
+        <w:rPr>
+          <w:b/>
+          <w:sz w:val="17"/>
+          <w:szCs w:val="17"/>
+        </w:rPr>
+        <w:t xml:space="preserve">Example:  </w:t>
+      </w:r>
+      <w:r>
+        <w:rPr>
+          <w:rFonts w:ascii="Consolas" w:hAnsi="Consolas" w:cs="Consolas"/>
+          <w:color w:val="3B3B3B"/>
+          <w:sz w:val="17"/>
+          <w:szCs w:val="17"/>
+        </w:rPr>
+        <w:t xml:space="preserve">useEffect(() =&gt; {</w:t>
+      </w:r>
+    </w:p>
+    <w:p>
+      <w:pPr>
+        <w:ind w:left="260" w:hanging="0"/>
+        <w:spacing w:before="0" w:after="15" w:line="230" w:lineRule="auto"/>
+        <w:shd w:val="clear" w:color="auto" w:fill="F2F2F2"/>
+      </w:pPr>
+      <w:r>
+        <w:rPr>
+          <w:rFonts w:ascii="Consolas" w:hAnsi="Consolas" w:cs="Consolas"/>
+          <w:color w:val="3B3B3B"/>
+          <w:sz w:val="17"/>
+          <w:szCs w:val="17"/>
+        </w:rPr>
+        <w:t xml:space="preserve">  const ctrl = new AbortController();</w:t>
+      </w:r>
+    </w:p>
+    <w:p>
+      <w:pPr>
+        <w:ind w:left="260" w:hanging="0"/>
+        <w:spacing w:before="0" w:after="15" w:line="230" w:lineRule="auto"/>
+        <w:shd w:val="clear" w:color="auto" w:fill="F2F2F2"/>
+      </w:pPr>
+      <w:r>
+        <w:rPr>
+          <w:rFonts w:ascii="Consolas" w:hAnsi="Consolas" w:cs="Consolas"/>
+          <w:color w:val="3B3B3B"/>
+          <w:sz w:val="17"/>
+          <w:szCs w:val="17"/>
+        </w:rPr>
+        <w:t xml:space="preserve">  fetch(`/api/orders/${id}`,</w:t>
+      </w:r>
+    </w:p>
+    <w:p>
+      <w:pPr>
+        <w:ind w:left="260" w:hanging="0"/>
+        <w:spacing w:before="0" w:after="15" w:line="230" w:lineRule="auto"/>
+        <w:shd w:val="clear" w:color="auto" w:fill="F2F2F2"/>
+      </w:pPr>
+      <w:r>
+        <w:rPr>
+          <w:rFonts w:ascii="Consolas" w:hAnsi="Consolas" w:cs="Consolas"/>
+          <w:color w:val="3B3B3B"/>
+          <w:sz w:val="17"/>
+          <w:szCs w:val="17"/>
+        </w:rPr>
+        <w:t xml:space="preserve">        { signal: ctrl.signal })</w:t>
+      </w:r>
+    </w:p>
+    <w:p>
+      <w:pPr>
+        <w:ind w:left="260" w:hanging="0"/>
+        <w:spacing w:before="0" w:after="15" w:line="230" w:lineRule="auto"/>
+        <w:shd w:val="clear" w:color="auto" w:fill="F2F2F2"/>
+      </w:pPr>
+      <w:r>
+        <w:rPr>
+          <w:rFonts w:ascii="Consolas" w:hAnsi="Consolas" w:cs="Consolas"/>
+          <w:color w:val="3B3B3B"/>
+          <w:sz w:val="17"/>
+          <w:szCs w:val="17"/>
+        </w:rPr>
+        <w:t xml:space="preserve">    .then(r =&gt; r.json())</w:t>
+      </w:r>
+    </w:p>
+    <w:p>
+      <w:pPr>
+        <w:ind w:left="260" w:hanging="0"/>
+        <w:spacing w:before="0" w:after="15" w:line="230" w:lineRule="auto"/>
+        <w:shd w:val="clear" w:color="auto" w:fill="F2F2F2"/>
+      </w:pPr>
+      <w:r>
+        <w:rPr>
+          <w:rFonts w:ascii="Consolas" w:hAnsi="Consolas" w:cs="Consolas"/>
+          <w:color w:val="3B3B3B"/>
+          <w:sz w:val="17"/>
+          <w:szCs w:val="17"/>
+        </w:rPr>
+        <w:t xml:space="preserve">    .then(setOrder)</w:t>
+      </w:r>
+    </w:p>
+    <w:p>
+      <w:pPr>
+        <w:ind w:left="260" w:hanging="0"/>
+        <w:spacing w:before="0" w:after="15" w:line="230" w:lineRule="auto"/>
+        <w:shd w:val="clear" w:color="auto" w:fill="F2F2F2"/>
+      </w:pPr>
+      <w:r>
+        <w:rPr>
+          <w:rFonts w:ascii="Consolas" w:hAnsi="Consolas" w:cs="Consolas"/>
+          <w:color w:val="3B3B3B"/>
+          <w:sz w:val="17"/>
+          <w:szCs w:val="17"/>
+        </w:rPr>
+        <w:t xml:space="preserve">    .catch(e =&gt; {</w:t>
+      </w:r>
+    </w:p>
+    <w:p>
+      <w:pPr>
+        <w:ind w:left="260" w:hanging="0"/>
+        <w:spacing w:before="0" w:after="15" w:line="230" w:lineRule="auto"/>
+        <w:shd w:val="clear" w:color="auto" w:fill="F2F2F2"/>
+      </w:pPr>
+      <w:r>
+        <w:rPr>
+          <w:rFonts w:ascii="Consolas" w:hAnsi="Consolas" w:cs="Consolas"/>
+          <w:color w:val="3B3B3B"/>
+          <w:sz w:val="17"/>
+          <w:szCs w:val="17"/>
+        </w:rPr>
+        <w:t xml:space="preserve">      if (e.name !== "AbortError") setError(e);</w:t>
+      </w:r>
+    </w:p>
+    <w:p>
+      <w:pPr>
+        <w:ind w:left="260" w:hanging="0"/>
+        <w:spacing w:before="0" w:after="15" w:line="230" w:lineRule="auto"/>
+        <w:shd w:val="clear" w:color="auto" w:fill="F2F2F2"/>
+      </w:pPr>
+      <w:r>
+        <w:rPr>
+          <w:rFonts w:ascii="Consolas" w:hAnsi="Consolas" w:cs="Consolas"/>
+          <w:color w:val="3B3B3B"/>
+          <w:sz w:val="17"/>
+          <w:szCs w:val="17"/>
+        </w:rPr>
+        <w:t xml:space="preserve">    });</w:t>
+      </w:r>
+    </w:p>
+    <w:p>
+      <w:pPr>
+        <w:ind w:left="260" w:hanging="0"/>
+        <w:spacing w:before="0" w:after="15" w:line="230" w:lineRule="auto"/>
+        <w:shd w:val="clear" w:color="auto" w:fill="F2F2F2"/>
+      </w:pPr>
+      <w:r>
+        <w:rPr>
+          <w:rFonts w:ascii="Consolas" w:hAnsi="Consolas" w:cs="Consolas"/>
+          <w:color w:val="3B3B3B"/>
+          <w:sz w:val="17"/>
+          <w:szCs w:val="17"/>
+        </w:rPr>
+        <w:t xml:space="preserve">  return () =&gt; ctrl.abort(); // kill stale req</w:t>
+      </w:r>
+    </w:p>
+    <w:p>
+      <w:pPr>
+        <w:ind w:left="260" w:hanging="0"/>
+        <w:spacing w:before="0" w:after="15" w:line="230" w:lineRule="auto"/>
+        <w:shd w:val="clear" w:color="auto" w:fill="F2F2F2"/>
+      </w:pPr>
+      <w:r>
+        <w:rPr>
+          <w:rFonts w:ascii="Consolas" w:hAnsi="Consolas" w:cs="Consolas"/>
+          <w:color w:val="3B3B3B"/>
+          <w:sz w:val="17"/>
+          <w:szCs w:val="17"/>
+        </w:rPr>
+        <w:t xml:space="preserve">}, [id]);</w:t>
+      </w:r>
+    </w:p>
+    <w:p>
+      <w:pPr>
+        <w:ind w:left="120" w:hanging="0"/>
+        <w:spacing w:before="50" w:after="110" w:line="230" w:lineRule="auto"/>
+        <w:pBdr>
+          <w:left w:val="single" w:sz="12" w:space="4" w:color="2E5E1F"/>
+        </w:pBdr>
+      </w:pPr>
+      <w:r>
+        <w:rPr>
+          <w:b/>
+          <w:color w:val="2E5E1F"/>
+          <w:sz w:val="18"/>
+          <w:szCs w:val="18"/>
+        </w:rPr>
+        <w:t xml:space="preserve">Interview answer:  </w:t>
+      </w:r>
+      <w:r>
+        <w:rPr>
+          <w:i/>
+          <w:sz w:val="18"/>
+          <w:szCs w:val="18"/>
+        </w:rPr>
+        <w:t xml:space="preserve">The discipline is exhaustive deps - every value read inside goes in the array. The classic bugs: stale closures from missing deps, infinite loops from object literals in deps, and fetch races where an old response overwrites a new one - fixed with AbortController cleanup. And not everything is an effect: derived data belongs in render, event logic in handlers.</w:t>
+      </w:r>
+    </w:p>
+    <w:p>
+      <w:pPr>
+        <w:spacing w:before="140" w:after="40" w:line="230" w:lineRule="auto"/>
+      </w:pPr>
+      <w:r>
+        <w:rPr>
+          <w:b/>
+          <w:sz w:val="21"/>
+          <w:szCs w:val="21"/>
+        </w:rPr>
+        <w:t xml:space="preserve">R2.2  useMemo, useCallback and React.memo</w:t>
+      </w:r>
+    </w:p>
+    <w:p>
+      <w:pPr>
+        <w:spacing w:before="0" w:after="40" w:line="230" w:lineRule="auto"/>
+      </w:pPr>
+      <w:r>
+        <w:rPr>
+          <w:b/>
+          <w:sz w:val="18"/>
+          <w:szCs w:val="18"/>
+        </w:rPr>
+        <w:t xml:space="preserve">What it is:  </w:t>
+      </w:r>
+      <w:r>
+        <w:rPr>
+          <w:sz w:val="18"/>
+          <w:szCs w:val="18"/>
+        </w:rPr>
+        <w:t xml:space="preserve">Three memoization tools: useMemo caches a computed value, useCallback caches a function reference, React.memo skips a child's re-render when props are unchanged.</w:t>
+      </w:r>
+    </w:p>
+    <w:p>
+      <w:pPr>
+        <w:ind w:left="260" w:hanging="200"/>
+        <w:spacing w:before="0" w:after="25" w:line="230" w:lineRule="auto"/>
+      </w:pPr>
+      <w:r>
+        <w:rPr>
+          <w:sz w:val="18"/>
+          <w:szCs w:val="18"/>
+        </w:rPr>
+        <w:t xml:space="preserve">•   </w:t>
+      </w:r>
+      <w:r>
+        <w:rPr>
+          <w:sz w:val="18"/>
+          <w:szCs w:val="18"/>
+        </w:rPr>
+        <w:t xml:space="preserve">useMemo(() =&gt; heavyCalc(data), [data]) - recompute only when deps change; for expensive calculations and for stabilizing object/array references.</w:t>
+      </w:r>
+    </w:p>
+    <w:p>
+      <w:pPr>
+        <w:ind w:left="260" w:hanging="200"/>
+        <w:spacing w:before="0" w:after="25" w:line="230" w:lineRule="auto"/>
+      </w:pPr>
+      <w:r>
+        <w:rPr>
+          <w:sz w:val="18"/>
+          <w:szCs w:val="18"/>
+        </w:rPr>
+        <w:t xml:space="preserve">•   </w:t>
+      </w:r>
+      <w:r>
+        <w:rPr>
+          <w:sz w:val="18"/>
+          <w:szCs w:val="18"/>
+        </w:rPr>
+        <w:t xml:space="preserve">useCallback(fn, deps) - same idea for functions; without it a new function reference is created every render.</w:t>
+      </w:r>
+    </w:p>
+    <w:p>
+      <w:pPr>
+        <w:ind w:left="260" w:hanging="200"/>
+        <w:spacing w:before="0" w:after="25" w:line="230" w:lineRule="auto"/>
+      </w:pPr>
+      <w:r>
+        <w:rPr>
+          <w:sz w:val="18"/>
+          <w:szCs w:val="18"/>
+        </w:rPr>
+        <w:t xml:space="preserve">•   </w:t>
+      </w:r>
+      <w:r>
+        <w:rPr>
+          <w:sz w:val="18"/>
+          <w:szCs w:val="18"/>
+        </w:rPr>
+        <w:t xml:space="preserve">React.memo(Child) - shallow-compares props and skips re-render if equal. But a fresh callback/object prop breaks it every time - that is WHY useCallback/useMemo exist: the three work as a set.</w:t>
+      </w:r>
+    </w:p>
+    <w:p>
+      <w:pPr>
+        <w:ind w:left="260" w:hanging="200"/>
+        <w:spacing w:before="0" w:after="25" w:line="230" w:lineRule="auto"/>
+      </w:pPr>
+      <w:r>
+        <w:rPr>
+          <w:sz w:val="18"/>
+          <w:szCs w:val="18"/>
+        </w:rPr>
+        <w:t xml:space="preserve">•   </w:t>
+      </w:r>
+      <w:r>
+        <w:rPr>
+          <w:sz w:val="18"/>
+          <w:szCs w:val="18"/>
+        </w:rPr>
+        <w:t xml:space="preserve">Reference equality is the thread joining all three - React compares by Object.is, and new references defeat every optimization.</w:t>
+      </w:r>
+    </w:p>
+    <w:p>
+      <w:pPr>
+        <w:ind w:left="260" w:hanging="200"/>
+        <w:spacing w:before="0" w:after="25" w:line="230" w:lineRule="auto"/>
+      </w:pPr>
+      <w:r>
+        <w:rPr>
+          <w:sz w:val="18"/>
+          <w:szCs w:val="18"/>
+        </w:rPr>
+        <w:t xml:space="preserve">•   </w:t>
+      </w:r>
+      <w:r>
+        <w:rPr>
+          <w:sz w:val="18"/>
+          <w:szCs w:val="18"/>
+        </w:rPr>
+        <w:t xml:space="preserve">Do not memoize everything: each has bookkeeping cost; measure with Profiler/DevTools first, optimize hot paths (big lists, heavy children).</w:t>
+      </w:r>
+    </w:p>
+    <w:p>
+      <w:pPr>
+        <w:ind w:left="260" w:hanging="200"/>
+        <w:spacing w:before="0" w:after="25" w:line="230" w:lineRule="auto"/>
+      </w:pPr>
+      <w:r>
+        <w:rPr>
+          <w:sz w:val="18"/>
+          <w:szCs w:val="18"/>
+        </w:rPr>
+        <w:t xml:space="preserve">•   </w:t>
+      </w:r>
+      <w:r>
+        <w:rPr>
+          <w:sz w:val="18"/>
+          <w:szCs w:val="18"/>
+        </w:rPr>
+        <w:t xml:space="preserve">Deps arrays follow the same exhaustive rule as effects.</w:t>
+      </w:r>
+    </w:p>
+    <w:p>
+      <w:pPr>
+        <w:ind w:left="260" w:hanging="200"/>
+        <w:spacing w:before="0" w:after="25" w:line="230" w:lineRule="auto"/>
+      </w:pPr>
+      <w:r>
+        <w:rPr>
+          <w:sz w:val="18"/>
+          <w:szCs w:val="18"/>
+        </w:rPr>
+        <w:t xml:space="preserve">•   </w:t>
+      </w:r>
+      <w:r>
+        <w:rPr>
+          <w:sz w:val="18"/>
+          <w:szCs w:val="18"/>
+        </w:rPr>
+        <w:t xml:space="preserve">React Compiler (new) aims to auto-memoize and retire most manual useMemo/useCallback - naming it shows current knowledge.</w:t>
+      </w:r>
+    </w:p>
+    <w:p>
+      <w:pPr>
+        <w:ind w:left="260" w:hanging="0"/>
+        <w:spacing w:before="0" w:after="15" w:line="230" w:lineRule="auto"/>
+        <w:shd w:val="clear" w:color="auto" w:fill="F2F2F2"/>
+      </w:pPr>
+      <w:r>
+        <w:rPr>
+          <w:b/>
+          <w:sz w:val="17"/>
+          <w:szCs w:val="17"/>
+        </w:rPr>
+        <w:t xml:space="preserve">Example:  </w:t>
+      </w:r>
+      <w:r>
+        <w:rPr>
+          <w:rFonts w:ascii="Consolas" w:hAnsi="Consolas" w:cs="Consolas"/>
+          <w:color w:val="3B3B3B"/>
+          <w:sz w:val="17"/>
+          <w:szCs w:val="17"/>
+        </w:rPr>
+        <w:t xml:space="preserve">const filtered = useMemo(</w:t>
+      </w:r>
+    </w:p>
+    <w:p>
+      <w:pPr>
+        <w:ind w:left="260" w:hanging="0"/>
+        <w:spacing w:before="0" w:after="15" w:line="230" w:lineRule="auto"/>
+        <w:shd w:val="clear" w:color="auto" w:fill="F2F2F2"/>
+      </w:pPr>
+      <w:r>
+        <w:rPr>
+          <w:rFonts w:ascii="Consolas" w:hAnsi="Consolas" w:cs="Consolas"/>
+          <w:color w:val="3B3B3B"/>
+          <w:sz w:val="17"/>
+          <w:szCs w:val="17"/>
+        </w:rPr>
+        <w:t xml:space="preserve">  () =&gt; orders.filter(o =&gt; o.status === f),</w:t>
+      </w:r>
+    </w:p>
+    <w:p>
+      <w:pPr>
+        <w:ind w:left="260" w:hanging="0"/>
+        <w:spacing w:before="0" w:after="15" w:line="230" w:lineRule="auto"/>
+        <w:shd w:val="clear" w:color="auto" w:fill="F2F2F2"/>
+      </w:pPr>
+      <w:r>
+        <w:rPr>
+          <w:rFonts w:ascii="Consolas" w:hAnsi="Consolas" w:cs="Consolas"/>
+          <w:color w:val="3B3B3B"/>
+          <w:sz w:val="17"/>
+          <w:szCs w:val="17"/>
+        </w:rPr>
+        <w:t xml:space="preserve">  [orders, f]);</w:t>
+      </w:r>
+    </w:p>
+    <w:p>
+      <w:pPr>
+        <w:ind w:left="260" w:hanging="0"/>
+        <w:spacing w:before="0" w:after="15" w:line="230" w:lineRule="auto"/>
+        <w:shd w:val="clear" w:color="auto" w:fill="F2F2F2"/>
+      </w:pPr>
+      <w:r>
+        <w:rPr>
+          <w:rFonts w:ascii="Consolas" w:hAnsi="Consolas" w:cs="Consolas"/>
+          <w:color w:val="3B3B3B"/>
+          <w:sz w:val="17"/>
+          <w:szCs w:val="17"/>
+        </w:rPr>
+        <w:t xml:space="preserve">const onCancel = useCallback(</w:t>
+      </w:r>
+    </w:p>
+    <w:p>
+      <w:pPr>
+        <w:ind w:left="260" w:hanging="0"/>
+        <w:spacing w:before="0" w:after="15" w:line="230" w:lineRule="auto"/>
+        <w:shd w:val="clear" w:color="auto" w:fill="F2F2F2"/>
+      </w:pPr>
+      <w:r>
+        <w:rPr>
+          <w:rFonts w:ascii="Consolas" w:hAnsi="Consolas" w:cs="Consolas"/>
+          <w:color w:val="3B3B3B"/>
+          <w:sz w:val="17"/>
+          <w:szCs w:val="17"/>
+        </w:rPr>
+        <w:t xml:space="preserve">  id =&gt; api.cancel(id), []);</w:t>
+      </w:r>
+    </w:p>
+    <w:p>
+      <w:pPr>
+        <w:ind w:left="260" w:hanging="0"/>
+        <w:spacing w:before="0" w:after="15" w:line="230" w:lineRule="auto"/>
+        <w:shd w:val="clear" w:color="auto" w:fill="F2F2F2"/>
+      </w:pPr>
+      <w:r>
+        <w:rPr>
+          <w:rFonts w:ascii="Consolas" w:hAnsi="Consolas" w:cs="Consolas"/>
+          <w:color w:val="3B3B3B"/>
+          <w:sz w:val="17"/>
+          <w:szCs w:val="17"/>
+        </w:rPr>
+        <w:t xml:space="preserve">const Card = React.memo(OrderCard);</w:t>
+      </w:r>
+    </w:p>
+    <w:p>
+      <w:pPr>
+        <w:ind w:left="260" w:hanging="0"/>
+        <w:spacing w:before="0" w:after="15" w:line="230" w:lineRule="auto"/>
+        <w:shd w:val="clear" w:color="auto" w:fill="F2F2F2"/>
+      </w:pPr>
+      <w:r>
+        <w:rPr>
+          <w:rFonts w:ascii="Consolas" w:hAnsi="Consolas" w:cs="Consolas"/>
+          <w:color w:val="3B3B3B"/>
+          <w:sz w:val="17"/>
+          <w:szCs w:val="17"/>
+        </w:rPr>
+        <w:t xml:space="preserve">// stable props -&gt; memo actually works</w:t>
+      </w:r>
+    </w:p>
+    <w:p>
+      <w:pPr>
+        <w:ind w:left="120" w:hanging="0"/>
+        <w:spacing w:before="50" w:after="110" w:line="230" w:lineRule="auto"/>
+        <w:pBdr>
+          <w:left w:val="single" w:sz="12" w:space="4" w:color="2E5E1F"/>
+        </w:pBdr>
+      </w:pPr>
+      <w:r>
+        <w:rPr>
+          <w:b/>
+          <w:color w:val="2E5E1F"/>
+          <w:sz w:val="18"/>
+          <w:szCs w:val="18"/>
+        </w:rPr>
+        <w:t xml:space="preserve">Interview answer:  </w:t>
+      </w:r>
+      <w:r>
+        <w:rPr>
+          <w:i/>
+          <w:sz w:val="18"/>
+          <w:szCs w:val="18"/>
+        </w:rPr>
+        <w:t xml:space="preserve">useMemo caches values, useCallback caches function references, and React.memo skips children with unchanged props - they work as a set because memo's shallow compare dies on fresh references. I apply them on measured hot paths, not everywhere, keep deps exhaustive, and note that React Compiler is moving this memoization into the build step.</w:t>
+      </w:r>
+    </w:p>
+    <w:p>
+      <w:pPr>
+        <w:spacing w:before="140" w:after="40" w:line="230" w:lineRule="auto"/>
+      </w:pPr>
+      <w:r>
+        <w:rPr>
+          <w:b/>
+          <w:sz w:val="21"/>
+          <w:szCs w:val="21"/>
+        </w:rPr>
+        <w:t xml:space="preserve">R2.3  useRef</w:t>
+      </w:r>
+    </w:p>
+    <w:p>
+      <w:pPr>
+        <w:spacing w:before="0" w:after="40" w:line="230" w:lineRule="auto"/>
+      </w:pPr>
+      <w:r>
+        <w:rPr>
+          <w:b/>
+          <w:sz w:val="18"/>
+          <w:szCs w:val="18"/>
+        </w:rPr>
+        <w:t xml:space="preserve">What it is:  </w:t>
+      </w:r>
+      <w:r>
+        <w:rPr>
+          <w:sz w:val="18"/>
+          <w:szCs w:val="18"/>
+        </w:rPr>
+        <w:t xml:space="preserve">useRef holds a mutable value that survives renders WITHOUT causing re-renders - used for DOM access and instance-like variables.</w:t>
+      </w:r>
+    </w:p>
+    <w:p>
+      <w:pPr>
+        <w:ind w:left="260" w:hanging="200"/>
+        <w:spacing w:before="0" w:after="25" w:line="230" w:lineRule="auto"/>
+      </w:pPr>
+      <w:r>
+        <w:rPr>
+          <w:sz w:val="18"/>
+          <w:szCs w:val="18"/>
+        </w:rPr>
+        <w:t xml:space="preserve">•   </w:t>
+      </w:r>
+      <w:r>
+        <w:rPr>
+          <w:sz w:val="18"/>
+          <w:szCs w:val="18"/>
+        </w:rPr>
+        <w:t xml:space="preserve">ref.current is mutable; changing it never re-renders - the opposite trade-off from state.</w:t>
+      </w:r>
+    </w:p>
+    <w:p>
+      <w:pPr>
+        <w:ind w:left="260" w:hanging="200"/>
+        <w:spacing w:before="0" w:after="25" w:line="230" w:lineRule="auto"/>
+      </w:pPr>
+      <w:r>
+        <w:rPr>
+          <w:sz w:val="18"/>
+          <w:szCs w:val="18"/>
+        </w:rPr>
+        <w:t xml:space="preserve">•   </w:t>
+      </w:r>
+      <w:r>
+        <w:rPr>
+          <w:sz w:val="18"/>
+          <w:szCs w:val="18"/>
+        </w:rPr>
+        <w:t xml:space="preserve">DOM access: &lt;input ref={inputRef} /&gt; then inputRef.current.focus() - focus, scroll, measure, media control.</w:t>
+      </w:r>
+    </w:p>
+    <w:p>
+      <w:pPr>
+        <w:ind w:left="260" w:hanging="200"/>
+        <w:spacing w:before="0" w:after="25" w:line="230" w:lineRule="auto"/>
+      </w:pPr>
+      <w:r>
+        <w:rPr>
+          <w:sz w:val="18"/>
+          <w:szCs w:val="18"/>
+        </w:rPr>
+        <w:t xml:space="preserve">•   </w:t>
+      </w:r>
+      <w:r>
+        <w:rPr>
+          <w:sz w:val="18"/>
+          <w:szCs w:val="18"/>
+        </w:rPr>
+        <w:t xml:space="preserve">Instance variables: interval ids, previous values, 'is first render' flags, latest-value mirrors for callbacks - anything to remember that is not display data.</w:t>
+      </w:r>
+    </w:p>
+    <w:p>
+      <w:pPr>
+        <w:ind w:left="260" w:hanging="200"/>
+        <w:spacing w:before="0" w:after="25" w:line="230" w:lineRule="auto"/>
+      </w:pPr>
+      <w:r>
+        <w:rPr>
+          <w:sz w:val="18"/>
+          <w:szCs w:val="18"/>
+        </w:rPr>
+        <w:t xml:space="preserve">•   </w:t>
+      </w:r>
+      <w:r>
+        <w:rPr>
+          <w:sz w:val="18"/>
+          <w:szCs w:val="18"/>
+        </w:rPr>
+        <w:t xml:space="preserve">Choosing: value shown in UI -&gt; state; value only logic needs -&gt; ref.</w:t>
+      </w:r>
+    </w:p>
+    <w:p>
+      <w:pPr>
+        <w:ind w:left="260" w:hanging="200"/>
+        <w:spacing w:before="0" w:after="25" w:line="230" w:lineRule="auto"/>
+      </w:pPr>
+      <w:r>
+        <w:rPr>
+          <w:sz w:val="18"/>
+          <w:szCs w:val="18"/>
+        </w:rPr>
+        <w:t xml:space="preserve">•   </w:t>
+      </w:r>
+      <w:r>
+        <w:rPr>
+          <w:sz w:val="18"/>
+          <w:szCs w:val="18"/>
+        </w:rPr>
+        <w:t xml:space="preserve">Do not read/write refs during render - in handlers and effects only.</w:t>
+      </w:r>
+    </w:p>
+    <w:p>
+      <w:pPr>
+        <w:ind w:left="260" w:hanging="200"/>
+        <w:spacing w:before="0" w:after="25" w:line="230" w:lineRule="auto"/>
+      </w:pPr>
+      <w:r>
+        <w:rPr>
+          <w:sz w:val="18"/>
+          <w:szCs w:val="18"/>
+        </w:rPr>
+        <w:t xml:space="preserve">•   </w:t>
+      </w:r>
+      <w:r>
+        <w:rPr>
+          <w:sz w:val="18"/>
+          <w:szCs w:val="18"/>
+        </w:rPr>
+        <w:t xml:space="preserve">Passing refs to custom components: forwardRef (pre-19) - React 19 lets ref flow as a normal prop.</w:t>
+      </w:r>
+    </w:p>
+    <w:p>
+      <w:pPr>
+        <w:ind w:left="260" w:hanging="200"/>
+        <w:spacing w:before="0" w:after="25" w:line="230" w:lineRule="auto"/>
+      </w:pPr>
+      <w:r>
+        <w:rPr>
+          <w:sz w:val="18"/>
+          <w:szCs w:val="18"/>
+        </w:rPr>
+        <w:t xml:space="preserve">•   </w:t>
+      </w:r>
+      <w:r>
+        <w:rPr>
+          <w:sz w:val="18"/>
+          <w:szCs w:val="18"/>
+        </w:rPr>
+        <w:t xml:space="preserve">useImperativeHandle exposes a controlled API (e.g. focus()) from a child to its parent - rare but asked.</w:t>
+      </w:r>
+    </w:p>
+    <w:p>
+      <w:pPr>
+        <w:ind w:left="260" w:hanging="0"/>
+        <w:spacing w:before="0" w:after="15" w:line="230" w:lineRule="auto"/>
+        <w:shd w:val="clear" w:color="auto" w:fill="F2F2F2"/>
+      </w:pPr>
+      <w:r>
+        <w:rPr>
+          <w:b/>
+          <w:sz w:val="17"/>
+          <w:szCs w:val="17"/>
+        </w:rPr>
+        <w:t xml:space="preserve">Example:  </w:t>
+      </w:r>
+      <w:r>
+        <w:rPr>
+          <w:rFonts w:ascii="Consolas" w:hAnsi="Consolas" w:cs="Consolas"/>
+          <w:color w:val="3B3B3B"/>
+          <w:sz w:val="17"/>
+          <w:szCs w:val="17"/>
+        </w:rPr>
+        <w:t xml:space="preserve">const inputRef = useRef(null);</w:t>
+      </w:r>
+    </w:p>
+    <w:p>
+      <w:pPr>
+        <w:ind w:left="260" w:hanging="0"/>
+        <w:spacing w:before="0" w:after="15" w:line="230" w:lineRule="auto"/>
+        <w:shd w:val="clear" w:color="auto" w:fill="F2F2F2"/>
+      </w:pPr>
+      <w:r>
+        <w:rPr>
+          <w:rFonts w:ascii="Consolas" w:hAnsi="Consolas" w:cs="Consolas"/>
+          <w:color w:val="3B3B3B"/>
+          <w:sz w:val="17"/>
+          <w:szCs w:val="17"/>
+        </w:rPr>
+        <w:t xml:space="preserve">const timerRef = useRef(null);</w:t>
+      </w:r>
+    </w:p>
+    <w:p>
+      <w:pPr>
+        <w:ind w:left="260" w:hanging="0"/>
+        <w:spacing w:before="0" w:after="15" w:line="230" w:lineRule="auto"/>
+        <w:shd w:val="clear" w:color="auto" w:fill="F2F2F2"/>
+      </w:pPr>
+      <w:r>
+        <w:rPr>
+          <w:rFonts w:ascii="Consolas" w:hAnsi="Consolas" w:cs="Consolas"/>
+          <w:color w:val="3B3B3B"/>
+          <w:sz w:val="17"/>
+          <w:szCs w:val="17"/>
+        </w:rPr>
+        <w:t xml:space="preserve"/>
+      </w:r>
+    </w:p>
+    <w:p>
+      <w:pPr>
+        <w:ind w:left="260" w:hanging="0"/>
+        <w:spacing w:before="0" w:after="15" w:line="230" w:lineRule="auto"/>
+        <w:shd w:val="clear" w:color="auto" w:fill="F2F2F2"/>
+      </w:pPr>
+      <w:r>
+        <w:rPr>
+          <w:rFonts w:ascii="Consolas" w:hAnsi="Consolas" w:cs="Consolas"/>
+          <w:color w:val="3B3B3B"/>
+          <w:sz w:val="17"/>
+          <w:szCs w:val="17"/>
+        </w:rPr>
+        <w:t xml:space="preserve">useEffect(() =&gt; {</w:t>
+      </w:r>
+    </w:p>
+    <w:p>
+      <w:pPr>
+        <w:ind w:left="260" w:hanging="0"/>
+        <w:spacing w:before="0" w:after="15" w:line="230" w:lineRule="auto"/>
+        <w:shd w:val="clear" w:color="auto" w:fill="F2F2F2"/>
+      </w:pPr>
+      <w:r>
+        <w:rPr>
+          <w:rFonts w:ascii="Consolas" w:hAnsi="Consolas" w:cs="Consolas"/>
+          <w:color w:val="3B3B3B"/>
+          <w:sz w:val="17"/>
+          <w:szCs w:val="17"/>
+        </w:rPr>
+        <w:t xml:space="preserve">  inputRef.current?.focus();</w:t>
+      </w:r>
+    </w:p>
+    <w:p>
+      <w:pPr>
+        <w:ind w:left="260" w:hanging="0"/>
+        <w:spacing w:before="0" w:after="15" w:line="230" w:lineRule="auto"/>
+        <w:shd w:val="clear" w:color="auto" w:fill="F2F2F2"/>
+      </w:pPr>
+      <w:r>
+        <w:rPr>
+          <w:rFonts w:ascii="Consolas" w:hAnsi="Consolas" w:cs="Consolas"/>
+          <w:color w:val="3B3B3B"/>
+          <w:sz w:val="17"/>
+          <w:szCs w:val="17"/>
+        </w:rPr>
+        <w:t xml:space="preserve">  timerRef.current = setInterval(poll, 5000);</w:t>
+      </w:r>
+    </w:p>
+    <w:p>
+      <w:pPr>
+        <w:ind w:left="260" w:hanging="0"/>
+        <w:spacing w:before="0" w:after="15" w:line="230" w:lineRule="auto"/>
+        <w:shd w:val="clear" w:color="auto" w:fill="F2F2F2"/>
+      </w:pPr>
+      <w:r>
+        <w:rPr>
+          <w:rFonts w:ascii="Consolas" w:hAnsi="Consolas" w:cs="Consolas"/>
+          <w:color w:val="3B3B3B"/>
+          <w:sz w:val="17"/>
+          <w:szCs w:val="17"/>
+        </w:rPr>
+        <w:t xml:space="preserve">  return () =&gt; clearInterval(timerRef.current);</w:t>
+      </w:r>
+    </w:p>
+    <w:p>
+      <w:pPr>
+        <w:ind w:left="260" w:hanging="0"/>
+        <w:spacing w:before="0" w:after="15" w:line="230" w:lineRule="auto"/>
+        <w:shd w:val="clear" w:color="auto" w:fill="F2F2F2"/>
+      </w:pPr>
+      <w:r>
+        <w:rPr>
+          <w:rFonts w:ascii="Consolas" w:hAnsi="Consolas" w:cs="Consolas"/>
+          <w:color w:val="3B3B3B"/>
+          <w:sz w:val="17"/>
+          <w:szCs w:val="17"/>
+        </w:rPr>
+        <w:t xml:space="preserve">}, []);</w:t>
+      </w:r>
+    </w:p>
+    <w:p>
+      <w:pPr>
+        <w:ind w:left="260" w:hanging="0"/>
+        <w:spacing w:before="0" w:after="15" w:line="230" w:lineRule="auto"/>
+        <w:shd w:val="clear" w:color="auto" w:fill="F2F2F2"/>
+      </w:pPr>
+      <w:r>
+        <w:rPr>
+          <w:rFonts w:ascii="Consolas" w:hAnsi="Consolas" w:cs="Consolas"/>
+          <w:color w:val="3B3B3B"/>
+          <w:sz w:val="17"/>
+          <w:szCs w:val="17"/>
+        </w:rPr>
+        <w:t xml:space="preserve"/>
+      </w:r>
+    </w:p>
+    <w:p>
+      <w:pPr>
+        <w:ind w:left="260" w:hanging="0"/>
+        <w:spacing w:before="0" w:after="15" w:line="230" w:lineRule="auto"/>
+        <w:shd w:val="clear" w:color="auto" w:fill="F2F2F2"/>
+      </w:pPr>
+      <w:r>
+        <w:rPr>
+          <w:rFonts w:ascii="Consolas" w:hAnsi="Consolas" w:cs="Consolas"/>
+          <w:color w:val="3B3B3B"/>
+          <w:sz w:val="17"/>
+          <w:szCs w:val="17"/>
+        </w:rPr>
+        <w:t xml:space="preserve">&lt;input ref={inputRef} /&gt;</w:t>
+      </w:r>
+    </w:p>
+    <w:p>
+      <w:pPr>
+        <w:ind w:left="120" w:hanging="0"/>
+        <w:spacing w:before="50" w:after="110" w:line="230" w:lineRule="auto"/>
+        <w:pBdr>
+          <w:left w:val="single" w:sz="12" w:space="4" w:color="2E5E1F"/>
+        </w:pBdr>
+      </w:pPr>
+      <w:r>
+        <w:rPr>
+          <w:b/>
+          <w:color w:val="2E5E1F"/>
+          <w:sz w:val="18"/>
+          <w:szCs w:val="18"/>
+        </w:rPr>
+        <w:t xml:space="preserve">Interview answer:  </w:t>
+      </w:r>
+      <w:r>
+        <w:rPr>
+          <w:i/>
+          <w:sz w:val="18"/>
+          <w:szCs w:val="18"/>
+        </w:rPr>
+        <w:t xml:space="preserve">useRef gives a mutable .current that persists across renders without triggering them - for DOM handles (focus, scroll, measure) and instance-style values like timer ids or previous state. Rule: UI data goes in state, logic-only data in refs, never touched during render. forwardRef passes refs into custom components, with React 19 making ref a plain prop.</w:t>
+      </w:r>
+    </w:p>
+    <w:p>
+      <w:pPr>
+        <w:spacing w:before="140" w:after="40" w:line="230" w:lineRule="auto"/>
+      </w:pPr>
+      <w:r>
+        <w:rPr>
+          <w:b/>
+          <w:sz w:val="21"/>
+          <w:szCs w:val="21"/>
+        </w:rPr>
+        <w:t xml:space="preserve">R2.4  Custom Hooks</w:t>
+      </w:r>
+    </w:p>
+    <w:p>
+      <w:pPr>
+        <w:spacing w:before="0" w:after="40" w:line="230" w:lineRule="auto"/>
+      </w:pPr>
+      <w:r>
+        <w:rPr>
+          <w:b/>
+          <w:sz w:val="18"/>
+          <w:szCs w:val="18"/>
+        </w:rPr>
+        <w:t xml:space="preserve">What it is:  </w:t>
+      </w:r>
+      <w:r>
+        <w:rPr>
+          <w:sz w:val="18"/>
+          <w:szCs w:val="18"/>
+        </w:rPr>
+        <w:t xml:space="preserve">A custom hook is a use-prefixed function combining built-in hooks to package reusable stateful logic.</w:t>
+      </w:r>
+    </w:p>
+    <w:p>
+      <w:pPr>
+        <w:ind w:left="260" w:hanging="200"/>
+        <w:spacing w:before="0" w:after="25" w:line="230" w:lineRule="auto"/>
+      </w:pPr>
+      <w:r>
+        <w:rPr>
+          <w:sz w:val="18"/>
+          <w:szCs w:val="18"/>
+        </w:rPr>
+        <w:t xml:space="preserve">•   </w:t>
+      </w:r>
+      <w:r>
+        <w:rPr>
+          <w:sz w:val="18"/>
+          <w:szCs w:val="18"/>
+        </w:rPr>
+        <w:t xml:space="preserve">Components share UI; custom hooks share LOGIC - fetching, debouncing, localStorage sync, form handling.</w:t>
+      </w:r>
+    </w:p>
+    <w:p>
+      <w:pPr>
+        <w:ind w:left="260" w:hanging="200"/>
+        <w:spacing w:before="0" w:after="25" w:line="230" w:lineRule="auto"/>
+      </w:pPr>
+      <w:r>
+        <w:rPr>
+          <w:sz w:val="18"/>
+          <w:szCs w:val="18"/>
+        </w:rPr>
+        <w:t xml:space="preserve">•   </w:t>
+      </w:r>
+      <w:r>
+        <w:rPr>
+          <w:sz w:val="18"/>
+          <w:szCs w:val="18"/>
+        </w:rPr>
+        <w:t xml:space="preserve">Just a function calling useState/useEffect etc.; the use prefix lets lint enforce the Rules of Hooks inside.</w:t>
+      </w:r>
+    </w:p>
+    <w:p>
+      <w:pPr>
+        <w:ind w:left="260" w:hanging="200"/>
+        <w:spacing w:before="0" w:after="25" w:line="230" w:lineRule="auto"/>
+      </w:pPr>
+      <w:r>
+        <w:rPr>
+          <w:sz w:val="18"/>
+          <w:szCs w:val="18"/>
+        </w:rPr>
+        <w:t xml:space="preserve">•   </w:t>
+      </w:r>
+      <w:r>
+        <w:rPr>
+          <w:sz w:val="18"/>
+          <w:szCs w:val="18"/>
+        </w:rPr>
+        <w:t xml:space="preserve">Each component calling a hook gets its OWN independent state - hooks share logic, not data.</w:t>
+      </w:r>
+    </w:p>
+    <w:p>
+      <w:pPr>
+        <w:ind w:left="260" w:hanging="200"/>
+        <w:spacing w:before="0" w:after="25" w:line="230" w:lineRule="auto"/>
+      </w:pPr>
+      <w:r>
+        <w:rPr>
+          <w:sz w:val="18"/>
+          <w:szCs w:val="18"/>
+        </w:rPr>
+        <w:t xml:space="preserve">•   </w:t>
+      </w:r>
+      <w:r>
+        <w:rPr>
+          <w:sz w:val="18"/>
+          <w:szCs w:val="18"/>
+        </w:rPr>
+        <w:t xml:space="preserve">Rules of Hooks: call at the top level (no ifs/loops) and only from components or other hooks - call order must be stable because React tracks hooks by position.</w:t>
+      </w:r>
+    </w:p>
+    <w:p>
+      <w:pPr>
+        <w:ind w:left="260" w:hanging="200"/>
+        <w:spacing w:before="0" w:after="25" w:line="230" w:lineRule="auto"/>
+      </w:pPr>
+      <w:r>
+        <w:rPr>
+          <w:sz w:val="18"/>
+          <w:szCs w:val="18"/>
+        </w:rPr>
+        <w:t xml:space="preserve">•   </w:t>
+      </w:r>
+      <w:r>
+        <w:rPr>
+          <w:sz w:val="18"/>
+          <w:szCs w:val="18"/>
+        </w:rPr>
+        <w:t xml:space="preserve">Classic examples: useFetch(url) returning {data, loading, error}; useDebounce(value, ms) for search boxes; useLocalStorage(key).</w:t>
+      </w:r>
+    </w:p>
+    <w:p>
+      <w:pPr>
+        <w:ind w:left="260" w:hanging="200"/>
+        <w:spacing w:before="0" w:after="25" w:line="230" w:lineRule="auto"/>
+      </w:pPr>
+      <w:r>
+        <w:rPr>
+          <w:sz w:val="18"/>
+          <w:szCs w:val="18"/>
+        </w:rPr>
+        <w:t xml:space="preserve">•   </w:t>
+      </w:r>
+      <w:r>
+        <w:rPr>
+          <w:sz w:val="18"/>
+          <w:szCs w:val="18"/>
+        </w:rPr>
+        <w:t xml:space="preserve">Refactor signal: same useState+useEffect combination in two components -&gt; extract a hook.</w:t>
+      </w:r>
+    </w:p>
+    <w:p>
+      <w:pPr>
+        <w:ind w:left="260" w:hanging="200"/>
+        <w:spacing w:before="0" w:after="25" w:line="230" w:lineRule="auto"/>
+      </w:pPr>
+      <w:r>
+        <w:rPr>
+          <w:sz w:val="18"/>
+          <w:szCs w:val="18"/>
+        </w:rPr>
+        <w:t xml:space="preserve">•   </w:t>
+      </w:r>
+      <w:r>
+        <w:rPr>
+          <w:sz w:val="18"/>
+          <w:szCs w:val="18"/>
+        </w:rPr>
+        <w:t xml:space="preserve">Hooks compose - a custom hook can use other custom hooks.</w:t>
+      </w:r>
+    </w:p>
+    <w:p>
+      <w:pPr>
+        <w:ind w:left="260" w:hanging="0"/>
+        <w:spacing w:before="0" w:after="15" w:line="230" w:lineRule="auto"/>
+        <w:shd w:val="clear" w:color="auto" w:fill="F2F2F2"/>
+      </w:pPr>
+      <w:r>
+        <w:rPr>
+          <w:b/>
+          <w:sz w:val="17"/>
+          <w:szCs w:val="17"/>
+        </w:rPr>
+        <w:t xml:space="preserve">Example:  </w:t>
+      </w:r>
+      <w:r>
+        <w:rPr>
+          <w:rFonts w:ascii="Consolas" w:hAnsi="Consolas" w:cs="Consolas"/>
+          <w:color w:val="3B3B3B"/>
+          <w:sz w:val="17"/>
+          <w:szCs w:val="17"/>
+        </w:rPr>
+        <w:t xml:space="preserve">function useDebounce(value, ms) {</w:t>
+      </w:r>
+    </w:p>
+    <w:p>
+      <w:pPr>
+        <w:ind w:left="260" w:hanging="0"/>
+        <w:spacing w:before="0" w:after="15" w:line="230" w:lineRule="auto"/>
+        <w:shd w:val="clear" w:color="auto" w:fill="F2F2F2"/>
+      </w:pPr>
+      <w:r>
+        <w:rPr>
+          <w:rFonts w:ascii="Consolas" w:hAnsi="Consolas" w:cs="Consolas"/>
+          <w:color w:val="3B3B3B"/>
+          <w:sz w:val="17"/>
+          <w:szCs w:val="17"/>
+        </w:rPr>
+        <w:t xml:space="preserve">  const [debounced, setDebounced] =</w:t>
+      </w:r>
+    </w:p>
+    <w:p>
+      <w:pPr>
+        <w:ind w:left="260" w:hanging="0"/>
+        <w:spacing w:before="0" w:after="15" w:line="230" w:lineRule="auto"/>
+        <w:shd w:val="clear" w:color="auto" w:fill="F2F2F2"/>
+      </w:pPr>
+      <w:r>
+        <w:rPr>
+          <w:rFonts w:ascii="Consolas" w:hAnsi="Consolas" w:cs="Consolas"/>
+          <w:color w:val="3B3B3B"/>
+          <w:sz w:val="17"/>
+          <w:szCs w:val="17"/>
+        </w:rPr>
+        <w:t xml:space="preserve">    useState(value);</w:t>
+      </w:r>
+    </w:p>
+    <w:p>
+      <w:pPr>
+        <w:ind w:left="260" w:hanging="0"/>
+        <w:spacing w:before="0" w:after="15" w:line="230" w:lineRule="auto"/>
+        <w:shd w:val="clear" w:color="auto" w:fill="F2F2F2"/>
+      </w:pPr>
+      <w:r>
+        <w:rPr>
+          <w:rFonts w:ascii="Consolas" w:hAnsi="Consolas" w:cs="Consolas"/>
+          <w:color w:val="3B3B3B"/>
+          <w:sz w:val="17"/>
+          <w:szCs w:val="17"/>
+        </w:rPr>
+        <w:t xml:space="preserve">  useEffect(() =&gt; {</w:t>
+      </w:r>
+    </w:p>
+    <w:p>
+      <w:pPr>
+        <w:ind w:left="260" w:hanging="0"/>
+        <w:spacing w:before="0" w:after="15" w:line="230" w:lineRule="auto"/>
+        <w:shd w:val="clear" w:color="auto" w:fill="F2F2F2"/>
+      </w:pPr>
+      <w:r>
+        <w:rPr>
+          <w:rFonts w:ascii="Consolas" w:hAnsi="Consolas" w:cs="Consolas"/>
+          <w:color w:val="3B3B3B"/>
+          <w:sz w:val="17"/>
+          <w:szCs w:val="17"/>
+        </w:rPr>
+        <w:t xml:space="preserve">    const t = setTimeout(</w:t>
+      </w:r>
+    </w:p>
+    <w:p>
+      <w:pPr>
+        <w:ind w:left="260" w:hanging="0"/>
+        <w:spacing w:before="0" w:after="15" w:line="230" w:lineRule="auto"/>
+        <w:shd w:val="clear" w:color="auto" w:fill="F2F2F2"/>
+      </w:pPr>
+      <w:r>
+        <w:rPr>
+          <w:rFonts w:ascii="Consolas" w:hAnsi="Consolas" w:cs="Consolas"/>
+          <w:color w:val="3B3B3B"/>
+          <w:sz w:val="17"/>
+          <w:szCs w:val="17"/>
+        </w:rPr>
+        <w:t xml:space="preserve">      () =&gt; setDebounced(value), ms);</w:t>
+      </w:r>
+    </w:p>
+    <w:p>
+      <w:pPr>
+        <w:ind w:left="260" w:hanging="0"/>
+        <w:spacing w:before="0" w:after="15" w:line="230" w:lineRule="auto"/>
+        <w:shd w:val="clear" w:color="auto" w:fill="F2F2F2"/>
+      </w:pPr>
+      <w:r>
+        <w:rPr>
+          <w:rFonts w:ascii="Consolas" w:hAnsi="Consolas" w:cs="Consolas"/>
+          <w:color w:val="3B3B3B"/>
+          <w:sz w:val="17"/>
+          <w:szCs w:val="17"/>
+        </w:rPr>
+        <w:t xml:space="preserve">    return () =&gt; clearTimeout(t);</w:t>
+      </w:r>
+    </w:p>
+    <w:p>
+      <w:pPr>
+        <w:ind w:left="260" w:hanging="0"/>
+        <w:spacing w:before="0" w:after="15" w:line="230" w:lineRule="auto"/>
+        <w:shd w:val="clear" w:color="auto" w:fill="F2F2F2"/>
+      </w:pPr>
+      <w:r>
+        <w:rPr>
+          <w:rFonts w:ascii="Consolas" w:hAnsi="Consolas" w:cs="Consolas"/>
+          <w:color w:val="3B3B3B"/>
+          <w:sz w:val="17"/>
+          <w:szCs w:val="17"/>
+        </w:rPr>
+        <w:t xml:space="preserve">  }, [value, ms]);</w:t>
+      </w:r>
+    </w:p>
+    <w:p>
+      <w:pPr>
+        <w:ind w:left="260" w:hanging="0"/>
+        <w:spacing w:before="0" w:after="15" w:line="230" w:lineRule="auto"/>
+        <w:shd w:val="clear" w:color="auto" w:fill="F2F2F2"/>
+      </w:pPr>
+      <w:r>
+        <w:rPr>
+          <w:rFonts w:ascii="Consolas" w:hAnsi="Consolas" w:cs="Consolas"/>
+          <w:color w:val="3B3B3B"/>
+          <w:sz w:val="17"/>
+          <w:szCs w:val="17"/>
+        </w:rPr>
+        <w:t xml:space="preserve">  return debounced;</w:t>
+      </w:r>
+    </w:p>
+    <w:p>
+      <w:pPr>
+        <w:ind w:left="260" w:hanging="0"/>
+        <w:spacing w:before="0" w:after="15" w:line="230" w:lineRule="auto"/>
+        <w:shd w:val="clear" w:color="auto" w:fill="F2F2F2"/>
+      </w:pPr>
+      <w:r>
+        <w:rPr>
+          <w:rFonts w:ascii="Consolas" w:hAnsi="Consolas" w:cs="Consolas"/>
+          <w:color w:val="3B3B3B"/>
+          <w:sz w:val="17"/>
+          <w:szCs w:val="17"/>
+        </w:rPr>
+        <w:t xml:space="preserve">}</w:t>
+      </w:r>
+    </w:p>
+    <w:p>
+      <w:pPr>
+        <w:ind w:left="260" w:hanging="0"/>
+        <w:spacing w:before="0" w:after="15" w:line="230" w:lineRule="auto"/>
+        <w:shd w:val="clear" w:color="auto" w:fill="F2F2F2"/>
+      </w:pPr>
+      <w:r>
+        <w:rPr>
+          <w:rFonts w:ascii="Consolas" w:hAnsi="Consolas" w:cs="Consolas"/>
+          <w:color w:val="3B3B3B"/>
+          <w:sz w:val="17"/>
+          <w:szCs w:val="17"/>
+        </w:rPr>
+        <w:t xml:space="preserve">// const q = useDebounce(search, 400);</w:t>
+      </w:r>
+    </w:p>
+    <w:p>
+      <w:pPr>
+        <w:ind w:left="120" w:hanging="0"/>
+        <w:spacing w:before="50" w:after="110" w:line="230" w:lineRule="auto"/>
+        <w:pBdr>
+          <w:left w:val="single" w:sz="12" w:space="4" w:color="2E5E1F"/>
+        </w:pBdr>
+      </w:pPr>
+      <w:r>
+        <w:rPr>
+          <w:b/>
+          <w:color w:val="2E5E1F"/>
+          <w:sz w:val="18"/>
+          <w:szCs w:val="18"/>
+        </w:rPr>
+        <w:t xml:space="preserve">Interview answer:  </w:t>
+      </w:r>
+      <w:r>
+        <w:rPr>
+          <w:i/>
+          <w:sz w:val="18"/>
+          <w:szCs w:val="18"/>
+        </w:rPr>
+        <w:t xml:space="preserve">Custom hooks package stateful logic - fetching, debouncing, storage sync - as use-prefixed functions built from other hooks. Each caller gets independent state; they share behavior, not data. They obey the Rules of Hooks (top-level, stable order), and my refactor trigger is the same state+effect pattern appearing twice.</w:t>
+      </w:r>
+    </w:p>
+    <w:p>
+      <w:pPr>
+        <w:spacing w:before="140" w:after="40" w:line="230" w:lineRule="auto"/>
+      </w:pPr>
+      <w:r>
+        <w:rPr>
+          <w:b/>
+          <w:sz w:val="21"/>
+          <w:szCs w:val="21"/>
+        </w:rPr>
+        <w:t xml:space="preserve">R2.5  Context API</w:t>
+      </w:r>
+    </w:p>
+    <w:p>
+      <w:pPr>
+        <w:spacing w:before="0" w:after="40" w:line="230" w:lineRule="auto"/>
+      </w:pPr>
+      <w:r>
+        <w:rPr>
+          <w:b/>
+          <w:sz w:val="18"/>
+          <w:szCs w:val="18"/>
+        </w:rPr>
+        <w:t xml:space="preserve">What it is:  </w:t>
+      </w:r>
+      <w:r>
+        <w:rPr>
+          <w:sz w:val="18"/>
+          <w:szCs w:val="18"/>
+        </w:rPr>
+        <w:t xml:space="preserve">Context passes data to any depth of the tree without prop drilling - a Provider supplies, useContext consumes.</w:t>
+      </w:r>
+    </w:p>
+    <w:p>
+      <w:pPr>
+        <w:ind w:left="260" w:hanging="200"/>
+        <w:spacing w:before="0" w:after="25" w:line="230" w:lineRule="auto"/>
+      </w:pPr>
+      <w:r>
+        <w:rPr>
+          <w:sz w:val="18"/>
+          <w:szCs w:val="18"/>
+        </w:rPr>
+        <w:t xml:space="preserve">•   </w:t>
+      </w:r>
+      <w:r>
+        <w:rPr>
+          <w:sz w:val="18"/>
+          <w:szCs w:val="18"/>
+        </w:rPr>
+        <w:t xml:space="preserve">createContext -&gt; &lt;Ctx.Provider value={...}&gt; high in the tree -&gt; useContext(Ctx) anywhere below. No prop chains through middle components.</w:t>
+      </w:r>
+    </w:p>
+    <w:p>
+      <w:pPr>
+        <w:ind w:left="260" w:hanging="200"/>
+        <w:spacing w:before="0" w:after="25" w:line="230" w:lineRule="auto"/>
+      </w:pPr>
+      <w:r>
+        <w:rPr>
+          <w:sz w:val="18"/>
+          <w:szCs w:val="18"/>
+        </w:rPr>
+        <w:t xml:space="preserve">•   </w:t>
+      </w:r>
+      <w:r>
+        <w:rPr>
+          <w:sz w:val="18"/>
+          <w:szCs w:val="18"/>
+        </w:rPr>
+        <w:t xml:space="preserve">Right use: low-frequency global-ish data - auth user, theme, language, feature flags.</w:t>
+      </w:r>
+    </w:p>
+    <w:p>
+      <w:pPr>
+        <w:ind w:left="260" w:hanging="200"/>
+        <w:spacing w:before="0" w:after="25" w:line="230" w:lineRule="auto"/>
+      </w:pPr>
+      <w:r>
+        <w:rPr>
+          <w:sz w:val="18"/>
+          <w:szCs w:val="18"/>
+        </w:rPr>
+        <w:t xml:space="preserve">•   </w:t>
+      </w:r>
+      <w:r>
+        <w:rPr>
+          <w:sz w:val="18"/>
+          <w:szCs w:val="18"/>
+        </w:rPr>
+        <w:t xml:space="preserve">Performance catch: EVERY consumer re-renders when value changes; an inline value={{user, login}} object is a new reference each render, re-rendering all consumers - wrap in useMemo.</w:t>
+      </w:r>
+    </w:p>
+    <w:p>
+      <w:pPr>
+        <w:ind w:left="260" w:hanging="200"/>
+        <w:spacing w:before="0" w:after="25" w:line="230" w:lineRule="auto"/>
+      </w:pPr>
+      <w:r>
+        <w:rPr>
+          <w:sz w:val="18"/>
+          <w:szCs w:val="18"/>
+        </w:rPr>
+        <w:t xml:space="preserve">•   </w:t>
+      </w:r>
+      <w:r>
+        <w:rPr>
+          <w:sz w:val="18"/>
+          <w:szCs w:val="18"/>
+        </w:rPr>
+        <w:t xml:space="preserve">Split contexts by change-rate (state context vs dispatch context) so fast-changing data does not shake stable consumers.</w:t>
+      </w:r>
+    </w:p>
+    <w:p>
+      <w:pPr>
+        <w:ind w:left="260" w:hanging="200"/>
+        <w:spacing w:before="0" w:after="25" w:line="230" w:lineRule="auto"/>
+      </w:pPr>
+      <w:r>
+        <w:rPr>
+          <w:sz w:val="18"/>
+          <w:szCs w:val="18"/>
+        </w:rPr>
+        <w:t xml:space="preserve">•   </w:t>
+      </w:r>
+      <w:r>
+        <w:rPr>
+          <w:sz w:val="18"/>
+          <w:szCs w:val="18"/>
+        </w:rPr>
+        <w:t xml:space="preserve">Not a state manager by itself: no selectors, no derived subscriptions - fast-changing shared state belongs in Zustand/Redux/React Query.</w:t>
+      </w:r>
+    </w:p>
+    <w:p>
+      <w:pPr>
+        <w:ind w:left="260" w:hanging="200"/>
+        <w:spacing w:before="0" w:after="25" w:line="230" w:lineRule="auto"/>
+      </w:pPr>
+      <w:r>
+        <w:rPr>
+          <w:sz w:val="18"/>
+          <w:szCs w:val="18"/>
+        </w:rPr>
+        <w:t xml:space="preserve">•   </w:t>
+      </w:r>
+      <w:r>
+        <w:rPr>
+          <w:sz w:val="18"/>
+          <w:szCs w:val="18"/>
+        </w:rPr>
+        <w:t xml:space="preserve">Custom hook wrapper (useAuth) hides the context, adds a helpful error when the Provider is missing.</w:t>
+      </w:r>
+    </w:p>
+    <w:p>
+      <w:pPr>
+        <w:ind w:left="260" w:hanging="200"/>
+        <w:spacing w:before="0" w:after="25" w:line="230" w:lineRule="auto"/>
+      </w:pPr>
+      <w:r>
+        <w:rPr>
+          <w:sz w:val="18"/>
+          <w:szCs w:val="18"/>
+        </w:rPr>
+        <w:t xml:space="preserve">•   </w:t>
+      </w:r>
+      <w:r>
+        <w:rPr>
+          <w:sz w:val="18"/>
+          <w:szCs w:val="18"/>
+        </w:rPr>
+        <w:t xml:space="preserve">Provider composition pattern: an AuthProvider component owning state + exposing context - context and logic in one module.</w:t>
+      </w:r>
+    </w:p>
+    <w:p>
+      <w:pPr>
+        <w:ind w:left="260" w:hanging="0"/>
+        <w:spacing w:before="0" w:after="15" w:line="230" w:lineRule="auto"/>
+        <w:shd w:val="clear" w:color="auto" w:fill="F2F2F2"/>
+      </w:pPr>
+      <w:r>
+        <w:rPr>
+          <w:b/>
+          <w:sz w:val="17"/>
+          <w:szCs w:val="17"/>
+        </w:rPr>
+        <w:t xml:space="preserve">Example:  </w:t>
+      </w:r>
+      <w:r>
+        <w:rPr>
+          <w:rFonts w:ascii="Consolas" w:hAnsi="Consolas" w:cs="Consolas"/>
+          <w:color w:val="3B3B3B"/>
+          <w:sz w:val="17"/>
+          <w:szCs w:val="17"/>
+        </w:rPr>
+        <w:t xml:space="preserve">const AuthCtx = createContext(null);</w:t>
+      </w:r>
+    </w:p>
+    <w:p>
+      <w:pPr>
+        <w:ind w:left="260" w:hanging="0"/>
+        <w:spacing w:before="0" w:after="15" w:line="230" w:lineRule="auto"/>
+        <w:shd w:val="clear" w:color="auto" w:fill="F2F2F2"/>
+      </w:pPr>
+      <w:r>
+        <w:rPr>
+          <w:rFonts w:ascii="Consolas" w:hAnsi="Consolas" w:cs="Consolas"/>
+          <w:color w:val="3B3B3B"/>
+          <w:sz w:val="17"/>
+          <w:szCs w:val="17"/>
+        </w:rPr>
+        <w:t xml:space="preserve"/>
+      </w:r>
+    </w:p>
+    <w:p>
+      <w:pPr>
+        <w:ind w:left="260" w:hanging="0"/>
+        <w:spacing w:before="0" w:after="15" w:line="230" w:lineRule="auto"/>
+        <w:shd w:val="clear" w:color="auto" w:fill="F2F2F2"/>
+      </w:pPr>
+      <w:r>
+        <w:rPr>
+          <w:rFonts w:ascii="Consolas" w:hAnsi="Consolas" w:cs="Consolas"/>
+          <w:color w:val="3B3B3B"/>
+          <w:sz w:val="17"/>
+          <w:szCs w:val="17"/>
+        </w:rPr>
+        <w:t xml:space="preserve">function AuthProvider({ children }) {</w:t>
+      </w:r>
+    </w:p>
+    <w:p>
+      <w:pPr>
+        <w:ind w:left="260" w:hanging="0"/>
+        <w:spacing w:before="0" w:after="15" w:line="230" w:lineRule="auto"/>
+        <w:shd w:val="clear" w:color="auto" w:fill="F2F2F2"/>
+      </w:pPr>
+      <w:r>
+        <w:rPr>
+          <w:rFonts w:ascii="Consolas" w:hAnsi="Consolas" w:cs="Consolas"/>
+          <w:color w:val="3B3B3B"/>
+          <w:sz w:val="17"/>
+          <w:szCs w:val="17"/>
+        </w:rPr>
+        <w:t xml:space="preserve">  const [user, setUser] = useState(null);</w:t>
+      </w:r>
+    </w:p>
+    <w:p>
+      <w:pPr>
+        <w:ind w:left="260" w:hanging="0"/>
+        <w:spacing w:before="0" w:after="15" w:line="230" w:lineRule="auto"/>
+        <w:shd w:val="clear" w:color="auto" w:fill="F2F2F2"/>
+      </w:pPr>
+      <w:r>
+        <w:rPr>
+          <w:rFonts w:ascii="Consolas" w:hAnsi="Consolas" w:cs="Consolas"/>
+          <w:color w:val="3B3B3B"/>
+          <w:sz w:val="17"/>
+          <w:szCs w:val="17"/>
+        </w:rPr>
+        <w:t xml:space="preserve">  const value = useMemo(</w:t>
+      </w:r>
+    </w:p>
+    <w:p>
+      <w:pPr>
+        <w:ind w:left="260" w:hanging="0"/>
+        <w:spacing w:before="0" w:after="15" w:line="230" w:lineRule="auto"/>
+        <w:shd w:val="clear" w:color="auto" w:fill="F2F2F2"/>
+      </w:pPr>
+      <w:r>
+        <w:rPr>
+          <w:rFonts w:ascii="Consolas" w:hAnsi="Consolas" w:cs="Consolas"/>
+          <w:color w:val="3B3B3B"/>
+          <w:sz w:val="17"/>
+          <w:szCs w:val="17"/>
+        </w:rPr>
+        <w:t xml:space="preserve">    () =&gt; ({ user, setUser }), [user]);</w:t>
+      </w:r>
+    </w:p>
+    <w:p>
+      <w:pPr>
+        <w:ind w:left="260" w:hanging="0"/>
+        <w:spacing w:before="0" w:after="15" w:line="230" w:lineRule="auto"/>
+        <w:shd w:val="clear" w:color="auto" w:fill="F2F2F2"/>
+      </w:pPr>
+      <w:r>
+        <w:rPr>
+          <w:rFonts w:ascii="Consolas" w:hAnsi="Consolas" w:cs="Consolas"/>
+          <w:color w:val="3B3B3B"/>
+          <w:sz w:val="17"/>
+          <w:szCs w:val="17"/>
+        </w:rPr>
+        <w:t xml:space="preserve">  return &lt;AuthCtx.Provider value={value}&gt;</w:t>
+      </w:r>
+    </w:p>
+    <w:p>
+      <w:pPr>
+        <w:ind w:left="260" w:hanging="0"/>
+        <w:spacing w:before="0" w:after="15" w:line="230" w:lineRule="auto"/>
+        <w:shd w:val="clear" w:color="auto" w:fill="F2F2F2"/>
+      </w:pPr>
+      <w:r>
+        <w:rPr>
+          <w:rFonts w:ascii="Consolas" w:hAnsi="Consolas" w:cs="Consolas"/>
+          <w:color w:val="3B3B3B"/>
+          <w:sz w:val="17"/>
+          <w:szCs w:val="17"/>
+        </w:rPr>
+        <w:t xml:space="preserve">           {children}</w:t>
+      </w:r>
+    </w:p>
+    <w:p>
+      <w:pPr>
+        <w:ind w:left="260" w:hanging="0"/>
+        <w:spacing w:before="0" w:after="15" w:line="230" w:lineRule="auto"/>
+        <w:shd w:val="clear" w:color="auto" w:fill="F2F2F2"/>
+      </w:pPr>
+      <w:r>
+        <w:rPr>
+          <w:rFonts w:ascii="Consolas" w:hAnsi="Consolas" w:cs="Consolas"/>
+          <w:color w:val="3B3B3B"/>
+          <w:sz w:val="17"/>
+          <w:szCs w:val="17"/>
+        </w:rPr>
+        <w:t xml:space="preserve">         &lt;/AuthCtx.Provider&gt;;</w:t>
+      </w:r>
+    </w:p>
+    <w:p>
+      <w:pPr>
+        <w:ind w:left="260" w:hanging="0"/>
+        <w:spacing w:before="0" w:after="15" w:line="230" w:lineRule="auto"/>
+        <w:shd w:val="clear" w:color="auto" w:fill="F2F2F2"/>
+      </w:pPr>
+      <w:r>
+        <w:rPr>
+          <w:rFonts w:ascii="Consolas" w:hAnsi="Consolas" w:cs="Consolas"/>
+          <w:color w:val="3B3B3B"/>
+          <w:sz w:val="17"/>
+          <w:szCs w:val="17"/>
+        </w:rPr>
+        <w:t xml:space="preserve">}</w:t>
+      </w:r>
+    </w:p>
+    <w:p>
+      <w:pPr>
+        <w:ind w:left="260" w:hanging="0"/>
+        <w:spacing w:before="0" w:after="15" w:line="230" w:lineRule="auto"/>
+        <w:shd w:val="clear" w:color="auto" w:fill="F2F2F2"/>
+      </w:pPr>
+      <w:r>
+        <w:rPr>
+          <w:rFonts w:ascii="Consolas" w:hAnsi="Consolas" w:cs="Consolas"/>
+          <w:color w:val="3B3B3B"/>
+          <w:sz w:val="17"/>
+          <w:szCs w:val="17"/>
+        </w:rPr>
+        <w:t xml:space="preserve">export const useAuth = () =&gt;</w:t>
+      </w:r>
+    </w:p>
+    <w:p>
+      <w:pPr>
+        <w:ind w:left="260" w:hanging="0"/>
+        <w:spacing w:before="0" w:after="15" w:line="230" w:lineRule="auto"/>
+        <w:shd w:val="clear" w:color="auto" w:fill="F2F2F2"/>
+      </w:pPr>
+      <w:r>
+        <w:rPr>
+          <w:rFonts w:ascii="Consolas" w:hAnsi="Consolas" w:cs="Consolas"/>
+          <w:color w:val="3B3B3B"/>
+          <w:sz w:val="17"/>
+          <w:szCs w:val="17"/>
+        </w:rPr>
+        <w:t xml:space="preserve">  useContext(AuthCtx);</w:t>
+      </w:r>
+    </w:p>
+    <w:p>
+      <w:pPr>
+        <w:ind w:left="120" w:hanging="0"/>
+        <w:spacing w:before="50" w:after="110" w:line="230" w:lineRule="auto"/>
+        <w:pBdr>
+          <w:left w:val="single" w:sz="12" w:space="4" w:color="2E5E1F"/>
+        </w:pBdr>
+      </w:pPr>
+      <w:r>
+        <w:rPr>
+          <w:b/>
+          <w:color w:val="2E5E1F"/>
+          <w:sz w:val="18"/>
+          <w:szCs w:val="18"/>
+        </w:rPr>
+        <w:t xml:space="preserve">Interview answer:  </w:t>
+      </w:r>
+      <w:r>
+        <w:rPr>
+          <w:i/>
+          <w:sz w:val="18"/>
+          <w:szCs w:val="18"/>
+        </w:rPr>
+        <w:t xml:space="preserve">Context solves prop drilling: a Provider high in the tree, useContext anywhere below - right for slow-changing data like the auth user or theme. Every consumer re-renders on value change, so I memoize the value object and split contexts by change-rate. For fast-changing shared state it is not enough - that is Zustand/Redux/React Query territory.</w:t>
+      </w:r>
+    </w:p>
+    <w:p>
+      <w:pPr>
+        <w:spacing w:before="140" w:after="40" w:line="230" w:lineRule="auto"/>
+      </w:pPr>
+      <w:r>
+        <w:rPr>
+          <w:b/>
+          <w:sz w:val="21"/>
+          <w:szCs w:val="21"/>
+        </w:rPr>
+        <w:t xml:space="preserve">R2.6  Redux / Zustand - When Global State</w:t>
+      </w:r>
+    </w:p>
+    <w:p>
+      <w:pPr>
+        <w:spacing w:before="0" w:after="40" w:line="230" w:lineRule="auto"/>
+      </w:pPr>
+      <w:r>
+        <w:rPr>
+          <w:b/>
+          <w:sz w:val="18"/>
+          <w:szCs w:val="18"/>
+        </w:rPr>
+        <w:t xml:space="preserve">What it is:  </w:t>
+      </w:r>
+      <w:r>
+        <w:rPr>
+          <w:sz w:val="18"/>
+          <w:szCs w:val="18"/>
+        </w:rPr>
+        <w:t xml:space="preserve">Global state managers hold app-wide client state outside the tree - needed less often than people think, since server data belongs to React Query.</w:t>
+      </w:r>
+    </w:p>
+    <w:p>
+      <w:pPr>
+        <w:ind w:left="260" w:hanging="200"/>
+        <w:spacing w:before="0" w:after="25" w:line="230" w:lineRule="auto"/>
+      </w:pPr>
+      <w:r>
+        <w:rPr>
+          <w:sz w:val="18"/>
+          <w:szCs w:val="18"/>
+        </w:rPr>
+        <w:t xml:space="preserve">•   </w:t>
+      </w:r>
+      <w:r>
+        <w:rPr>
+          <w:sz w:val="18"/>
+          <w:szCs w:val="18"/>
+        </w:rPr>
+        <w:t xml:space="preserve">First split the state kinds: server cache (API data) -&gt; React Query/SWR; local UI state -&gt; useState; truly global client state (auth session, cart, cross-page filters) -&gt; a store.</w:t>
+      </w:r>
+    </w:p>
+    <w:p>
+      <w:pPr>
+        <w:ind w:left="260" w:hanging="200"/>
+        <w:spacing w:before="0" w:after="25" w:line="230" w:lineRule="auto"/>
+      </w:pPr>
+      <w:r>
+        <w:rPr>
+          <w:sz w:val="18"/>
+          <w:szCs w:val="18"/>
+        </w:rPr>
+        <w:t xml:space="preserve">•   </w:t>
+      </w:r>
+      <w:r>
+        <w:rPr>
+          <w:sz w:val="18"/>
+          <w:szCs w:val="18"/>
+        </w:rPr>
+        <w:t xml:space="preserve">Redux Toolkit: single store, slices with reducers, useSelector/useDispatch; strict one-way flow, devtools time travel, middleware ecosystem. createSlice killed the old boilerplate complaint.</w:t>
+      </w:r>
+    </w:p>
+    <w:p>
+      <w:pPr>
+        <w:ind w:left="260" w:hanging="200"/>
+        <w:spacing w:before="0" w:after="25" w:line="230" w:lineRule="auto"/>
+      </w:pPr>
+      <w:r>
+        <w:rPr>
+          <w:sz w:val="18"/>
+          <w:szCs w:val="18"/>
+        </w:rPr>
+        <w:t xml:space="preserve">•   </w:t>
+      </w:r>
+      <w:r>
+        <w:rPr>
+          <w:sz w:val="18"/>
+          <w:szCs w:val="18"/>
+        </w:rPr>
+        <w:t xml:space="preserve">Selectors subscribe components to slices - only affected components re-render (vs context's all-consumers behavior).</w:t>
+      </w:r>
+    </w:p>
+    <w:p>
+      <w:pPr>
+        <w:ind w:left="260" w:hanging="200"/>
+        <w:spacing w:before="0" w:after="25" w:line="230" w:lineRule="auto"/>
+      </w:pPr>
+      <w:r>
+        <w:rPr>
+          <w:sz w:val="18"/>
+          <w:szCs w:val="18"/>
+        </w:rPr>
+        <w:t xml:space="preserve">•   </w:t>
+      </w:r>
+      <w:r>
+        <w:rPr>
+          <w:sz w:val="18"/>
+          <w:szCs w:val="18"/>
+        </w:rPr>
+        <w:t xml:space="preserve">Zustand: create() a store hook, components subscribe with selectors - tiny API, no providers, much less ceremony; my default for small/medium apps.</w:t>
+      </w:r>
+    </w:p>
+    <w:p>
+      <w:pPr>
+        <w:ind w:left="260" w:hanging="200"/>
+        <w:spacing w:before="0" w:after="25" w:line="230" w:lineRule="auto"/>
+      </w:pPr>
+      <w:r>
+        <w:rPr>
+          <w:sz w:val="18"/>
+          <w:szCs w:val="18"/>
+        </w:rPr>
+        <w:t xml:space="preserve">•   </w:t>
+      </w:r>
+      <w:r>
+        <w:rPr>
+          <w:sz w:val="18"/>
+          <w:szCs w:val="18"/>
+        </w:rPr>
+        <w:t xml:space="preserve">Redux Toolkit still wins for big teams: enforced structure, devtools, RTK Query included.</w:t>
+      </w:r>
+    </w:p>
+    <w:p>
+      <w:pPr>
+        <w:ind w:left="260" w:hanging="200"/>
+        <w:spacing w:before="0" w:after="25" w:line="230" w:lineRule="auto"/>
+      </w:pPr>
+      <w:r>
+        <w:rPr>
+          <w:sz w:val="18"/>
+          <w:szCs w:val="18"/>
+        </w:rPr>
+        <w:t xml:space="preserve">•   </w:t>
+      </w:r>
+      <w:r>
+        <w:rPr>
+          <w:sz w:val="18"/>
+          <w:szCs w:val="18"/>
+        </w:rPr>
+        <w:t xml:space="preserve">Interview shape: 'do you always need Redux?' - No: most 'global state' is server cache misfiled; React Query + a small store covers most apps.</w:t>
+      </w:r>
+    </w:p>
+    <w:p>
+      <w:pPr>
+        <w:ind w:left="260" w:hanging="0"/>
+        <w:spacing w:before="0" w:after="15" w:line="230" w:lineRule="auto"/>
+        <w:shd w:val="clear" w:color="auto" w:fill="F2F2F2"/>
+      </w:pPr>
+      <w:r>
+        <w:rPr>
+          <w:b/>
+          <w:sz w:val="17"/>
+          <w:szCs w:val="17"/>
+        </w:rPr>
+        <w:t xml:space="preserve">Example:  </w:t>
+      </w:r>
+      <w:r>
+        <w:rPr>
+          <w:rFonts w:ascii="Consolas" w:hAnsi="Consolas" w:cs="Consolas"/>
+          <w:color w:val="3B3B3B"/>
+          <w:sz w:val="17"/>
+          <w:szCs w:val="17"/>
+        </w:rPr>
+        <w:t xml:space="preserve">const useCart = create(set =&gt; ({</w:t>
+      </w:r>
+    </w:p>
+    <w:p>
+      <w:pPr>
+        <w:ind w:left="260" w:hanging="0"/>
+        <w:spacing w:before="0" w:after="15" w:line="230" w:lineRule="auto"/>
+        <w:shd w:val="clear" w:color="auto" w:fill="F2F2F2"/>
+      </w:pPr>
+      <w:r>
+        <w:rPr>
+          <w:rFonts w:ascii="Consolas" w:hAnsi="Consolas" w:cs="Consolas"/>
+          <w:color w:val="3B3B3B"/>
+          <w:sz w:val="17"/>
+          <w:szCs w:val="17"/>
+        </w:rPr>
+        <w:t xml:space="preserve">  items: [],</w:t>
+      </w:r>
+    </w:p>
+    <w:p>
+      <w:pPr>
+        <w:ind w:left="260" w:hanging="0"/>
+        <w:spacing w:before="0" w:after="15" w:line="230" w:lineRule="auto"/>
+        <w:shd w:val="clear" w:color="auto" w:fill="F2F2F2"/>
+      </w:pPr>
+      <w:r>
+        <w:rPr>
+          <w:rFonts w:ascii="Consolas" w:hAnsi="Consolas" w:cs="Consolas"/>
+          <w:color w:val="3B3B3B"/>
+          <w:sz w:val="17"/>
+          <w:szCs w:val="17"/>
+        </w:rPr>
+        <w:t xml:space="preserve">  add: item =&gt; set(s =&gt;</w:t>
+      </w:r>
+    </w:p>
+    <w:p>
+      <w:pPr>
+        <w:ind w:left="260" w:hanging="0"/>
+        <w:spacing w:before="0" w:after="15" w:line="230" w:lineRule="auto"/>
+        <w:shd w:val="clear" w:color="auto" w:fill="F2F2F2"/>
+      </w:pPr>
+      <w:r>
+        <w:rPr>
+          <w:rFonts w:ascii="Consolas" w:hAnsi="Consolas" w:cs="Consolas"/>
+          <w:color w:val="3B3B3B"/>
+          <w:sz w:val="17"/>
+          <w:szCs w:val="17"/>
+        </w:rPr>
+        <w:t xml:space="preserve">    ({ items: [...s.items, item] })),</w:t>
+      </w:r>
+    </w:p>
+    <w:p>
+      <w:pPr>
+        <w:ind w:left="260" w:hanging="0"/>
+        <w:spacing w:before="0" w:after="15" w:line="230" w:lineRule="auto"/>
+        <w:shd w:val="clear" w:color="auto" w:fill="F2F2F2"/>
+      </w:pPr>
+      <w:r>
+        <w:rPr>
+          <w:rFonts w:ascii="Consolas" w:hAnsi="Consolas" w:cs="Consolas"/>
+          <w:color w:val="3B3B3B"/>
+          <w:sz w:val="17"/>
+          <w:szCs w:val="17"/>
+        </w:rPr>
+        <w:t xml:space="preserve">}));</w:t>
+      </w:r>
+    </w:p>
+    <w:p>
+      <w:pPr>
+        <w:ind w:left="260" w:hanging="0"/>
+        <w:spacing w:before="0" w:after="15" w:line="230" w:lineRule="auto"/>
+        <w:shd w:val="clear" w:color="auto" w:fill="F2F2F2"/>
+      </w:pPr>
+      <w:r>
+        <w:rPr>
+          <w:rFonts w:ascii="Consolas" w:hAnsi="Consolas" w:cs="Consolas"/>
+          <w:color w:val="3B3B3B"/>
+          <w:sz w:val="17"/>
+          <w:szCs w:val="17"/>
+        </w:rPr>
+        <w:t xml:space="preserve">// const items = useCart(s =&gt; s.items);</w:t>
+      </w:r>
+    </w:p>
+    <w:p>
+      <w:pPr>
+        <w:ind w:left="120" w:hanging="0"/>
+        <w:spacing w:before="50" w:after="110" w:line="230" w:lineRule="auto"/>
+        <w:pBdr>
+          <w:left w:val="single" w:sz="12" w:space="4" w:color="2E5E1F"/>
+        </w:pBdr>
+      </w:pPr>
+      <w:r>
+        <w:rPr>
+          <w:b/>
+          <w:color w:val="2E5E1F"/>
+          <w:sz w:val="18"/>
+          <w:szCs w:val="18"/>
+        </w:rPr>
+        <w:t xml:space="preserve">Interview answer:  </w:t>
+      </w:r>
+      <w:r>
+        <w:rPr>
+          <w:i/>
+          <w:sz w:val="18"/>
+          <w:szCs w:val="18"/>
+        </w:rPr>
+        <w:t xml:space="preserve">I first classify state: server data goes to React Query, local UI stays in useState, and only genuine cross-page client state - session, cart, filters - earns a store. Zustand is my default for its selector-based subscriptions with no ceremony; Redux Toolkit fits bigger teams wanting enforced structure and devtools. Selectors keep re-renders scoped, unlike context.</w:t>
+      </w:r>
+    </w:p>
+    <w:p>
+      <w:pPr>
+        <w:spacing w:before="140" w:after="40" w:line="230" w:lineRule="auto"/>
+      </w:pPr>
+      <w:r>
+        <w:rPr>
+          <w:b/>
+          <w:sz w:val="21"/>
+          <w:szCs w:val="21"/>
+        </w:rPr>
+        <w:t xml:space="preserve">R2.7  Lifting State Up and Composition</w:t>
+      </w:r>
+    </w:p>
+    <w:p>
+      <w:pPr>
+        <w:spacing w:before="0" w:after="40" w:line="230" w:lineRule="auto"/>
+      </w:pPr>
+      <w:r>
+        <w:rPr>
+          <w:b/>
+          <w:sz w:val="18"/>
+          <w:szCs w:val="18"/>
+        </w:rPr>
+        <w:t xml:space="preserve">What it is:  </w:t>
+      </w:r>
+      <w:r>
+        <w:rPr>
+          <w:sz w:val="18"/>
+          <w:szCs w:val="18"/>
+        </w:rPr>
+        <w:t xml:space="preserve">Shared state moves up to the closest common parent; composition (children and slots) keeps components flexible without prop drilling.</w:t>
+      </w:r>
+    </w:p>
+    <w:p>
+      <w:pPr>
+        <w:ind w:left="260" w:hanging="200"/>
+        <w:spacing w:before="0" w:after="25" w:line="230" w:lineRule="auto"/>
+      </w:pPr>
+      <w:r>
+        <w:rPr>
+          <w:sz w:val="18"/>
+          <w:szCs w:val="18"/>
+        </w:rPr>
+        <w:t xml:space="preserve">•   </w:t>
+      </w:r>
+      <w:r>
+        <w:rPr>
+          <w:sz w:val="18"/>
+          <w:szCs w:val="18"/>
+        </w:rPr>
+        <w:t xml:space="preserve">Two siblings needing the same data -&gt; the state lives in their common parent, passed down as props with callbacks up. The fundamental React data-sharing move.</w:t>
+      </w:r>
+    </w:p>
+    <w:p>
+      <w:pPr>
+        <w:ind w:left="260" w:hanging="200"/>
+        <w:spacing w:before="0" w:after="25" w:line="230" w:lineRule="auto"/>
+      </w:pPr>
+      <w:r>
+        <w:rPr>
+          <w:sz w:val="18"/>
+          <w:szCs w:val="18"/>
+        </w:rPr>
+        <w:t xml:space="preserve">•   </w:t>
+      </w:r>
+      <w:r>
+        <w:rPr>
+          <w:sz w:val="18"/>
+          <w:szCs w:val="18"/>
+        </w:rPr>
+        <w:t xml:space="preserve">Single source of truth: never copy the same fact into two states - derive or lift instead.</w:t>
+      </w:r>
+    </w:p>
+    <w:p>
+      <w:pPr>
+        <w:ind w:left="260" w:hanging="200"/>
+        <w:spacing w:before="0" w:after="25" w:line="230" w:lineRule="auto"/>
+      </w:pPr>
+      <w:r>
+        <w:rPr>
+          <w:sz w:val="18"/>
+          <w:szCs w:val="18"/>
+        </w:rPr>
+        <w:t xml:space="preserve">•   </w:t>
+      </w:r>
+      <w:r>
+        <w:rPr>
+          <w:sz w:val="18"/>
+          <w:szCs w:val="18"/>
+        </w:rPr>
+        <w:t xml:space="preserve">Anti-pattern: mirroring props into state (useState(props.x)) - it desyncs; render from props, or derive with useMemo.</w:t>
+      </w:r>
+    </w:p>
+    <w:p>
+      <w:pPr>
+        <w:ind w:left="260" w:hanging="200"/>
+        <w:spacing w:before="0" w:after="25" w:line="230" w:lineRule="auto"/>
+      </w:pPr>
+      <w:r>
+        <w:rPr>
+          <w:sz w:val="18"/>
+          <w:szCs w:val="18"/>
+        </w:rPr>
+        <w:t xml:space="preserve">•   </w:t>
+      </w:r>
+      <w:r>
+        <w:rPr>
+          <w:sz w:val="18"/>
+          <w:szCs w:val="18"/>
+        </w:rPr>
+        <w:t xml:space="preserve">Derived state is computed, not stored: filtered lists, totals - compute in render from the source state.</w:t>
+      </w:r>
+    </w:p>
+    <w:p>
+      <w:pPr>
+        <w:ind w:left="260" w:hanging="200"/>
+        <w:spacing w:before="0" w:after="25" w:line="230" w:lineRule="auto"/>
+      </w:pPr>
+      <w:r>
+        <w:rPr>
+          <w:sz w:val="18"/>
+          <w:szCs w:val="18"/>
+        </w:rPr>
+        <w:t xml:space="preserve">•   </w:t>
+      </w:r>
+      <w:r>
+        <w:rPr>
+          <w:sz w:val="18"/>
+          <w:szCs w:val="18"/>
+        </w:rPr>
+        <w:t xml:space="preserve">Composition over configuration: pass children/JSX slots instead of a dozen boolean props - &lt;Card header={&lt;h2/&gt;}&gt;...&lt;/Card&gt; scales; &lt;Card showX showY.../&gt; does not.</w:t>
+      </w:r>
+    </w:p>
+    <w:p>
+      <w:pPr>
+        <w:ind w:left="260" w:hanging="200"/>
+        <w:spacing w:before="0" w:after="25" w:line="230" w:lineRule="auto"/>
+      </w:pPr>
+      <w:r>
+        <w:rPr>
+          <w:sz w:val="18"/>
+          <w:szCs w:val="18"/>
+        </w:rPr>
+        <w:t xml:space="preserve">•   </w:t>
+      </w:r>
+      <w:r>
+        <w:rPr>
+          <w:sz w:val="18"/>
+          <w:szCs w:val="18"/>
+        </w:rPr>
+        <w:t xml:space="preserve">Component-as-prop and children-as-slot patterns replace most inheritance thinking - React has no component inheritance.</w:t>
+      </w:r>
+    </w:p>
+    <w:p>
+      <w:pPr>
+        <w:ind w:left="260" w:hanging="200"/>
+        <w:spacing w:before="0" w:after="25" w:line="230" w:lineRule="auto"/>
+      </w:pPr>
+      <w:r>
+        <w:rPr>
+          <w:sz w:val="18"/>
+          <w:szCs w:val="18"/>
+        </w:rPr>
+        <w:t xml:space="preserve">•   </w:t>
+      </w:r>
+      <w:r>
+        <w:rPr>
+          <w:sz w:val="18"/>
+          <w:szCs w:val="18"/>
+        </w:rPr>
+        <w:t xml:space="preserve">Lifting too far up causes wide re-renders - keep state as close to usage as possible; push it down when only one subtree cares.</w:t>
+      </w:r>
+    </w:p>
+    <w:p>
+      <w:pPr>
+        <w:ind w:left="260" w:hanging="0"/>
+        <w:spacing w:before="0" w:after="15" w:line="230" w:lineRule="auto"/>
+        <w:shd w:val="clear" w:color="auto" w:fill="F2F2F2"/>
+      </w:pPr>
+      <w:r>
+        <w:rPr>
+          <w:b/>
+          <w:sz w:val="17"/>
+          <w:szCs w:val="17"/>
+        </w:rPr>
+        <w:t xml:space="preserve">Example:  </w:t>
+      </w:r>
+      <w:r>
+        <w:rPr>
+          <w:rFonts w:ascii="Consolas" w:hAnsi="Consolas" w:cs="Consolas"/>
+          <w:color w:val="3B3B3B"/>
+          <w:sz w:val="17"/>
+          <w:szCs w:val="17"/>
+        </w:rPr>
+        <w:t xml:space="preserve">function Page() {</w:t>
+      </w:r>
+    </w:p>
+    <w:p>
+      <w:pPr>
+        <w:ind w:left="260" w:hanging="0"/>
+        <w:spacing w:before="0" w:after="15" w:line="230" w:lineRule="auto"/>
+        <w:shd w:val="clear" w:color="auto" w:fill="F2F2F2"/>
+      </w:pPr>
+      <w:r>
+        <w:rPr>
+          <w:rFonts w:ascii="Consolas" w:hAnsi="Consolas" w:cs="Consolas"/>
+          <w:color w:val="3B3B3B"/>
+          <w:sz w:val="17"/>
+          <w:szCs w:val="17"/>
+        </w:rPr>
+        <w:t xml:space="preserve">  const [filter, setFilter] = useState("");</w:t>
+      </w:r>
+    </w:p>
+    <w:p>
+      <w:pPr>
+        <w:ind w:left="260" w:hanging="0"/>
+        <w:spacing w:before="0" w:after="15" w:line="230" w:lineRule="auto"/>
+        <w:shd w:val="clear" w:color="auto" w:fill="F2F2F2"/>
+      </w:pPr>
+      <w:r>
+        <w:rPr>
+          <w:rFonts w:ascii="Consolas" w:hAnsi="Consolas" w:cs="Consolas"/>
+          <w:color w:val="3B3B3B"/>
+          <w:sz w:val="17"/>
+          <w:szCs w:val="17"/>
+        </w:rPr>
+        <w:t xml:space="preserve">  return (&lt;&gt;</w:t>
+      </w:r>
+    </w:p>
+    <w:p>
+      <w:pPr>
+        <w:ind w:left="260" w:hanging="0"/>
+        <w:spacing w:before="0" w:after="15" w:line="230" w:lineRule="auto"/>
+        <w:shd w:val="clear" w:color="auto" w:fill="F2F2F2"/>
+      </w:pPr>
+      <w:r>
+        <w:rPr>
+          <w:rFonts w:ascii="Consolas" w:hAnsi="Consolas" w:cs="Consolas"/>
+          <w:color w:val="3B3B3B"/>
+          <w:sz w:val="17"/>
+          <w:szCs w:val="17"/>
+        </w:rPr>
+        <w:t xml:space="preserve">    &lt;SearchBox value={filter}</w:t>
+      </w:r>
+    </w:p>
+    <w:p>
+      <w:pPr>
+        <w:ind w:left="260" w:hanging="0"/>
+        <w:spacing w:before="0" w:after="15" w:line="230" w:lineRule="auto"/>
+        <w:shd w:val="clear" w:color="auto" w:fill="F2F2F2"/>
+      </w:pPr>
+      <w:r>
+        <w:rPr>
+          <w:rFonts w:ascii="Consolas" w:hAnsi="Consolas" w:cs="Consolas"/>
+          <w:color w:val="3B3B3B"/>
+          <w:sz w:val="17"/>
+          <w:szCs w:val="17"/>
+        </w:rPr>
+        <w:t xml:space="preserve">               onChange={setFilter} /&gt;</w:t>
+      </w:r>
+    </w:p>
+    <w:p>
+      <w:pPr>
+        <w:ind w:left="260" w:hanging="0"/>
+        <w:spacing w:before="0" w:after="15" w:line="230" w:lineRule="auto"/>
+        <w:shd w:val="clear" w:color="auto" w:fill="F2F2F2"/>
+      </w:pPr>
+      <w:r>
+        <w:rPr>
+          <w:rFonts w:ascii="Consolas" w:hAnsi="Consolas" w:cs="Consolas"/>
+          <w:color w:val="3B3B3B"/>
+          <w:sz w:val="17"/>
+          <w:szCs w:val="17"/>
+        </w:rPr>
+        <w:t xml:space="preserve">    &lt;OrderList filter={filter} /&gt;</w:t>
+      </w:r>
+    </w:p>
+    <w:p>
+      <w:pPr>
+        <w:ind w:left="260" w:hanging="0"/>
+        <w:spacing w:before="0" w:after="15" w:line="230" w:lineRule="auto"/>
+        <w:shd w:val="clear" w:color="auto" w:fill="F2F2F2"/>
+      </w:pPr>
+      <w:r>
+        <w:rPr>
+          <w:rFonts w:ascii="Consolas" w:hAnsi="Consolas" w:cs="Consolas"/>
+          <w:color w:val="3B3B3B"/>
+          <w:sz w:val="17"/>
+          <w:szCs w:val="17"/>
+        </w:rPr>
+        <w:t xml:space="preserve">  &lt;/&gt;);</w:t>
+      </w:r>
+    </w:p>
+    <w:p>
+      <w:pPr>
+        <w:ind w:left="260" w:hanging="0"/>
+        <w:spacing w:before="0" w:after="15" w:line="230" w:lineRule="auto"/>
+        <w:shd w:val="clear" w:color="auto" w:fill="F2F2F2"/>
+      </w:pPr>
+      <w:r>
+        <w:rPr>
+          <w:rFonts w:ascii="Consolas" w:hAnsi="Consolas" w:cs="Consolas"/>
+          <w:color w:val="3B3B3B"/>
+          <w:sz w:val="17"/>
+          <w:szCs w:val="17"/>
+        </w:rPr>
+        <w:t xml:space="preserve">}  // state at the common parent</w:t>
+      </w:r>
+    </w:p>
+    <w:p>
+      <w:pPr>
+        <w:ind w:left="120" w:hanging="0"/>
+        <w:spacing w:before="50" w:after="110" w:line="230" w:lineRule="auto"/>
+        <w:pBdr>
+          <w:left w:val="single" w:sz="12" w:space="4" w:color="2E5E1F"/>
+        </w:pBdr>
+      </w:pPr>
+      <w:r>
+        <w:rPr>
+          <w:b/>
+          <w:color w:val="2E5E1F"/>
+          <w:sz w:val="18"/>
+          <w:szCs w:val="18"/>
+        </w:rPr>
+        <w:t xml:space="preserve">Interview answer:  </w:t>
+      </w:r>
+      <w:r>
+        <w:rPr>
+          <w:i/>
+          <w:sz w:val="18"/>
+          <w:szCs w:val="18"/>
+        </w:rPr>
+        <w:t xml:space="preserve">When siblings share data, the state lifts to their closest common parent - one source of truth, props down, callbacks up. Derived data is computed, never duplicated into state, and mirroring props into state is the classic desync bug. For flexibility I compose with children and JSX slots instead of boolean-prop explosions, and I keep state as low in the tree as usage allows.</w:t>
       </w:r>
     </w:p>
     <w:sectPr>

</xml_diff>

<commit_message>
React Phase 3: Ecosystem & Production (7 topics) - React complete, 21/21
Router, React Query, performance checklist, code splitting/Suspense,
error boundaries, React 18 concurrent, React Native/Expo

Co-Authored-By: Claude Fable 5 <noreply@anthropic.com>
Claude-Session: https://claude.ai/code/session_01Vm8nqoCZNTvUn3BNmW1Tgz
</commit_message>
<xml_diff>
--- a/React_Interview_Theory.docx
+++ b/React_Interview_Theory.docx
@@ -4739,6 +4739,2405 @@
           <w:szCs w:val="18"/>
         </w:rPr>
         <w:t xml:space="preserve">When siblings share data, the state lifts to their closest common parent - one source of truth, props down, callbacks up. Derived data is computed, never duplicated into state, and mirroring props into state is the classic desync bug. For flexibility I compose with children and JSX slots instead of boolean-prop explosions, and I keep state as low in the tree as usage allows.</w:t>
+      </w:r>
+    </w:p>
+    <w:p>
+      <w:pPr>
+        <w:spacing w:before="200" w:after="60" w:line="230" w:lineRule="auto"/>
+      </w:pPr>
+      <w:r>
+        <w:rPr>
+          <w:b/>
+          <w:color w:val="1F4E79"/>
+          <w:sz w:val="26"/>
+          <w:szCs w:val="26"/>
+        </w:rPr>
+        <w:t xml:space="preserve">React Phase 3 - Ecosystem and Production</w:t>
+      </w:r>
+    </w:p>
+    <w:p>
+      <w:pPr>
+        <w:spacing w:before="140" w:after="40" w:line="230" w:lineRule="auto"/>
+      </w:pPr>
+      <w:r>
+        <w:rPr>
+          <w:b/>
+          <w:sz w:val="21"/>
+          <w:szCs w:val="21"/>
+        </w:rPr>
+        <w:t xml:space="preserve">R3.1  React Router</w:t>
+      </w:r>
+    </w:p>
+    <w:p>
+      <w:pPr>
+        <w:spacing w:before="0" w:after="40" w:line="230" w:lineRule="auto"/>
+      </w:pPr>
+      <w:r>
+        <w:rPr>
+          <w:b/>
+          <w:sz w:val="18"/>
+          <w:szCs w:val="18"/>
+        </w:rPr>
+        <w:t xml:space="preserve">What it is:  </w:t>
+      </w:r>
+      <w:r>
+        <w:rPr>
+          <w:sz w:val="18"/>
+          <w:szCs w:val="18"/>
+        </w:rPr>
+        <w:t xml:space="preserve">React Router maps URLs to components client-side - navigation without page reloads in an SPA.</w:t>
+      </w:r>
+    </w:p>
+    <w:p>
+      <w:pPr>
+        <w:ind w:left="260" w:hanging="200"/>
+        <w:spacing w:before="0" w:after="25" w:line="230" w:lineRule="auto"/>
+      </w:pPr>
+      <w:r>
+        <w:rPr>
+          <w:sz w:val="18"/>
+          <w:szCs w:val="18"/>
+        </w:rPr>
+        <w:t xml:space="preserve">•   </w:t>
+      </w:r>
+      <w:r>
+        <w:rPr>
+          <w:sz w:val="18"/>
+          <w:szCs w:val="18"/>
+        </w:rPr>
+        <w:t xml:space="preserve">Setup: &lt;BrowserRouter&gt; wraps the app; &lt;Routes&gt; holds &lt;Route path="/orders/:id" element={&lt;Order/&gt;} /&gt;.</w:t>
+      </w:r>
+    </w:p>
+    <w:p>
+      <w:pPr>
+        <w:ind w:left="260" w:hanging="200"/>
+        <w:spacing w:before="0" w:after="25" w:line="230" w:lineRule="auto"/>
+      </w:pPr>
+      <w:r>
+        <w:rPr>
+          <w:sz w:val="18"/>
+          <w:szCs w:val="18"/>
+        </w:rPr>
+        <w:t xml:space="preserve">•   </w:t>
+      </w:r>
+      <w:r>
+        <w:rPr>
+          <w:sz w:val="18"/>
+          <w:szCs w:val="18"/>
+        </w:rPr>
+        <w:t xml:space="preserve">Dynamic segments via useParams() (the :id); query strings via useSearchParams().</w:t>
+      </w:r>
+    </w:p>
+    <w:p>
+      <w:pPr>
+        <w:ind w:left="260" w:hanging="200"/>
+        <w:spacing w:before="0" w:after="25" w:line="230" w:lineRule="auto"/>
+      </w:pPr>
+      <w:r>
+        <w:rPr>
+          <w:sz w:val="18"/>
+          <w:szCs w:val="18"/>
+        </w:rPr>
+        <w:t xml:space="preserve">•   </w:t>
+      </w:r>
+      <w:r>
+        <w:rPr>
+          <w:sz w:val="18"/>
+          <w:szCs w:val="18"/>
+        </w:rPr>
+        <w:t xml:space="preserve">&lt;Link to&gt;/&lt;NavLink&gt; navigate without reload (NavLink knows when it is active); useNavigate() for programmatic redirects after actions.</w:t>
+      </w:r>
+    </w:p>
+    <w:p>
+      <w:pPr>
+        <w:ind w:left="260" w:hanging="200"/>
+        <w:spacing w:before="0" w:after="25" w:line="230" w:lineRule="auto"/>
+      </w:pPr>
+      <w:r>
+        <w:rPr>
+          <w:sz w:val="18"/>
+          <w:szCs w:val="18"/>
+        </w:rPr>
+        <w:t xml:space="preserve">•   </w:t>
+      </w:r>
+      <w:r>
+        <w:rPr>
+          <w:sz w:val="18"/>
+          <w:szCs w:val="18"/>
+        </w:rPr>
+        <w:t xml:space="preserve">Nested routes + &lt;Outlet/&gt;: a Layout route renders shared chrome, children fill the outlet - dashboards in one pattern.</w:t>
+      </w:r>
+    </w:p>
+    <w:p>
+      <w:pPr>
+        <w:ind w:left="260" w:hanging="200"/>
+        <w:spacing w:before="0" w:after="25" w:line="230" w:lineRule="auto"/>
+      </w:pPr>
+      <w:r>
+        <w:rPr>
+          <w:sz w:val="18"/>
+          <w:szCs w:val="18"/>
+        </w:rPr>
+        <w:t xml:space="preserve">•   </w:t>
+      </w:r>
+      <w:r>
+        <w:rPr>
+          <w:sz w:val="18"/>
+          <w:szCs w:val="18"/>
+        </w:rPr>
+        <w:t xml:space="preserve">Protected routes: a wrapper checks auth and either renders children or &lt;Navigate to="/login" state={{from}}/&gt; - back-to-intended-page after login.</w:t>
+      </w:r>
+    </w:p>
+    <w:p>
+      <w:pPr>
+        <w:ind w:left="260" w:hanging="200"/>
+        <w:spacing w:before="0" w:after="25" w:line="230" w:lineRule="auto"/>
+      </w:pPr>
+      <w:r>
+        <w:rPr>
+          <w:sz w:val="18"/>
+          <w:szCs w:val="18"/>
+        </w:rPr>
+        <w:t xml:space="preserve">•   </w:t>
+      </w:r>
+      <w:r>
+        <w:rPr>
+          <w:sz w:val="18"/>
+          <w:szCs w:val="18"/>
+        </w:rPr>
+        <w:t xml:space="preserve">404 via path="*"; lazy route elements pair with code splitting per page.</w:t>
+      </w:r>
+    </w:p>
+    <w:p>
+      <w:pPr>
+        <w:ind w:left="260" w:hanging="200"/>
+        <w:spacing w:before="0" w:after="25" w:line="230" w:lineRule="auto"/>
+      </w:pPr>
+      <w:r>
+        <w:rPr>
+          <w:sz w:val="18"/>
+          <w:szCs w:val="18"/>
+        </w:rPr>
+        <w:t xml:space="preserve">•   </w:t>
+      </w:r>
+      <w:r>
+        <w:rPr>
+          <w:sz w:val="18"/>
+          <w:szCs w:val="18"/>
+        </w:rPr>
+        <w:t xml:space="preserve">SPA server note: the server must serve index.html for all paths, else deep-link refreshes 404 - an ops detail worth saying.</w:t>
+      </w:r>
+    </w:p>
+    <w:p>
+      <w:pPr>
+        <w:ind w:left="260" w:hanging="0"/>
+        <w:spacing w:before="0" w:after="15" w:line="230" w:lineRule="auto"/>
+        <w:shd w:val="clear" w:color="auto" w:fill="F2F2F2"/>
+      </w:pPr>
+      <w:r>
+        <w:rPr>
+          <w:b/>
+          <w:sz w:val="17"/>
+          <w:szCs w:val="17"/>
+        </w:rPr>
+        <w:t xml:space="preserve">Example:  </w:t>
+      </w:r>
+      <w:r>
+        <w:rPr>
+          <w:rFonts w:ascii="Consolas" w:hAnsi="Consolas" w:cs="Consolas"/>
+          <w:color w:val="3B3B3B"/>
+          <w:sz w:val="17"/>
+          <w:szCs w:val="17"/>
+        </w:rPr>
+        <w:t xml:space="preserve">&lt;Routes&gt;</w:t>
+      </w:r>
+    </w:p>
+    <w:p>
+      <w:pPr>
+        <w:ind w:left="260" w:hanging="0"/>
+        <w:spacing w:before="0" w:after="15" w:line="230" w:lineRule="auto"/>
+        <w:shd w:val="clear" w:color="auto" w:fill="F2F2F2"/>
+      </w:pPr>
+      <w:r>
+        <w:rPr>
+          <w:rFonts w:ascii="Consolas" w:hAnsi="Consolas" w:cs="Consolas"/>
+          <w:color w:val="3B3B3B"/>
+          <w:sz w:val="17"/>
+          <w:szCs w:val="17"/>
+        </w:rPr>
+        <w:t xml:space="preserve">  &lt;Route element={&lt;Layout /&gt;}&gt;</w:t>
+      </w:r>
+    </w:p>
+    <w:p>
+      <w:pPr>
+        <w:ind w:left="260" w:hanging="0"/>
+        <w:spacing w:before="0" w:after="15" w:line="230" w:lineRule="auto"/>
+        <w:shd w:val="clear" w:color="auto" w:fill="F2F2F2"/>
+      </w:pPr>
+      <w:r>
+        <w:rPr>
+          <w:rFonts w:ascii="Consolas" w:hAnsi="Consolas" w:cs="Consolas"/>
+          <w:color w:val="3B3B3B"/>
+          <w:sz w:val="17"/>
+          <w:szCs w:val="17"/>
+        </w:rPr>
+        <w:t xml:space="preserve">    &lt;Route index element={&lt;Home /&gt;} /&gt;</w:t>
+      </w:r>
+    </w:p>
+    <w:p>
+      <w:pPr>
+        <w:ind w:left="260" w:hanging="0"/>
+        <w:spacing w:before="0" w:after="15" w:line="230" w:lineRule="auto"/>
+        <w:shd w:val="clear" w:color="auto" w:fill="F2F2F2"/>
+      </w:pPr>
+      <w:r>
+        <w:rPr>
+          <w:rFonts w:ascii="Consolas" w:hAnsi="Consolas" w:cs="Consolas"/>
+          <w:color w:val="3B3B3B"/>
+          <w:sz w:val="17"/>
+          <w:szCs w:val="17"/>
+        </w:rPr>
+        <w:t xml:space="preserve">    &lt;Route path="orders/:id" element={</w:t>
+      </w:r>
+    </w:p>
+    <w:p>
+      <w:pPr>
+        <w:ind w:left="260" w:hanging="0"/>
+        <w:spacing w:before="0" w:after="15" w:line="230" w:lineRule="auto"/>
+        <w:shd w:val="clear" w:color="auto" w:fill="F2F2F2"/>
+      </w:pPr>
+      <w:r>
+        <w:rPr>
+          <w:rFonts w:ascii="Consolas" w:hAnsi="Consolas" w:cs="Consolas"/>
+          <w:color w:val="3B3B3B"/>
+          <w:sz w:val="17"/>
+          <w:szCs w:val="17"/>
+        </w:rPr>
+        <w:t xml:space="preserve">      &lt;RequireAuth&gt;&lt;Order /&gt;&lt;/RequireAuth&gt;} /&gt;</w:t>
+      </w:r>
+    </w:p>
+    <w:p>
+      <w:pPr>
+        <w:ind w:left="260" w:hanging="0"/>
+        <w:spacing w:before="0" w:after="15" w:line="230" w:lineRule="auto"/>
+        <w:shd w:val="clear" w:color="auto" w:fill="F2F2F2"/>
+      </w:pPr>
+      <w:r>
+        <w:rPr>
+          <w:rFonts w:ascii="Consolas" w:hAnsi="Consolas" w:cs="Consolas"/>
+          <w:color w:val="3B3B3B"/>
+          <w:sz w:val="17"/>
+          <w:szCs w:val="17"/>
+        </w:rPr>
+        <w:t xml:space="preserve">    &lt;Route path="*" element={&lt;NotFound /&gt;} /&gt;</w:t>
+      </w:r>
+    </w:p>
+    <w:p>
+      <w:pPr>
+        <w:ind w:left="260" w:hanging="0"/>
+        <w:spacing w:before="0" w:after="15" w:line="230" w:lineRule="auto"/>
+        <w:shd w:val="clear" w:color="auto" w:fill="F2F2F2"/>
+      </w:pPr>
+      <w:r>
+        <w:rPr>
+          <w:rFonts w:ascii="Consolas" w:hAnsi="Consolas" w:cs="Consolas"/>
+          <w:color w:val="3B3B3B"/>
+          <w:sz w:val="17"/>
+          <w:szCs w:val="17"/>
+        </w:rPr>
+        <w:t xml:space="preserve">  &lt;/Route&gt;</w:t>
+      </w:r>
+    </w:p>
+    <w:p>
+      <w:pPr>
+        <w:ind w:left="260" w:hanging="0"/>
+        <w:spacing w:before="0" w:after="15" w:line="230" w:lineRule="auto"/>
+        <w:shd w:val="clear" w:color="auto" w:fill="F2F2F2"/>
+      </w:pPr>
+      <w:r>
+        <w:rPr>
+          <w:rFonts w:ascii="Consolas" w:hAnsi="Consolas" w:cs="Consolas"/>
+          <w:color w:val="3B3B3B"/>
+          <w:sz w:val="17"/>
+          <w:szCs w:val="17"/>
+        </w:rPr>
+        <w:t xml:space="preserve">&lt;/Routes&gt;</w:t>
+      </w:r>
+    </w:p>
+    <w:p>
+      <w:pPr>
+        <w:ind w:left="260" w:hanging="0"/>
+        <w:spacing w:before="0" w:after="15" w:line="230" w:lineRule="auto"/>
+        <w:shd w:val="clear" w:color="auto" w:fill="F2F2F2"/>
+      </w:pPr>
+      <w:r>
+        <w:rPr>
+          <w:rFonts w:ascii="Consolas" w:hAnsi="Consolas" w:cs="Consolas"/>
+          <w:color w:val="3B3B3B"/>
+          <w:sz w:val="17"/>
+          <w:szCs w:val="17"/>
+        </w:rPr>
+        <w:t xml:space="preserve">// const { id } = useParams();</w:t>
+      </w:r>
+    </w:p>
+    <w:p>
+      <w:pPr>
+        <w:ind w:left="120" w:hanging="0"/>
+        <w:spacing w:before="50" w:after="110" w:line="230" w:lineRule="auto"/>
+        <w:pBdr>
+          <w:left w:val="single" w:sz="12" w:space="4" w:color="2E5E1F"/>
+        </w:pBdr>
+      </w:pPr>
+      <w:r>
+        <w:rPr>
+          <w:b/>
+          <w:color w:val="2E5E1F"/>
+          <w:sz w:val="18"/>
+          <w:szCs w:val="18"/>
+        </w:rPr>
+        <w:t xml:space="preserve">Interview answer:  </w:t>
+      </w:r>
+      <w:r>
+        <w:rPr>
+          <w:i/>
+          <w:sz w:val="18"/>
+          <w:szCs w:val="18"/>
+        </w:rPr>
+        <w:t xml:space="preserve">React Router does client-side routing: Routes map paths to elements, useParams and useSearchParams read the URL, Link/useNavigate move without reloads, and nested routes with Outlet share layouts. Protected routes wrap children with an auth check redirecting to login, and the server must fall back to index.html so deep links survive refresh.</w:t>
+      </w:r>
+    </w:p>
+    <w:p>
+      <w:pPr>
+        <w:spacing w:before="140" w:after="40" w:line="230" w:lineRule="auto"/>
+      </w:pPr>
+      <w:r>
+        <w:rPr>
+          <w:b/>
+          <w:sz w:val="21"/>
+          <w:szCs w:val="21"/>
+        </w:rPr>
+        <w:t xml:space="preserve">R3.2  API Calls and Data Fetching - React Query</w:t>
+      </w:r>
+    </w:p>
+    <w:p>
+      <w:pPr>
+        <w:spacing w:before="0" w:after="40" w:line="230" w:lineRule="auto"/>
+      </w:pPr>
+      <w:r>
+        <w:rPr>
+          <w:b/>
+          <w:sz w:val="18"/>
+          <w:szCs w:val="18"/>
+        </w:rPr>
+        <w:t xml:space="preserve">What it is:  </w:t>
+      </w:r>
+      <w:r>
+        <w:rPr>
+          <w:sz w:val="18"/>
+          <w:szCs w:val="18"/>
+        </w:rPr>
+        <w:t xml:space="preserve">Hand-rolled fetching means managing loading/error/race/cache by hand; React Query treats server data as a cache and handles all of it.</w:t>
+      </w:r>
+    </w:p>
+    <w:p>
+      <w:pPr>
+        <w:ind w:left="260" w:hanging="200"/>
+        <w:spacing w:before="0" w:after="25" w:line="230" w:lineRule="auto"/>
+      </w:pPr>
+      <w:r>
+        <w:rPr>
+          <w:sz w:val="18"/>
+          <w:szCs w:val="18"/>
+        </w:rPr>
+        <w:t xml:space="preserve">•   </w:t>
+      </w:r>
+      <w:r>
+        <w:rPr>
+          <w:sz w:val="18"/>
+          <w:szCs w:val="18"/>
+        </w:rPr>
+        <w:t xml:space="preserve">Manual pattern: useEffect + three states (data/loading/error) + AbortController cleanup - fine once, boilerplate at scale, and no caching: every mount refetches.</w:t>
+      </w:r>
+    </w:p>
+    <w:p>
+      <w:pPr>
+        <w:ind w:left="260" w:hanging="200"/>
+        <w:spacing w:before="0" w:after="25" w:line="230" w:lineRule="auto"/>
+      </w:pPr>
+      <w:r>
+        <w:rPr>
+          <w:sz w:val="18"/>
+          <w:szCs w:val="18"/>
+        </w:rPr>
+        <w:t xml:space="preserve">•   </w:t>
+      </w:r>
+      <w:r>
+        <w:rPr>
+          <w:sz w:val="18"/>
+          <w:szCs w:val="18"/>
+        </w:rPr>
+        <w:t xml:space="preserve">Key insight (interview gold): server data is a CACHE, not state - it can be stale, refetched, shared between components. That mental shift is why React Query exists.</w:t>
+      </w:r>
+    </w:p>
+    <w:p>
+      <w:pPr>
+        <w:ind w:left="260" w:hanging="200"/>
+        <w:spacing w:before="0" w:after="25" w:line="230" w:lineRule="auto"/>
+      </w:pPr>
+      <w:r>
+        <w:rPr>
+          <w:sz w:val="18"/>
+          <w:szCs w:val="18"/>
+        </w:rPr>
+        <w:t xml:space="preserve">•   </w:t>
+      </w:r>
+      <w:r>
+        <w:rPr>
+          <w:sz w:val="18"/>
+          <w:szCs w:val="18"/>
+        </w:rPr>
+        <w:t xml:space="preserve">useQuery({queryKey: ['orders', id], queryFn}) - dedupes identical requests, caches by key, background-refetches stale data, retries failures.</w:t>
+      </w:r>
+    </w:p>
+    <w:p>
+      <w:pPr>
+        <w:ind w:left="260" w:hanging="200"/>
+        <w:spacing w:before="0" w:after="25" w:line="230" w:lineRule="auto"/>
+      </w:pPr>
+      <w:r>
+        <w:rPr>
+          <w:sz w:val="18"/>
+          <w:szCs w:val="18"/>
+        </w:rPr>
+        <w:t xml:space="preserve">•   </w:t>
+      </w:r>
+      <w:r>
+        <w:rPr>
+          <w:sz w:val="18"/>
+          <w:szCs w:val="18"/>
+        </w:rPr>
+        <w:t xml:space="preserve">useMutation for writes + invalidateQueries to refresh affected lists after a POST/PUT - the standard update flow.</w:t>
+      </w:r>
+    </w:p>
+    <w:p>
+      <w:pPr>
+        <w:ind w:left="260" w:hanging="200"/>
+        <w:spacing w:before="0" w:after="25" w:line="230" w:lineRule="auto"/>
+      </w:pPr>
+      <w:r>
+        <w:rPr>
+          <w:sz w:val="18"/>
+          <w:szCs w:val="18"/>
+        </w:rPr>
+        <w:t xml:space="preserve">•   </w:t>
+      </w:r>
+      <w:r>
+        <w:rPr>
+          <w:sz w:val="18"/>
+          <w:szCs w:val="18"/>
+        </w:rPr>
+        <w:t xml:space="preserve">Optimistic updates: mutate UI first, roll back on error - snappy UX with safety.</w:t>
+      </w:r>
+    </w:p>
+    <w:p>
+      <w:pPr>
+        <w:ind w:left="260" w:hanging="200"/>
+        <w:spacing w:before="0" w:after="25" w:line="230" w:lineRule="auto"/>
+      </w:pPr>
+      <w:r>
+        <w:rPr>
+          <w:sz w:val="18"/>
+          <w:szCs w:val="18"/>
+        </w:rPr>
+        <w:t xml:space="preserve">•   </w:t>
+      </w:r>
+      <w:r>
+        <w:rPr>
+          <w:sz w:val="18"/>
+          <w:szCs w:val="18"/>
+        </w:rPr>
+        <w:t xml:space="preserve">staleTime (how long data is fresh) vs gcTime (how long unused cache lives) - the two knobs.</w:t>
+      </w:r>
+    </w:p>
+    <w:p>
+      <w:pPr>
+        <w:ind w:left="260" w:hanging="200"/>
+        <w:spacing w:before="0" w:after="25" w:line="230" w:lineRule="auto"/>
+      </w:pPr>
+      <w:r>
+        <w:rPr>
+          <w:sz w:val="18"/>
+          <w:szCs w:val="18"/>
+        </w:rPr>
+        <w:t xml:space="preserve">•   </w:t>
+      </w:r>
+      <w:r>
+        <w:rPr>
+          <w:sz w:val="18"/>
+          <w:szCs w:val="18"/>
+        </w:rPr>
+        <w:t xml:space="preserve">This replaces most 'global state' needs - API data no longer lives in Redux.</w:t>
+      </w:r>
+    </w:p>
+    <w:p>
+      <w:pPr>
+        <w:ind w:left="260" w:hanging="0"/>
+        <w:spacing w:before="0" w:after="15" w:line="230" w:lineRule="auto"/>
+        <w:shd w:val="clear" w:color="auto" w:fill="F2F2F2"/>
+      </w:pPr>
+      <w:r>
+        <w:rPr>
+          <w:b/>
+          <w:sz w:val="17"/>
+          <w:szCs w:val="17"/>
+        </w:rPr>
+        <w:t xml:space="preserve">Example:  </w:t>
+      </w:r>
+      <w:r>
+        <w:rPr>
+          <w:rFonts w:ascii="Consolas" w:hAnsi="Consolas" w:cs="Consolas"/>
+          <w:color w:val="3B3B3B"/>
+          <w:sz w:val="17"/>
+          <w:szCs w:val="17"/>
+        </w:rPr>
+        <w:t xml:space="preserve">const { data, isPending, error } = useQuery({</w:t>
+      </w:r>
+    </w:p>
+    <w:p>
+      <w:pPr>
+        <w:ind w:left="260" w:hanging="0"/>
+        <w:spacing w:before="0" w:after="15" w:line="230" w:lineRule="auto"/>
+        <w:shd w:val="clear" w:color="auto" w:fill="F2F2F2"/>
+      </w:pPr>
+      <w:r>
+        <w:rPr>
+          <w:rFonts w:ascii="Consolas" w:hAnsi="Consolas" w:cs="Consolas"/>
+          <w:color w:val="3B3B3B"/>
+          <w:sz w:val="17"/>
+          <w:szCs w:val="17"/>
+        </w:rPr>
+        <w:t xml:space="preserve">  queryKey: ["orders", page],</w:t>
+      </w:r>
+    </w:p>
+    <w:p>
+      <w:pPr>
+        <w:ind w:left="260" w:hanging="0"/>
+        <w:spacing w:before="0" w:after="15" w:line="230" w:lineRule="auto"/>
+        <w:shd w:val="clear" w:color="auto" w:fill="F2F2F2"/>
+      </w:pPr>
+      <w:r>
+        <w:rPr>
+          <w:rFonts w:ascii="Consolas" w:hAnsi="Consolas" w:cs="Consolas"/>
+          <w:color w:val="3B3B3B"/>
+          <w:sz w:val="17"/>
+          <w:szCs w:val="17"/>
+        </w:rPr>
+        <w:t xml:space="preserve">  queryFn: () =&gt; api.getOrders(page),</w:t>
+      </w:r>
+    </w:p>
+    <w:p>
+      <w:pPr>
+        <w:ind w:left="260" w:hanging="0"/>
+        <w:spacing w:before="0" w:after="15" w:line="230" w:lineRule="auto"/>
+        <w:shd w:val="clear" w:color="auto" w:fill="F2F2F2"/>
+      </w:pPr>
+      <w:r>
+        <w:rPr>
+          <w:rFonts w:ascii="Consolas" w:hAnsi="Consolas" w:cs="Consolas"/>
+          <w:color w:val="3B3B3B"/>
+          <w:sz w:val="17"/>
+          <w:szCs w:val="17"/>
+        </w:rPr>
+        <w:t xml:space="preserve">  staleTime: 30_000,</w:t>
+      </w:r>
+    </w:p>
+    <w:p>
+      <w:pPr>
+        <w:ind w:left="260" w:hanging="0"/>
+        <w:spacing w:before="0" w:after="15" w:line="230" w:lineRule="auto"/>
+        <w:shd w:val="clear" w:color="auto" w:fill="F2F2F2"/>
+      </w:pPr>
+      <w:r>
+        <w:rPr>
+          <w:rFonts w:ascii="Consolas" w:hAnsi="Consolas" w:cs="Consolas"/>
+          <w:color w:val="3B3B3B"/>
+          <w:sz w:val="17"/>
+          <w:szCs w:val="17"/>
+        </w:rPr>
+        <w:t xml:space="preserve">});</w:t>
+      </w:r>
+    </w:p>
+    <w:p>
+      <w:pPr>
+        <w:ind w:left="260" w:hanging="0"/>
+        <w:spacing w:before="0" w:after="15" w:line="230" w:lineRule="auto"/>
+        <w:shd w:val="clear" w:color="auto" w:fill="F2F2F2"/>
+      </w:pPr>
+      <w:r>
+        <w:rPr>
+          <w:rFonts w:ascii="Consolas" w:hAnsi="Consolas" w:cs="Consolas"/>
+          <w:color w:val="3B3B3B"/>
+          <w:sz w:val="17"/>
+          <w:szCs w:val="17"/>
+        </w:rPr>
+        <w:t xml:space="preserve">const qc = useQueryClient();</w:t>
+      </w:r>
+    </w:p>
+    <w:p>
+      <w:pPr>
+        <w:ind w:left="260" w:hanging="0"/>
+        <w:spacing w:before="0" w:after="15" w:line="230" w:lineRule="auto"/>
+        <w:shd w:val="clear" w:color="auto" w:fill="F2F2F2"/>
+      </w:pPr>
+      <w:r>
+        <w:rPr>
+          <w:rFonts w:ascii="Consolas" w:hAnsi="Consolas" w:cs="Consolas"/>
+          <w:color w:val="3B3B3B"/>
+          <w:sz w:val="17"/>
+          <w:szCs w:val="17"/>
+        </w:rPr>
+        <w:t xml:space="preserve">const cancel = useMutation({</w:t>
+      </w:r>
+    </w:p>
+    <w:p>
+      <w:pPr>
+        <w:ind w:left="260" w:hanging="0"/>
+        <w:spacing w:before="0" w:after="15" w:line="230" w:lineRule="auto"/>
+        <w:shd w:val="clear" w:color="auto" w:fill="F2F2F2"/>
+      </w:pPr>
+      <w:r>
+        <w:rPr>
+          <w:rFonts w:ascii="Consolas" w:hAnsi="Consolas" w:cs="Consolas"/>
+          <w:color w:val="3B3B3B"/>
+          <w:sz w:val="17"/>
+          <w:szCs w:val="17"/>
+        </w:rPr>
+        <w:t xml:space="preserve">  mutationFn: api.cancelOrder,</w:t>
+      </w:r>
+    </w:p>
+    <w:p>
+      <w:pPr>
+        <w:ind w:left="260" w:hanging="0"/>
+        <w:spacing w:before="0" w:after="15" w:line="230" w:lineRule="auto"/>
+        <w:shd w:val="clear" w:color="auto" w:fill="F2F2F2"/>
+      </w:pPr>
+      <w:r>
+        <w:rPr>
+          <w:rFonts w:ascii="Consolas" w:hAnsi="Consolas" w:cs="Consolas"/>
+          <w:color w:val="3B3B3B"/>
+          <w:sz w:val="17"/>
+          <w:szCs w:val="17"/>
+        </w:rPr>
+        <w:t xml:space="preserve">  onSuccess: () =&gt; qc.invalidateQueries(</w:t>
+      </w:r>
+    </w:p>
+    <w:p>
+      <w:pPr>
+        <w:ind w:left="260" w:hanging="0"/>
+        <w:spacing w:before="0" w:after="15" w:line="230" w:lineRule="auto"/>
+        <w:shd w:val="clear" w:color="auto" w:fill="F2F2F2"/>
+      </w:pPr>
+      <w:r>
+        <w:rPr>
+          <w:rFonts w:ascii="Consolas" w:hAnsi="Consolas" w:cs="Consolas"/>
+          <w:color w:val="3B3B3B"/>
+          <w:sz w:val="17"/>
+          <w:szCs w:val="17"/>
+        </w:rPr>
+        <w:t xml:space="preserve">    { queryKey: ["orders"] }),</w:t>
+      </w:r>
+    </w:p>
+    <w:p>
+      <w:pPr>
+        <w:ind w:left="260" w:hanging="0"/>
+        <w:spacing w:before="0" w:after="15" w:line="230" w:lineRule="auto"/>
+        <w:shd w:val="clear" w:color="auto" w:fill="F2F2F2"/>
+      </w:pPr>
+      <w:r>
+        <w:rPr>
+          <w:rFonts w:ascii="Consolas" w:hAnsi="Consolas" w:cs="Consolas"/>
+          <w:color w:val="3B3B3B"/>
+          <w:sz w:val="17"/>
+          <w:szCs w:val="17"/>
+        </w:rPr>
+        <w:t xml:space="preserve">});</w:t>
+      </w:r>
+    </w:p>
+    <w:p>
+      <w:pPr>
+        <w:ind w:left="120" w:hanging="0"/>
+        <w:spacing w:before="50" w:after="110" w:line="230" w:lineRule="auto"/>
+        <w:pBdr>
+          <w:left w:val="single" w:sz="12" w:space="4" w:color="2E5E1F"/>
+        </w:pBdr>
+      </w:pPr>
+      <w:r>
+        <w:rPr>
+          <w:b/>
+          <w:color w:val="2E5E1F"/>
+          <w:sz w:val="18"/>
+          <w:szCs w:val="18"/>
+        </w:rPr>
+        <w:t xml:space="preserve">Interview answer:  </w:t>
+      </w:r>
+      <w:r>
+        <w:rPr>
+          <w:i/>
+          <w:sz w:val="18"/>
+          <w:szCs w:val="18"/>
+        </w:rPr>
+        <w:t xml:space="preserve">Manually it is useEffect plus loading/error states and abort cleanup - workable but boilerplate with zero caching. React Query reframes server data as a cache keyed by queryKey: deduping, background refetch, retries; mutations invalidate affected keys, optimistic updates keep UX instant. It replaced Redux for API data in modern apps.</w:t>
+      </w:r>
+    </w:p>
+    <w:p>
+      <w:pPr>
+        <w:spacing w:before="140" w:after="40" w:line="230" w:lineRule="auto"/>
+      </w:pPr>
+      <w:r>
+        <w:rPr>
+          <w:b/>
+          <w:sz w:val="21"/>
+          <w:szCs w:val="21"/>
+        </w:rPr>
+        <w:t xml:space="preserve">R3.3  Performance Optimization Checklist</w:t>
+      </w:r>
+    </w:p>
+    <w:p>
+      <w:pPr>
+        <w:spacing w:before="0" w:after="40" w:line="230" w:lineRule="auto"/>
+      </w:pPr>
+      <w:r>
+        <w:rPr>
+          <w:b/>
+          <w:sz w:val="18"/>
+          <w:szCs w:val="18"/>
+        </w:rPr>
+        <w:t xml:space="preserve">What it is:  </w:t>
+      </w:r>
+      <w:r>
+        <w:rPr>
+          <w:sz w:val="18"/>
+          <w:szCs w:val="18"/>
+        </w:rPr>
+        <w:t xml:space="preserve">React performance work: measure with the Profiler, cut re-render scope, virtualize big lists, shrink the bundle.</w:t>
+      </w:r>
+    </w:p>
+    <w:p>
+      <w:pPr>
+        <w:ind w:left="260" w:hanging="200"/>
+        <w:spacing w:before="0" w:after="25" w:line="230" w:lineRule="auto"/>
+      </w:pPr>
+      <w:r>
+        <w:rPr>
+          <w:sz w:val="18"/>
+          <w:szCs w:val="18"/>
+        </w:rPr>
+        <w:t xml:space="preserve">•   </w:t>
+      </w:r>
+      <w:r>
+        <w:rPr>
+          <w:sz w:val="18"/>
+          <w:szCs w:val="18"/>
+        </w:rPr>
+        <w:t xml:space="preserve">Measure first: React DevTools Profiler shows which components render and why; 'why did this render' beats guessing.</w:t>
+      </w:r>
+    </w:p>
+    <w:p>
+      <w:pPr>
+        <w:ind w:left="260" w:hanging="200"/>
+        <w:spacing w:before="0" w:after="25" w:line="230" w:lineRule="auto"/>
+      </w:pPr>
+      <w:r>
+        <w:rPr>
+          <w:sz w:val="18"/>
+          <w:szCs w:val="18"/>
+        </w:rPr>
+        <w:t xml:space="preserve">•   </w:t>
+      </w:r>
+      <w:r>
+        <w:rPr>
+          <w:sz w:val="18"/>
+          <w:szCs w:val="18"/>
+        </w:rPr>
+        <w:t xml:space="preserve">Cut re-render scope: push state down to the smallest subtree; memo set (React.memo/useMemo/useCallback) on measured hot paths; children pattern lets a wrapper re-render without its slot content.</w:t>
+      </w:r>
+    </w:p>
+    <w:p>
+      <w:pPr>
+        <w:ind w:left="260" w:hanging="200"/>
+        <w:spacing w:before="0" w:after="25" w:line="230" w:lineRule="auto"/>
+      </w:pPr>
+      <w:r>
+        <w:rPr>
+          <w:sz w:val="18"/>
+          <w:szCs w:val="18"/>
+        </w:rPr>
+        <w:t xml:space="preserve">•   </w:t>
+      </w:r>
+      <w:r>
+        <w:rPr>
+          <w:sz w:val="18"/>
+          <w:szCs w:val="18"/>
+        </w:rPr>
+        <w:t xml:space="preserve">Big lists: virtualization (react-window/TanStack Virtual) renders only visible rows - a 10k-row table becomes 20 DOM nodes.</w:t>
+      </w:r>
+    </w:p>
+    <w:p>
+      <w:pPr>
+        <w:ind w:left="260" w:hanging="200"/>
+        <w:spacing w:before="0" w:after="25" w:line="230" w:lineRule="auto"/>
+      </w:pPr>
+      <w:r>
+        <w:rPr>
+          <w:sz w:val="18"/>
+          <w:szCs w:val="18"/>
+        </w:rPr>
+        <w:t xml:space="preserve">•   </w:t>
+      </w:r>
+      <w:r>
+        <w:rPr>
+          <w:sz w:val="18"/>
+          <w:szCs w:val="18"/>
+        </w:rPr>
+        <w:t xml:space="preserve">Keys correct (stable ids), no inline heavy work in render, debounce fast inputs (search).</w:t>
+      </w:r>
+    </w:p>
+    <w:p>
+      <w:pPr>
+        <w:ind w:left="260" w:hanging="200"/>
+        <w:spacing w:before="0" w:after="25" w:line="230" w:lineRule="auto"/>
+      </w:pPr>
+      <w:r>
+        <w:rPr>
+          <w:sz w:val="18"/>
+          <w:szCs w:val="18"/>
+        </w:rPr>
+        <w:t xml:space="preserve">•   </w:t>
+      </w:r>
+      <w:r>
+        <w:rPr>
+          <w:sz w:val="18"/>
+          <w:szCs w:val="18"/>
+        </w:rPr>
+        <w:t xml:space="preserve">Bundle: code splitting per route, tree-shakeable imports, analyze with bundle visualizers, compress images.</w:t>
+      </w:r>
+    </w:p>
+    <w:p>
+      <w:pPr>
+        <w:ind w:left="260" w:hanging="200"/>
+        <w:spacing w:before="0" w:after="25" w:line="230" w:lineRule="auto"/>
+      </w:pPr>
+      <w:r>
+        <w:rPr>
+          <w:sz w:val="18"/>
+          <w:szCs w:val="18"/>
+        </w:rPr>
+        <w:t xml:space="preserve">•   </w:t>
+      </w:r>
+      <w:r>
+        <w:rPr>
+          <w:sz w:val="18"/>
+          <w:szCs w:val="18"/>
+        </w:rPr>
+        <w:t xml:space="preserve">Network: cache with React Query, paginate, avoid waterfalls (parallel queries).</w:t>
+      </w:r>
+    </w:p>
+    <w:p>
+      <w:pPr>
+        <w:ind w:left="260" w:hanging="200"/>
+        <w:spacing w:before="0" w:after="25" w:line="230" w:lineRule="auto"/>
+      </w:pPr>
+      <w:r>
+        <w:rPr>
+          <w:sz w:val="18"/>
+          <w:szCs w:val="18"/>
+        </w:rPr>
+        <w:t xml:space="preserve">•   </w:t>
+      </w:r>
+      <w:r>
+        <w:rPr>
+          <w:sz w:val="18"/>
+          <w:szCs w:val="18"/>
+        </w:rPr>
+        <w:t xml:space="preserve">Web Vitals framing (LCP/INP) connects React work to real UX metrics - senior signal.</w:t>
+      </w:r>
+    </w:p>
+    <w:p>
+      <w:pPr>
+        <w:ind w:left="260" w:hanging="0"/>
+        <w:spacing w:before="0" w:after="15" w:line="230" w:lineRule="auto"/>
+        <w:shd w:val="clear" w:color="auto" w:fill="F2F2F2"/>
+      </w:pPr>
+      <w:r>
+        <w:rPr>
+          <w:b/>
+          <w:sz w:val="17"/>
+          <w:szCs w:val="17"/>
+        </w:rPr>
+        <w:t xml:space="preserve">Example:  </w:t>
+      </w:r>
+      <w:r>
+        <w:rPr>
+          <w:rFonts w:ascii="Consolas" w:hAnsi="Consolas" w:cs="Consolas"/>
+          <w:color w:val="3B3B3B"/>
+          <w:sz w:val="17"/>
+          <w:szCs w:val="17"/>
+        </w:rPr>
+        <w:t xml:space="preserve">// virtualize 10k rows</w:t>
+      </w:r>
+    </w:p>
+    <w:p>
+      <w:pPr>
+        <w:ind w:left="260" w:hanging="0"/>
+        <w:spacing w:before="0" w:after="15" w:line="230" w:lineRule="auto"/>
+        <w:shd w:val="clear" w:color="auto" w:fill="F2F2F2"/>
+      </w:pPr>
+      <w:r>
+        <w:rPr>
+          <w:rFonts w:ascii="Consolas" w:hAnsi="Consolas" w:cs="Consolas"/>
+          <w:color w:val="3B3B3B"/>
+          <w:sz w:val="17"/>
+          <w:szCs w:val="17"/>
+        </w:rPr>
+        <w:t xml:space="preserve">&lt;FixedSizeList height={600} itemCount={rows.length}</w:t>
+      </w:r>
+    </w:p>
+    <w:p>
+      <w:pPr>
+        <w:ind w:left="260" w:hanging="0"/>
+        <w:spacing w:before="0" w:after="15" w:line="230" w:lineRule="auto"/>
+        <w:shd w:val="clear" w:color="auto" w:fill="F2F2F2"/>
+      </w:pPr>
+      <w:r>
+        <w:rPr>
+          <w:rFonts w:ascii="Consolas" w:hAnsi="Consolas" w:cs="Consolas"/>
+          <w:color w:val="3B3B3B"/>
+          <w:sz w:val="17"/>
+          <w:szCs w:val="17"/>
+        </w:rPr>
+        <w:t xml:space="preserve">               itemSize={40}&gt;</w:t>
+      </w:r>
+    </w:p>
+    <w:p>
+      <w:pPr>
+        <w:ind w:left="260" w:hanging="0"/>
+        <w:spacing w:before="0" w:after="15" w:line="230" w:lineRule="auto"/>
+        <w:shd w:val="clear" w:color="auto" w:fill="F2F2F2"/>
+      </w:pPr>
+      <w:r>
+        <w:rPr>
+          <w:rFonts w:ascii="Consolas" w:hAnsi="Consolas" w:cs="Consolas"/>
+          <w:color w:val="3B3B3B"/>
+          <w:sz w:val="17"/>
+          <w:szCs w:val="17"/>
+        </w:rPr>
+        <w:t xml:space="preserve">  {({ index, style }) =&gt; (</w:t>
+      </w:r>
+    </w:p>
+    <w:p>
+      <w:pPr>
+        <w:ind w:left="260" w:hanging="0"/>
+        <w:spacing w:before="0" w:after="15" w:line="230" w:lineRule="auto"/>
+        <w:shd w:val="clear" w:color="auto" w:fill="F2F2F2"/>
+      </w:pPr>
+      <w:r>
+        <w:rPr>
+          <w:rFonts w:ascii="Consolas" w:hAnsi="Consolas" w:cs="Consolas"/>
+          <w:color w:val="3B3B3B"/>
+          <w:sz w:val="17"/>
+          <w:szCs w:val="17"/>
+        </w:rPr>
+        <w:t xml:space="preserve">    &lt;Row style={style} data={rows[index]} /&gt;)}</w:t>
+      </w:r>
+    </w:p>
+    <w:p>
+      <w:pPr>
+        <w:ind w:left="260" w:hanging="0"/>
+        <w:spacing w:before="0" w:after="15" w:line="230" w:lineRule="auto"/>
+        <w:shd w:val="clear" w:color="auto" w:fill="F2F2F2"/>
+      </w:pPr>
+      <w:r>
+        <w:rPr>
+          <w:rFonts w:ascii="Consolas" w:hAnsi="Consolas" w:cs="Consolas"/>
+          <w:color w:val="3B3B3B"/>
+          <w:sz w:val="17"/>
+          <w:szCs w:val="17"/>
+        </w:rPr>
+        <w:t xml:space="preserve">&lt;/FixedSizeList&gt;</w:t>
+      </w:r>
+    </w:p>
+    <w:p>
+      <w:pPr>
+        <w:ind w:left="120" w:hanging="0"/>
+        <w:spacing w:before="50" w:after="110" w:line="230" w:lineRule="auto"/>
+        <w:pBdr>
+          <w:left w:val="single" w:sz="12" w:space="4" w:color="2E5E1F"/>
+        </w:pBdr>
+      </w:pPr>
+      <w:r>
+        <w:rPr>
+          <w:b/>
+          <w:color w:val="2E5E1F"/>
+          <w:sz w:val="18"/>
+          <w:szCs w:val="18"/>
+        </w:rPr>
+        <w:t xml:space="preserve">Interview answer:  </w:t>
+      </w:r>
+      <w:r>
+        <w:rPr>
+          <w:i/>
+          <w:sz w:val="18"/>
+          <w:szCs w:val="18"/>
+        </w:rPr>
+        <w:t xml:space="preserve">I profile first with DevTools, then reduce re-render scope - state pushed down, the memo set on hot paths - virtualize long lists with react-window, keep keys stable, debounce inputs, and split the bundle per route. Data-side, React Query caching and parallel queries kill refetch waterfalls. Measured in Web Vitals, not vibes.</w:t>
+      </w:r>
+    </w:p>
+    <w:p>
+      <w:pPr>
+        <w:spacing w:before="140" w:after="40" w:line="230" w:lineRule="auto"/>
+      </w:pPr>
+      <w:r>
+        <w:rPr>
+          <w:b/>
+          <w:sz w:val="21"/>
+          <w:szCs w:val="21"/>
+        </w:rPr>
+        <w:t xml:space="preserve">R3.4  Code Splitting - React.lazy and Suspense</w:t>
+      </w:r>
+    </w:p>
+    <w:p>
+      <w:pPr>
+        <w:spacing w:before="0" w:after="40" w:line="230" w:lineRule="auto"/>
+      </w:pPr>
+      <w:r>
+        <w:rPr>
+          <w:b/>
+          <w:sz w:val="18"/>
+          <w:szCs w:val="18"/>
+        </w:rPr>
+        <w:t xml:space="preserve">What it is:  </w:t>
+      </w:r>
+      <w:r>
+        <w:rPr>
+          <w:sz w:val="18"/>
+          <w:szCs w:val="18"/>
+        </w:rPr>
+        <w:t xml:space="preserve">Code splitting breaks the JS bundle into chunks loaded on demand - React.lazy imports a component lazily, Suspense shows a fallback while it loads.</w:t>
+      </w:r>
+    </w:p>
+    <w:p>
+      <w:pPr>
+        <w:ind w:left="260" w:hanging="200"/>
+        <w:spacing w:before="0" w:after="25" w:line="230" w:lineRule="auto"/>
+      </w:pPr>
+      <w:r>
+        <w:rPr>
+          <w:sz w:val="18"/>
+          <w:szCs w:val="18"/>
+        </w:rPr>
+        <w:t xml:space="preserve">•   </w:t>
+      </w:r>
+      <w:r>
+        <w:rPr>
+          <w:sz w:val="18"/>
+          <w:szCs w:val="18"/>
+        </w:rPr>
+        <w:t xml:space="preserve">Problem: one big bundle = slow first load; users download the admin panel to see the login page.</w:t>
+      </w:r>
+    </w:p>
+    <w:p>
+      <w:pPr>
+        <w:ind w:left="260" w:hanging="200"/>
+        <w:spacing w:before="0" w:after="25" w:line="230" w:lineRule="auto"/>
+      </w:pPr>
+      <w:r>
+        <w:rPr>
+          <w:sz w:val="18"/>
+          <w:szCs w:val="18"/>
+        </w:rPr>
+        <w:t xml:space="preserve">•   </w:t>
+      </w:r>
+      <w:r>
+        <w:rPr>
+          <w:sz w:val="18"/>
+          <w:szCs w:val="18"/>
+        </w:rPr>
+        <w:t xml:space="preserve">const Admin = React.lazy(() =&gt; import("./Admin")) - the bundler (Vite/webpack) makes a separate chunk fetched at first render.</w:t>
+      </w:r>
+    </w:p>
+    <w:p>
+      <w:pPr>
+        <w:ind w:left="260" w:hanging="200"/>
+        <w:spacing w:before="0" w:after="25" w:line="230" w:lineRule="auto"/>
+      </w:pPr>
+      <w:r>
+        <w:rPr>
+          <w:sz w:val="18"/>
+          <w:szCs w:val="18"/>
+        </w:rPr>
+        <w:t xml:space="preserve">•   </w:t>
+      </w:r>
+      <w:r>
+        <w:rPr>
+          <w:sz w:val="18"/>
+          <w:szCs w:val="18"/>
+        </w:rPr>
+        <w:t xml:space="preserve">&lt;Suspense fallback={&lt;Spinner/&gt;}&gt; wraps lazy components - the fallback renders during the chunk fetch.</w:t>
+      </w:r>
+    </w:p>
+    <w:p>
+      <w:pPr>
+        <w:ind w:left="260" w:hanging="200"/>
+        <w:spacing w:before="0" w:after="25" w:line="230" w:lineRule="auto"/>
+      </w:pPr>
+      <w:r>
+        <w:rPr>
+          <w:sz w:val="18"/>
+          <w:szCs w:val="18"/>
+        </w:rPr>
+        <w:t xml:space="preserve">•   </w:t>
+      </w:r>
+      <w:r>
+        <w:rPr>
+          <w:sz w:val="18"/>
+          <w:szCs w:val="18"/>
+        </w:rPr>
+        <w:t xml:space="preserve">Route-level splitting is the natural cut: every page a chunk - biggest win for least effort.</w:t>
+      </w:r>
+    </w:p>
+    <w:p>
+      <w:pPr>
+        <w:ind w:left="260" w:hanging="200"/>
+        <w:spacing w:before="0" w:after="25" w:line="230" w:lineRule="auto"/>
+      </w:pPr>
+      <w:r>
+        <w:rPr>
+          <w:sz w:val="18"/>
+          <w:szCs w:val="18"/>
+        </w:rPr>
+        <w:t xml:space="preserve">•   </w:t>
+      </w:r>
+      <w:r>
+        <w:rPr>
+          <w:sz w:val="18"/>
+          <w:szCs w:val="18"/>
+        </w:rPr>
+        <w:t xml:space="preserve">Suspense boundaries can nest - page-level spinner plus widget-level ones.</w:t>
+      </w:r>
+    </w:p>
+    <w:p>
+      <w:pPr>
+        <w:ind w:left="260" w:hanging="200"/>
+        <w:spacing w:before="0" w:after="25" w:line="230" w:lineRule="auto"/>
+      </w:pPr>
+      <w:r>
+        <w:rPr>
+          <w:sz w:val="18"/>
+          <w:szCs w:val="18"/>
+        </w:rPr>
+        <w:t xml:space="preserve">•   </w:t>
+      </w:r>
+      <w:r>
+        <w:rPr>
+          <w:sz w:val="18"/>
+          <w:szCs w:val="18"/>
+        </w:rPr>
+        <w:t xml:space="preserve">Suspense is also the data-loading primitive (React Query/Next integrations) - one fallback model for code AND data.</w:t>
+      </w:r>
+    </w:p>
+    <w:p>
+      <w:pPr>
+        <w:ind w:left="260" w:hanging="200"/>
+        <w:spacing w:before="0" w:after="25" w:line="230" w:lineRule="auto"/>
+      </w:pPr>
+      <w:r>
+        <w:rPr>
+          <w:sz w:val="18"/>
+          <w:szCs w:val="18"/>
+        </w:rPr>
+        <w:t xml:space="preserve">•   </w:t>
+      </w:r>
+      <w:r>
+        <w:rPr>
+          <w:sz w:val="18"/>
+          <w:szCs w:val="18"/>
+        </w:rPr>
+        <w:t xml:space="preserve">Preloading on hover/idle hides chunk latency; error boundaries catch chunk-load failures (deploy changed hashes).</w:t>
+      </w:r>
+    </w:p>
+    <w:p>
+      <w:pPr>
+        <w:ind w:left="260" w:hanging="0"/>
+        <w:spacing w:before="0" w:after="15" w:line="230" w:lineRule="auto"/>
+        <w:shd w:val="clear" w:color="auto" w:fill="F2F2F2"/>
+      </w:pPr>
+      <w:r>
+        <w:rPr>
+          <w:b/>
+          <w:sz w:val="17"/>
+          <w:szCs w:val="17"/>
+        </w:rPr>
+        <w:t xml:space="preserve">Example:  </w:t>
+      </w:r>
+      <w:r>
+        <w:rPr>
+          <w:rFonts w:ascii="Consolas" w:hAnsi="Consolas" w:cs="Consolas"/>
+          <w:color w:val="3B3B3B"/>
+          <w:sz w:val="17"/>
+          <w:szCs w:val="17"/>
+        </w:rPr>
+        <w:t xml:space="preserve">const Admin = React.lazy(</w:t>
+      </w:r>
+    </w:p>
+    <w:p>
+      <w:pPr>
+        <w:ind w:left="260" w:hanging="0"/>
+        <w:spacing w:before="0" w:after="15" w:line="230" w:lineRule="auto"/>
+        <w:shd w:val="clear" w:color="auto" w:fill="F2F2F2"/>
+      </w:pPr>
+      <w:r>
+        <w:rPr>
+          <w:rFonts w:ascii="Consolas" w:hAnsi="Consolas" w:cs="Consolas"/>
+          <w:color w:val="3B3B3B"/>
+          <w:sz w:val="17"/>
+          <w:szCs w:val="17"/>
+        </w:rPr>
+        <w:t xml:space="preserve">  () =&gt; import("./pages/Admin"));</w:t>
+      </w:r>
+    </w:p>
+    <w:p>
+      <w:pPr>
+        <w:ind w:left="260" w:hanging="0"/>
+        <w:spacing w:before="0" w:after="15" w:line="230" w:lineRule="auto"/>
+        <w:shd w:val="clear" w:color="auto" w:fill="F2F2F2"/>
+      </w:pPr>
+      <w:r>
+        <w:rPr>
+          <w:rFonts w:ascii="Consolas" w:hAnsi="Consolas" w:cs="Consolas"/>
+          <w:color w:val="3B3B3B"/>
+          <w:sz w:val="17"/>
+          <w:szCs w:val="17"/>
+        </w:rPr>
+        <w:t xml:space="preserve"/>
+      </w:r>
+    </w:p>
+    <w:p>
+      <w:pPr>
+        <w:ind w:left="260" w:hanging="0"/>
+        <w:spacing w:before="0" w:after="15" w:line="230" w:lineRule="auto"/>
+        <w:shd w:val="clear" w:color="auto" w:fill="F2F2F2"/>
+      </w:pPr>
+      <w:r>
+        <w:rPr>
+          <w:rFonts w:ascii="Consolas" w:hAnsi="Consolas" w:cs="Consolas"/>
+          <w:color w:val="3B3B3B"/>
+          <w:sz w:val="17"/>
+          <w:szCs w:val="17"/>
+        </w:rPr>
+        <w:t xml:space="preserve">&lt;Suspense fallback={&lt;Spinner /&gt;}&gt;</w:t>
+      </w:r>
+    </w:p>
+    <w:p>
+      <w:pPr>
+        <w:ind w:left="260" w:hanging="0"/>
+        <w:spacing w:before="0" w:after="15" w:line="230" w:lineRule="auto"/>
+        <w:shd w:val="clear" w:color="auto" w:fill="F2F2F2"/>
+      </w:pPr>
+      <w:r>
+        <w:rPr>
+          <w:rFonts w:ascii="Consolas" w:hAnsi="Consolas" w:cs="Consolas"/>
+          <w:color w:val="3B3B3B"/>
+          <w:sz w:val="17"/>
+          <w:szCs w:val="17"/>
+        </w:rPr>
+        <w:t xml:space="preserve">  &lt;Routes&gt;</w:t>
+      </w:r>
+    </w:p>
+    <w:p>
+      <w:pPr>
+        <w:ind w:left="260" w:hanging="0"/>
+        <w:spacing w:before="0" w:after="15" w:line="230" w:lineRule="auto"/>
+        <w:shd w:val="clear" w:color="auto" w:fill="F2F2F2"/>
+      </w:pPr>
+      <w:r>
+        <w:rPr>
+          <w:rFonts w:ascii="Consolas" w:hAnsi="Consolas" w:cs="Consolas"/>
+          <w:color w:val="3B3B3B"/>
+          <w:sz w:val="17"/>
+          <w:szCs w:val="17"/>
+        </w:rPr>
+        <w:t xml:space="preserve">    &lt;Route path="/admin"</w:t>
+      </w:r>
+    </w:p>
+    <w:p>
+      <w:pPr>
+        <w:ind w:left="260" w:hanging="0"/>
+        <w:spacing w:before="0" w:after="15" w:line="230" w:lineRule="auto"/>
+        <w:shd w:val="clear" w:color="auto" w:fill="F2F2F2"/>
+      </w:pPr>
+      <w:r>
+        <w:rPr>
+          <w:rFonts w:ascii="Consolas" w:hAnsi="Consolas" w:cs="Consolas"/>
+          <w:color w:val="3B3B3B"/>
+          <w:sz w:val="17"/>
+          <w:szCs w:val="17"/>
+        </w:rPr>
+        <w:t xml:space="preserve">           element={&lt;Admin /&gt;} /&gt;</w:t>
+      </w:r>
+    </w:p>
+    <w:p>
+      <w:pPr>
+        <w:ind w:left="260" w:hanging="0"/>
+        <w:spacing w:before="0" w:after="15" w:line="230" w:lineRule="auto"/>
+        <w:shd w:val="clear" w:color="auto" w:fill="F2F2F2"/>
+      </w:pPr>
+      <w:r>
+        <w:rPr>
+          <w:rFonts w:ascii="Consolas" w:hAnsi="Consolas" w:cs="Consolas"/>
+          <w:color w:val="3B3B3B"/>
+          <w:sz w:val="17"/>
+          <w:szCs w:val="17"/>
+        </w:rPr>
+        <w:t xml:space="preserve">  &lt;/Routes&gt;</w:t>
+      </w:r>
+    </w:p>
+    <w:p>
+      <w:pPr>
+        <w:ind w:left="260" w:hanging="0"/>
+        <w:spacing w:before="0" w:after="15" w:line="230" w:lineRule="auto"/>
+        <w:shd w:val="clear" w:color="auto" w:fill="F2F2F2"/>
+      </w:pPr>
+      <w:r>
+        <w:rPr>
+          <w:rFonts w:ascii="Consolas" w:hAnsi="Consolas" w:cs="Consolas"/>
+          <w:color w:val="3B3B3B"/>
+          <w:sz w:val="17"/>
+          <w:szCs w:val="17"/>
+        </w:rPr>
+        <w:t xml:space="preserve">&lt;/Suspense&gt;</w:t>
+      </w:r>
+    </w:p>
+    <w:p>
+      <w:pPr>
+        <w:ind w:left="120" w:hanging="0"/>
+        <w:spacing w:before="50" w:after="110" w:line="230" w:lineRule="auto"/>
+        <w:pBdr>
+          <w:left w:val="single" w:sz="12" w:space="4" w:color="2E5E1F"/>
+        </w:pBdr>
+      </w:pPr>
+      <w:r>
+        <w:rPr>
+          <w:b/>
+          <w:color w:val="2E5E1F"/>
+          <w:sz w:val="18"/>
+          <w:szCs w:val="18"/>
+        </w:rPr>
+        <w:t xml:space="preserve">Interview answer:  </w:t>
+      </w:r>
+      <w:r>
+        <w:rPr>
+          <w:i/>
+          <w:sz w:val="18"/>
+          <w:szCs w:val="18"/>
+        </w:rPr>
+        <w:t xml:space="preserve">React.lazy with dynamic import splits components into on-demand chunks and Suspense renders a fallback while they load - route-level splitting gives the biggest first-load win. Boundaries nest, Suspense doubles as the data-loading primitive, and I pair it with preloading and an error boundary for failed chunk fetches after deploys.</w:t>
+      </w:r>
+    </w:p>
+    <w:p>
+      <w:pPr>
+        <w:spacing w:before="140" w:after="40" w:line="230" w:lineRule="auto"/>
+      </w:pPr>
+      <w:r>
+        <w:rPr>
+          <w:b/>
+          <w:sz w:val="21"/>
+          <w:szCs w:val="21"/>
+        </w:rPr>
+        <w:t xml:space="preserve">R3.5  Error Boundaries</w:t>
+      </w:r>
+    </w:p>
+    <w:p>
+      <w:pPr>
+        <w:spacing w:before="0" w:after="40" w:line="230" w:lineRule="auto"/>
+      </w:pPr>
+      <w:r>
+        <w:rPr>
+          <w:b/>
+          <w:sz w:val="18"/>
+          <w:szCs w:val="18"/>
+        </w:rPr>
+        <w:t xml:space="preserve">What it is:  </w:t>
+      </w:r>
+      <w:r>
+        <w:rPr>
+          <w:sz w:val="18"/>
+          <w:szCs w:val="18"/>
+        </w:rPr>
+        <w:t xml:space="preserve">An error boundary catches render-time errors in its subtree and shows a fallback UI instead of unmounting the whole app.</w:t>
+      </w:r>
+    </w:p>
+    <w:p>
+      <w:pPr>
+        <w:ind w:left="260" w:hanging="200"/>
+        <w:spacing w:before="0" w:after="25" w:line="230" w:lineRule="auto"/>
+      </w:pPr>
+      <w:r>
+        <w:rPr>
+          <w:sz w:val="18"/>
+          <w:szCs w:val="18"/>
+        </w:rPr>
+        <w:t xml:space="preserve">•   </w:t>
+      </w:r>
+      <w:r>
+        <w:rPr>
+          <w:sz w:val="18"/>
+          <w:szCs w:val="18"/>
+        </w:rPr>
+        <w:t xml:space="preserve">Without one, any render error blanks the entire page - React unmounts the root.</w:t>
+      </w:r>
+    </w:p>
+    <w:p>
+      <w:pPr>
+        <w:ind w:left="260" w:hanging="200"/>
+        <w:spacing w:before="0" w:after="25" w:line="230" w:lineRule="auto"/>
+      </w:pPr>
+      <w:r>
+        <w:rPr>
+          <w:sz w:val="18"/>
+          <w:szCs w:val="18"/>
+        </w:rPr>
+        <w:t xml:space="preserve">•   </w:t>
+      </w:r>
+      <w:r>
+        <w:rPr>
+          <w:sz w:val="18"/>
+          <w:szCs w:val="18"/>
+        </w:rPr>
+        <w:t xml:space="preserve">Still class-based: componentDidCatch + getDerivedStateFromError - the one remaining class-component use (an interview fact); react-error-boundary package wraps it in a nice API.</w:t>
+      </w:r>
+    </w:p>
+    <w:p>
+      <w:pPr>
+        <w:ind w:left="260" w:hanging="200"/>
+        <w:spacing w:before="0" w:after="25" w:line="230" w:lineRule="auto"/>
+      </w:pPr>
+      <w:r>
+        <w:rPr>
+          <w:sz w:val="18"/>
+          <w:szCs w:val="18"/>
+        </w:rPr>
+        <w:t xml:space="preserve">•   </w:t>
+      </w:r>
+      <w:r>
+        <w:rPr>
+          <w:sz w:val="18"/>
+          <w:szCs w:val="18"/>
+        </w:rPr>
+        <w:t xml:space="preserve">Catches: render, lifecycle, constructor errors below it. Does NOT catch: event handlers (try/catch there), async/promise errors, server errors - name these limits.</w:t>
+      </w:r>
+    </w:p>
+    <w:p>
+      <w:pPr>
+        <w:ind w:left="260" w:hanging="200"/>
+        <w:spacing w:before="0" w:after="25" w:line="230" w:lineRule="auto"/>
+      </w:pPr>
+      <w:r>
+        <w:rPr>
+          <w:sz w:val="18"/>
+          <w:szCs w:val="18"/>
+        </w:rPr>
+        <w:t xml:space="preserve">•   </w:t>
+      </w:r>
+      <w:r>
+        <w:rPr>
+          <w:sz w:val="18"/>
+          <w:szCs w:val="18"/>
+        </w:rPr>
+        <w:t xml:space="preserve">Placement strategy: one app-level boundary + boundaries around independent widgets - a crashing chart should not kill the dashboard.</w:t>
+      </w:r>
+    </w:p>
+    <w:p>
+      <w:pPr>
+        <w:ind w:left="260" w:hanging="200"/>
+        <w:spacing w:before="0" w:after="25" w:line="230" w:lineRule="auto"/>
+      </w:pPr>
+      <w:r>
+        <w:rPr>
+          <w:sz w:val="18"/>
+          <w:szCs w:val="18"/>
+        </w:rPr>
+        <w:t xml:space="preserve">•   </w:t>
+      </w:r>
+      <w:r>
+        <w:rPr>
+          <w:sz w:val="18"/>
+          <w:szCs w:val="18"/>
+        </w:rPr>
+        <w:t xml:space="preserve">Fallback UI with a retry (reset) button; log the error to Sentry in the catch hook.</w:t>
+      </w:r>
+    </w:p>
+    <w:p>
+      <w:pPr>
+        <w:ind w:left="260" w:hanging="200"/>
+        <w:spacing w:before="0" w:after="25" w:line="230" w:lineRule="auto"/>
+      </w:pPr>
+      <w:r>
+        <w:rPr>
+          <w:sz w:val="18"/>
+          <w:szCs w:val="18"/>
+        </w:rPr>
+        <w:t xml:space="preserve">•   </w:t>
+      </w:r>
+      <w:r>
+        <w:rPr>
+          <w:sz w:val="18"/>
+          <w:szCs w:val="18"/>
+        </w:rPr>
+        <w:t xml:space="preserve">Pairs with Suspense: Suspense handles loading, error boundary handles failure - the standard pair around lazy/data components.</w:t>
+      </w:r>
+    </w:p>
+    <w:p>
+      <w:pPr>
+        <w:ind w:left="260" w:hanging="0"/>
+        <w:spacing w:before="0" w:after="15" w:line="230" w:lineRule="auto"/>
+        <w:shd w:val="clear" w:color="auto" w:fill="F2F2F2"/>
+      </w:pPr>
+      <w:r>
+        <w:rPr>
+          <w:b/>
+          <w:sz w:val="17"/>
+          <w:szCs w:val="17"/>
+        </w:rPr>
+        <w:t xml:space="preserve">Example:  </w:t>
+      </w:r>
+      <w:r>
+        <w:rPr>
+          <w:rFonts w:ascii="Consolas" w:hAnsi="Consolas" w:cs="Consolas"/>
+          <w:color w:val="3B3B3B"/>
+          <w:sz w:val="17"/>
+          <w:szCs w:val="17"/>
+        </w:rPr>
+        <w:t xml:space="preserve">&lt;ErrorBoundary</w:t>
+      </w:r>
+    </w:p>
+    <w:p>
+      <w:pPr>
+        <w:ind w:left="260" w:hanging="0"/>
+        <w:spacing w:before="0" w:after="15" w:line="230" w:lineRule="auto"/>
+        <w:shd w:val="clear" w:color="auto" w:fill="F2F2F2"/>
+      </w:pPr>
+      <w:r>
+        <w:rPr>
+          <w:rFonts w:ascii="Consolas" w:hAnsi="Consolas" w:cs="Consolas"/>
+          <w:color w:val="3B3B3B"/>
+          <w:sz w:val="17"/>
+          <w:szCs w:val="17"/>
+        </w:rPr>
+        <w:t xml:space="preserve">  FallbackComponent={ChartError}</w:t>
+      </w:r>
+    </w:p>
+    <w:p>
+      <w:pPr>
+        <w:ind w:left="260" w:hanging="0"/>
+        <w:spacing w:before="0" w:after="15" w:line="230" w:lineRule="auto"/>
+        <w:shd w:val="clear" w:color="auto" w:fill="F2F2F2"/>
+      </w:pPr>
+      <w:r>
+        <w:rPr>
+          <w:rFonts w:ascii="Consolas" w:hAnsi="Consolas" w:cs="Consolas"/>
+          <w:color w:val="3B3B3B"/>
+          <w:sz w:val="17"/>
+          <w:szCs w:val="17"/>
+        </w:rPr>
+        <w:t xml:space="preserve">  onError={logToSentry}</w:t>
+      </w:r>
+    </w:p>
+    <w:p>
+      <w:pPr>
+        <w:ind w:left="260" w:hanging="0"/>
+        <w:spacing w:before="0" w:after="15" w:line="230" w:lineRule="auto"/>
+        <w:shd w:val="clear" w:color="auto" w:fill="F2F2F2"/>
+      </w:pPr>
+      <w:r>
+        <w:rPr>
+          <w:rFonts w:ascii="Consolas" w:hAnsi="Consolas" w:cs="Consolas"/>
+          <w:color w:val="3B3B3B"/>
+          <w:sz w:val="17"/>
+          <w:szCs w:val="17"/>
+        </w:rPr>
+        <w:t xml:space="preserve">  onReset={refetch}&gt;</w:t>
+      </w:r>
+    </w:p>
+    <w:p>
+      <w:pPr>
+        <w:ind w:left="260" w:hanging="0"/>
+        <w:spacing w:before="0" w:after="15" w:line="230" w:lineRule="auto"/>
+        <w:shd w:val="clear" w:color="auto" w:fill="F2F2F2"/>
+      </w:pPr>
+      <w:r>
+        <w:rPr>
+          <w:rFonts w:ascii="Consolas" w:hAnsi="Consolas" w:cs="Consolas"/>
+          <w:color w:val="3B3B3B"/>
+          <w:sz w:val="17"/>
+          <w:szCs w:val="17"/>
+        </w:rPr>
+        <w:t xml:space="preserve">  &lt;RevenueChart /&gt;</w:t>
+      </w:r>
+    </w:p>
+    <w:p>
+      <w:pPr>
+        <w:ind w:left="260" w:hanging="0"/>
+        <w:spacing w:before="0" w:after="15" w:line="230" w:lineRule="auto"/>
+        <w:shd w:val="clear" w:color="auto" w:fill="F2F2F2"/>
+      </w:pPr>
+      <w:r>
+        <w:rPr>
+          <w:rFonts w:ascii="Consolas" w:hAnsi="Consolas" w:cs="Consolas"/>
+          <w:color w:val="3B3B3B"/>
+          <w:sz w:val="17"/>
+          <w:szCs w:val="17"/>
+        </w:rPr>
+        <w:t xml:space="preserve">&lt;/ErrorBoundary&gt;</w:t>
+      </w:r>
+    </w:p>
+    <w:p>
+      <w:pPr>
+        <w:ind w:left="260" w:hanging="0"/>
+        <w:spacing w:before="0" w:after="15" w:line="230" w:lineRule="auto"/>
+        <w:shd w:val="clear" w:color="auto" w:fill="F2F2F2"/>
+      </w:pPr>
+      <w:r>
+        <w:rPr>
+          <w:rFonts w:ascii="Consolas" w:hAnsi="Consolas" w:cs="Consolas"/>
+          <w:color w:val="3B3B3B"/>
+          <w:sz w:val="17"/>
+          <w:szCs w:val="17"/>
+        </w:rPr>
+        <w:t xml:space="preserve">// chart crash != dashboard crash</w:t>
+      </w:r>
+    </w:p>
+    <w:p>
+      <w:pPr>
+        <w:ind w:left="120" w:hanging="0"/>
+        <w:spacing w:before="50" w:after="110" w:line="230" w:lineRule="auto"/>
+        <w:pBdr>
+          <w:left w:val="single" w:sz="12" w:space="4" w:color="2E5E1F"/>
+        </w:pBdr>
+      </w:pPr>
+      <w:r>
+        <w:rPr>
+          <w:b/>
+          <w:color w:val="2E5E1F"/>
+          <w:sz w:val="18"/>
+          <w:szCs w:val="18"/>
+        </w:rPr>
+        <w:t xml:space="preserve">Interview answer:  </w:t>
+      </w:r>
+      <w:r>
+        <w:rPr>
+          <w:i/>
+          <w:sz w:val="18"/>
+          <w:szCs w:val="18"/>
+        </w:rPr>
+        <w:t xml:space="preserve">Error boundaries catch render errors in their subtree and swap in a fallback instead of blanking the app - still implemented via class lifecycles, usually through react-error-boundary. They miss event handlers and async errors, so those need their own handling. I place one at app level plus around independent widgets, with Sentry logging and a retry reset.</w:t>
+      </w:r>
+    </w:p>
+    <w:p>
+      <w:pPr>
+        <w:spacing w:before="140" w:after="40" w:line="230" w:lineRule="auto"/>
+      </w:pPr>
+      <w:r>
+        <w:rPr>
+          <w:b/>
+          <w:sz w:val="21"/>
+          <w:szCs w:val="21"/>
+        </w:rPr>
+        <w:t xml:space="preserve">R3.6  React 18+ - Concurrent Features</w:t>
+      </w:r>
+    </w:p>
+    <w:p>
+      <w:pPr>
+        <w:spacing w:before="0" w:after="40" w:line="230" w:lineRule="auto"/>
+      </w:pPr>
+      <w:r>
+        <w:rPr>
+          <w:b/>
+          <w:sz w:val="18"/>
+          <w:szCs w:val="18"/>
+        </w:rPr>
+        <w:t xml:space="preserve">What it is:  </w:t>
+      </w:r>
+      <w:r>
+        <w:rPr>
+          <w:sz w:val="18"/>
+          <w:szCs w:val="18"/>
+        </w:rPr>
+        <w:t xml:space="preserve">React 18 made rendering interruptible: automatic batching everywhere, transitions for non-urgent updates, and Suspense-based patterns - with 19 adding Actions and the compiler direction.</w:t>
+      </w:r>
+    </w:p>
+    <w:p>
+      <w:pPr>
+        <w:ind w:left="260" w:hanging="200"/>
+        <w:spacing w:before="0" w:after="25" w:line="230" w:lineRule="auto"/>
+      </w:pPr>
+      <w:r>
+        <w:rPr>
+          <w:sz w:val="18"/>
+          <w:szCs w:val="18"/>
+        </w:rPr>
+        <w:t xml:space="preserve">•   </w:t>
+      </w:r>
+      <w:r>
+        <w:rPr>
+          <w:sz w:val="18"/>
+          <w:szCs w:val="18"/>
+        </w:rPr>
+        <w:t xml:space="preserve">Automatic batching: multiple setStates in promises/timeouts/handlers collapse into one render (pre-18 only handlers batched).</w:t>
+      </w:r>
+    </w:p>
+    <w:p>
+      <w:pPr>
+        <w:ind w:left="260" w:hanging="200"/>
+        <w:spacing w:before="0" w:after="25" w:line="230" w:lineRule="auto"/>
+      </w:pPr>
+      <w:r>
+        <w:rPr>
+          <w:sz w:val="18"/>
+          <w:szCs w:val="18"/>
+        </w:rPr>
+        <w:t xml:space="preserve">•   </w:t>
+      </w:r>
+      <w:r>
+        <w:rPr>
+          <w:sz w:val="18"/>
+          <w:szCs w:val="18"/>
+        </w:rPr>
+        <w:t xml:space="preserve">Concurrent rendering: React can pause low-priority renders to keep input responsive - the foundation under the new features.</w:t>
+      </w:r>
+    </w:p>
+    <w:p>
+      <w:pPr>
+        <w:ind w:left="260" w:hanging="200"/>
+        <w:spacing w:before="0" w:after="25" w:line="230" w:lineRule="auto"/>
+      </w:pPr>
+      <w:r>
+        <w:rPr>
+          <w:sz w:val="18"/>
+          <w:szCs w:val="18"/>
+        </w:rPr>
+        <w:t xml:space="preserve">•   </w:t>
+      </w:r>
+      <w:r>
+        <w:rPr>
+          <w:sz w:val="18"/>
+          <w:szCs w:val="18"/>
+        </w:rPr>
+        <w:t xml:space="preserve">useTransition/startTransition: mark updates non-urgent - typing stays instant while the filtered 10k-list renders when there is time; isPending shows progress.</w:t>
+      </w:r>
+    </w:p>
+    <w:p>
+      <w:pPr>
+        <w:ind w:left="260" w:hanging="200"/>
+        <w:spacing w:before="0" w:after="25" w:line="230" w:lineRule="auto"/>
+      </w:pPr>
+      <w:r>
+        <w:rPr>
+          <w:sz w:val="18"/>
+          <w:szCs w:val="18"/>
+        </w:rPr>
+        <w:t xml:space="preserve">•   </w:t>
+      </w:r>
+      <w:r>
+        <w:rPr>
+          <w:sz w:val="18"/>
+          <w:szCs w:val="18"/>
+        </w:rPr>
+        <w:t xml:space="preserve">useDeferredValue: lag a derived value behind its source - same goal, value-shaped.</w:t>
+      </w:r>
+    </w:p>
+    <w:p>
+      <w:pPr>
+        <w:ind w:left="260" w:hanging="200"/>
+        <w:spacing w:before="0" w:after="25" w:line="230" w:lineRule="auto"/>
+      </w:pPr>
+      <w:r>
+        <w:rPr>
+          <w:sz w:val="18"/>
+          <w:szCs w:val="18"/>
+        </w:rPr>
+        <w:t xml:space="preserve">•   </w:t>
+      </w:r>
+      <w:r>
+        <w:rPr>
+          <w:sz w:val="18"/>
+          <w:szCs w:val="18"/>
+        </w:rPr>
+        <w:t xml:space="preserve">createRoot is the 18 entry point enabling all of it; StrictMode double-invokes to catch unsafe effects.</w:t>
+      </w:r>
+    </w:p>
+    <w:p>
+      <w:pPr>
+        <w:ind w:left="260" w:hanging="200"/>
+        <w:spacing w:before="0" w:after="25" w:line="230" w:lineRule="auto"/>
+      </w:pPr>
+      <w:r>
+        <w:rPr>
+          <w:sz w:val="18"/>
+          <w:szCs w:val="18"/>
+        </w:rPr>
+        <w:t xml:space="preserve">•   </w:t>
+      </w:r>
+      <w:r>
+        <w:rPr>
+          <w:sz w:val="18"/>
+          <w:szCs w:val="18"/>
+        </w:rPr>
+        <w:t xml:space="preserve">React 19 direction: Actions (form submissions with pending/error built in), use() hook, Server Components (Next.js) moving data-heavy rendering server-side - naming these shows currency.</w:t>
+      </w:r>
+    </w:p>
+    <w:p>
+      <w:pPr>
+        <w:ind w:left="260" w:hanging="0"/>
+        <w:spacing w:before="0" w:after="15" w:line="230" w:lineRule="auto"/>
+        <w:shd w:val="clear" w:color="auto" w:fill="F2F2F2"/>
+      </w:pPr>
+      <w:r>
+        <w:rPr>
+          <w:b/>
+          <w:sz w:val="17"/>
+          <w:szCs w:val="17"/>
+        </w:rPr>
+        <w:t xml:space="preserve">Example:  </w:t>
+      </w:r>
+      <w:r>
+        <w:rPr>
+          <w:rFonts w:ascii="Consolas" w:hAnsi="Consolas" w:cs="Consolas"/>
+          <w:color w:val="3B3B3B"/>
+          <w:sz w:val="17"/>
+          <w:szCs w:val="17"/>
+        </w:rPr>
+        <w:t xml:space="preserve">const [isPending, startTransition] =</w:t>
+      </w:r>
+    </w:p>
+    <w:p>
+      <w:pPr>
+        <w:ind w:left="260" w:hanging="0"/>
+        <w:spacing w:before="0" w:after="15" w:line="230" w:lineRule="auto"/>
+        <w:shd w:val="clear" w:color="auto" w:fill="F2F2F2"/>
+      </w:pPr>
+      <w:r>
+        <w:rPr>
+          <w:rFonts w:ascii="Consolas" w:hAnsi="Consolas" w:cs="Consolas"/>
+          <w:color w:val="3B3B3B"/>
+          <w:sz w:val="17"/>
+          <w:szCs w:val="17"/>
+        </w:rPr>
+        <w:t xml:space="preserve">  useTransition();</w:t>
+      </w:r>
+    </w:p>
+    <w:p>
+      <w:pPr>
+        <w:ind w:left="260" w:hanging="0"/>
+        <w:spacing w:before="0" w:after="15" w:line="230" w:lineRule="auto"/>
+        <w:shd w:val="clear" w:color="auto" w:fill="F2F2F2"/>
+      </w:pPr>
+      <w:r>
+        <w:rPr>
+          <w:rFonts w:ascii="Consolas" w:hAnsi="Consolas" w:cs="Consolas"/>
+          <w:color w:val="3B3B3B"/>
+          <w:sz w:val="17"/>
+          <w:szCs w:val="17"/>
+        </w:rPr>
+        <w:t xml:space="preserve"/>
+      </w:r>
+    </w:p>
+    <w:p>
+      <w:pPr>
+        <w:ind w:left="260" w:hanging="0"/>
+        <w:spacing w:before="0" w:after="15" w:line="230" w:lineRule="auto"/>
+        <w:shd w:val="clear" w:color="auto" w:fill="F2F2F2"/>
+      </w:pPr>
+      <w:r>
+        <w:rPr>
+          <w:rFonts w:ascii="Consolas" w:hAnsi="Consolas" w:cs="Consolas"/>
+          <w:color w:val="3B3B3B"/>
+          <w:sz w:val="17"/>
+          <w:szCs w:val="17"/>
+        </w:rPr>
+        <w:t xml:space="preserve">const onSearch = e =&gt; {</w:t>
+      </w:r>
+    </w:p>
+    <w:p>
+      <w:pPr>
+        <w:ind w:left="260" w:hanging="0"/>
+        <w:spacing w:before="0" w:after="15" w:line="230" w:lineRule="auto"/>
+        <w:shd w:val="clear" w:color="auto" w:fill="F2F2F2"/>
+      </w:pPr>
+      <w:r>
+        <w:rPr>
+          <w:rFonts w:ascii="Consolas" w:hAnsi="Consolas" w:cs="Consolas"/>
+          <w:color w:val="3B3B3B"/>
+          <w:sz w:val="17"/>
+          <w:szCs w:val="17"/>
+        </w:rPr>
+        <w:t xml:space="preserve">  setQuery(e.target.value);      // urgent</w:t>
+      </w:r>
+    </w:p>
+    <w:p>
+      <w:pPr>
+        <w:ind w:left="260" w:hanging="0"/>
+        <w:spacing w:before="0" w:after="15" w:line="230" w:lineRule="auto"/>
+        <w:shd w:val="clear" w:color="auto" w:fill="F2F2F2"/>
+      </w:pPr>
+      <w:r>
+        <w:rPr>
+          <w:rFonts w:ascii="Consolas" w:hAnsi="Consolas" w:cs="Consolas"/>
+          <w:color w:val="3B3B3B"/>
+          <w:sz w:val="17"/>
+          <w:szCs w:val="17"/>
+        </w:rPr>
+        <w:t xml:space="preserve">  startTransition(() =&gt;          // deferrable</w:t>
+      </w:r>
+    </w:p>
+    <w:p>
+      <w:pPr>
+        <w:ind w:left="260" w:hanging="0"/>
+        <w:spacing w:before="0" w:after="15" w:line="230" w:lineRule="auto"/>
+        <w:shd w:val="clear" w:color="auto" w:fill="F2F2F2"/>
+      </w:pPr>
+      <w:r>
+        <w:rPr>
+          <w:rFonts w:ascii="Consolas" w:hAnsi="Consolas" w:cs="Consolas"/>
+          <w:color w:val="3B3B3B"/>
+          <w:sz w:val="17"/>
+          <w:szCs w:val="17"/>
+        </w:rPr>
+        <w:t xml:space="preserve">    setFiltered(filter(rows,</w:t>
+      </w:r>
+    </w:p>
+    <w:p>
+      <w:pPr>
+        <w:ind w:left="260" w:hanging="0"/>
+        <w:spacing w:before="0" w:after="15" w:line="230" w:lineRule="auto"/>
+        <w:shd w:val="clear" w:color="auto" w:fill="F2F2F2"/>
+      </w:pPr>
+      <w:r>
+        <w:rPr>
+          <w:rFonts w:ascii="Consolas" w:hAnsi="Consolas" w:cs="Consolas"/>
+          <w:color w:val="3B3B3B"/>
+          <w:sz w:val="17"/>
+          <w:szCs w:val="17"/>
+        </w:rPr>
+        <w:t xml:space="preserve">                e.target.value)));</w:t>
+      </w:r>
+    </w:p>
+    <w:p>
+      <w:pPr>
+        <w:ind w:left="260" w:hanging="0"/>
+        <w:spacing w:before="0" w:after="15" w:line="230" w:lineRule="auto"/>
+        <w:shd w:val="clear" w:color="auto" w:fill="F2F2F2"/>
+      </w:pPr>
+      <w:r>
+        <w:rPr>
+          <w:rFonts w:ascii="Consolas" w:hAnsi="Consolas" w:cs="Consolas"/>
+          <w:color w:val="3B3B3B"/>
+          <w:sz w:val="17"/>
+          <w:szCs w:val="17"/>
+        </w:rPr>
+        <w:t xml:space="preserve">};</w:t>
+      </w:r>
+    </w:p>
+    <w:p>
+      <w:pPr>
+        <w:ind w:left="120" w:hanging="0"/>
+        <w:spacing w:before="50" w:after="110" w:line="230" w:lineRule="auto"/>
+        <w:pBdr>
+          <w:left w:val="single" w:sz="12" w:space="4" w:color="2E5E1F"/>
+        </w:pBdr>
+      </w:pPr>
+      <w:r>
+        <w:rPr>
+          <w:b/>
+          <w:color w:val="2E5E1F"/>
+          <w:sz w:val="18"/>
+          <w:szCs w:val="18"/>
+        </w:rPr>
+        <w:t xml:space="preserve">Interview answer:  </w:t>
+      </w:r>
+      <w:r>
+        <w:rPr>
+          <w:i/>
+          <w:sz w:val="18"/>
+          <w:szCs w:val="18"/>
+        </w:rPr>
+        <w:t xml:space="preserve">React 18 brought automatic batching everywhere and interruptible concurrent rendering: useTransition/startTransition mark heavy updates as non-urgent so typing never janks, useDeferredValue lags derived values, all enabled by createRoot. React 19 continues with Actions for forms, the use() hook, Server Components, and the compiler auto-memoizing - the ecosystem direction worth naming.</w:t>
+      </w:r>
+    </w:p>
+    <w:p>
+      <w:pPr>
+        <w:spacing w:before="140" w:after="40" w:line="230" w:lineRule="auto"/>
+      </w:pPr>
+      <w:r>
+        <w:rPr>
+          <w:b/>
+          <w:sz w:val="21"/>
+          <w:szCs w:val="21"/>
+        </w:rPr>
+        <w:t xml:space="preserve">R3.7  React Native / Expo</w:t>
+      </w:r>
+    </w:p>
+    <w:p>
+      <w:pPr>
+        <w:spacing w:before="0" w:after="40" w:line="230" w:lineRule="auto"/>
+      </w:pPr>
+      <w:r>
+        <w:rPr>
+          <w:b/>
+          <w:sz w:val="18"/>
+          <w:szCs w:val="18"/>
+        </w:rPr>
+        <w:t xml:space="preserve">What it is:  </w:t>
+      </w:r>
+      <w:r>
+        <w:rPr>
+          <w:sz w:val="18"/>
+          <w:szCs w:val="18"/>
+        </w:rPr>
+        <w:t xml:space="preserve">React Native runs the same React model with native mobile views instead of DOM; Expo is the managed toolchain around it.</w:t>
+      </w:r>
+    </w:p>
+    <w:p>
+      <w:pPr>
+        <w:ind w:left="260" w:hanging="200"/>
+        <w:spacing w:before="0" w:after="25" w:line="230" w:lineRule="auto"/>
+      </w:pPr>
+      <w:r>
+        <w:rPr>
+          <w:sz w:val="18"/>
+          <w:szCs w:val="18"/>
+        </w:rPr>
+        <w:t xml:space="preserve">•   </w:t>
+      </w:r>
+      <w:r>
+        <w:rPr>
+          <w:sz w:val="18"/>
+          <w:szCs w:val="18"/>
+        </w:rPr>
+        <w:t xml:space="preserve">Same hooks, state, props - but &lt;View&gt;/&lt;Text&gt;/&lt;FlatList&gt; instead of div/span; styles via StyleSheet objects (flexbox default), no CSS files.</w:t>
+      </w:r>
+    </w:p>
+    <w:p>
+      <w:pPr>
+        <w:ind w:left="260" w:hanging="200"/>
+        <w:spacing w:before="0" w:after="25" w:line="230" w:lineRule="auto"/>
+      </w:pPr>
+      <w:r>
+        <w:rPr>
+          <w:sz w:val="18"/>
+          <w:szCs w:val="18"/>
+        </w:rPr>
+        <w:t xml:space="preserve">•   </w:t>
+      </w:r>
+      <w:r>
+        <w:rPr>
+          <w:sz w:val="18"/>
+          <w:szCs w:val="18"/>
+        </w:rPr>
+        <w:t xml:space="preserve">Not a webview: JS drives real native components across a bridge (new architecture: JSI/Fabric makes it near-direct calls).</w:t>
+      </w:r>
+    </w:p>
+    <w:p>
+      <w:pPr>
+        <w:ind w:left="260" w:hanging="200"/>
+        <w:spacing w:before="0" w:after="25" w:line="230" w:lineRule="auto"/>
+      </w:pPr>
+      <w:r>
+        <w:rPr>
+          <w:sz w:val="18"/>
+          <w:szCs w:val="18"/>
+        </w:rPr>
+        <w:t xml:space="preserve">•   </w:t>
+      </w:r>
+      <w:r>
+        <w:rPr>
+          <w:sz w:val="18"/>
+          <w:szCs w:val="18"/>
+        </w:rPr>
+        <w:t xml:space="preserve">Expo: SDK (camera, location, notifications), instant device preview via Expo Go, and EAS cloud builds/updates - no Xcode/Android Studio to start. Config plugins/dev-builds cover native modules; bare workflow is the escape hatch.</w:t>
+      </w:r>
+    </w:p>
+    <w:p>
+      <w:pPr>
+        <w:ind w:left="260" w:hanging="200"/>
+        <w:spacing w:before="0" w:after="25" w:line="230" w:lineRule="auto"/>
+      </w:pPr>
+      <w:r>
+        <w:rPr>
+          <w:sz w:val="18"/>
+          <w:szCs w:val="18"/>
+        </w:rPr>
+        <w:t xml:space="preserve">•   </w:t>
+      </w:r>
+      <w:r>
+        <w:rPr>
+          <w:sz w:val="18"/>
+          <w:szCs w:val="18"/>
+        </w:rPr>
+        <w:t xml:space="preserve">Navigation: react-navigation (or expo-router's file-based routes) replaces React Router - stack/tab navigators.</w:t>
+      </w:r>
+    </w:p>
+    <w:p>
+      <w:pPr>
+        <w:ind w:left="260" w:hanging="200"/>
+        <w:spacing w:before="0" w:after="25" w:line="230" w:lineRule="auto"/>
+      </w:pPr>
+      <w:r>
+        <w:rPr>
+          <w:sz w:val="18"/>
+          <w:szCs w:val="18"/>
+        </w:rPr>
+        <w:t xml:space="preserve">•   </w:t>
+      </w:r>
+      <w:r>
+        <w:rPr>
+          <w:sz w:val="18"/>
+          <w:szCs w:val="18"/>
+        </w:rPr>
+        <w:t xml:space="preserve">Lists: FlatList is virtualization built in - keyExtractor + renderItem, never map for long lists.</w:t>
+      </w:r>
+    </w:p>
+    <w:p>
+      <w:pPr>
+        <w:ind w:left="260" w:hanging="200"/>
+        <w:spacing w:before="0" w:after="25" w:line="230" w:lineRule="auto"/>
+      </w:pPr>
+      <w:r>
+        <w:rPr>
+          <w:sz w:val="18"/>
+          <w:szCs w:val="18"/>
+        </w:rPr>
+        <w:t xml:space="preserve">•   </w:t>
+      </w:r>
+      <w:r>
+        <w:rPr>
+          <w:sz w:val="18"/>
+          <w:szCs w:val="18"/>
+        </w:rPr>
+        <w:t xml:space="preserve">Platform differences via Platform.select and per-platform files; OTA updates ship JS fixes without store review.</w:t>
+      </w:r>
+    </w:p>
+    <w:p>
+      <w:pPr>
+        <w:ind w:left="260" w:hanging="200"/>
+        <w:spacing w:before="0" w:after="25" w:line="230" w:lineRule="auto"/>
+      </w:pPr>
+      <w:r>
+        <w:rPr>
+          <w:sz w:val="18"/>
+          <w:szCs w:val="18"/>
+        </w:rPr>
+        <w:t xml:space="preserve">•   </w:t>
+      </w:r>
+      <w:r>
+        <w:rPr>
+          <w:sz w:val="18"/>
+          <w:szCs w:val="18"/>
+        </w:rPr>
+        <w:t xml:space="preserve">My hands-on: the Fabric Dispatch app at Leemboodi - Expo + REST APIs to a Flask backend, real-time dispatch verification.</w:t>
+      </w:r>
+    </w:p>
+    <w:p>
+      <w:pPr>
+        <w:ind w:left="260" w:hanging="0"/>
+        <w:spacing w:before="0" w:after="15" w:line="230" w:lineRule="auto"/>
+        <w:shd w:val="clear" w:color="auto" w:fill="F2F2F2"/>
+      </w:pPr>
+      <w:r>
+        <w:rPr>
+          <w:b/>
+          <w:sz w:val="17"/>
+          <w:szCs w:val="17"/>
+        </w:rPr>
+        <w:t xml:space="preserve">Example:  </w:t>
+      </w:r>
+      <w:r>
+        <w:rPr>
+          <w:rFonts w:ascii="Consolas" w:hAnsi="Consolas" w:cs="Consolas"/>
+          <w:color w:val="3B3B3B"/>
+          <w:sz w:val="17"/>
+          <w:szCs w:val="17"/>
+        </w:rPr>
+        <w:t xml:space="preserve">&lt;FlatList</w:t>
+      </w:r>
+    </w:p>
+    <w:p>
+      <w:pPr>
+        <w:ind w:left="260" w:hanging="0"/>
+        <w:spacing w:before="0" w:after="15" w:line="230" w:lineRule="auto"/>
+        <w:shd w:val="clear" w:color="auto" w:fill="F2F2F2"/>
+      </w:pPr>
+      <w:r>
+        <w:rPr>
+          <w:rFonts w:ascii="Consolas" w:hAnsi="Consolas" w:cs="Consolas"/>
+          <w:color w:val="3B3B3B"/>
+          <w:sz w:val="17"/>
+          <w:szCs w:val="17"/>
+        </w:rPr>
+        <w:t xml:space="preserve">  data={dispatches}</w:t>
+      </w:r>
+    </w:p>
+    <w:p>
+      <w:pPr>
+        <w:ind w:left="260" w:hanging="0"/>
+        <w:spacing w:before="0" w:after="15" w:line="230" w:lineRule="auto"/>
+        <w:shd w:val="clear" w:color="auto" w:fill="F2F2F2"/>
+      </w:pPr>
+      <w:r>
+        <w:rPr>
+          <w:rFonts w:ascii="Consolas" w:hAnsi="Consolas" w:cs="Consolas"/>
+          <w:color w:val="3B3B3B"/>
+          <w:sz w:val="17"/>
+          <w:szCs w:val="17"/>
+        </w:rPr>
+        <w:t xml:space="preserve">  keyExtractor={d =&gt; d.id}</w:t>
+      </w:r>
+    </w:p>
+    <w:p>
+      <w:pPr>
+        <w:ind w:left="260" w:hanging="0"/>
+        <w:spacing w:before="0" w:after="15" w:line="230" w:lineRule="auto"/>
+        <w:shd w:val="clear" w:color="auto" w:fill="F2F2F2"/>
+      </w:pPr>
+      <w:r>
+        <w:rPr>
+          <w:rFonts w:ascii="Consolas" w:hAnsi="Consolas" w:cs="Consolas"/>
+          <w:color w:val="3B3B3B"/>
+          <w:sz w:val="17"/>
+          <w:szCs w:val="17"/>
+        </w:rPr>
+        <w:t xml:space="preserve">  renderItem={({ item }) =&gt; (</w:t>
+      </w:r>
+    </w:p>
+    <w:p>
+      <w:pPr>
+        <w:ind w:left="260" w:hanging="0"/>
+        <w:spacing w:before="0" w:after="15" w:line="230" w:lineRule="auto"/>
+        <w:shd w:val="clear" w:color="auto" w:fill="F2F2F2"/>
+      </w:pPr>
+      <w:r>
+        <w:rPr>
+          <w:rFonts w:ascii="Consolas" w:hAnsi="Consolas" w:cs="Consolas"/>
+          <w:color w:val="3B3B3B"/>
+          <w:sz w:val="17"/>
+          <w:szCs w:val="17"/>
+        </w:rPr>
+        <w:t xml:space="preserve">    &lt;View style={styles.row}&gt;</w:t>
+      </w:r>
+    </w:p>
+    <w:p>
+      <w:pPr>
+        <w:ind w:left="260" w:hanging="0"/>
+        <w:spacing w:before="0" w:after="15" w:line="230" w:lineRule="auto"/>
+        <w:shd w:val="clear" w:color="auto" w:fill="F2F2F2"/>
+      </w:pPr>
+      <w:r>
+        <w:rPr>
+          <w:rFonts w:ascii="Consolas" w:hAnsi="Consolas" w:cs="Consolas"/>
+          <w:color w:val="3B3B3B"/>
+          <w:sz w:val="17"/>
+          <w:szCs w:val="17"/>
+        </w:rPr>
+        <w:t xml:space="preserve">      &lt;Text&gt;{item.fabric}&lt;/Text&gt;</w:t>
+      </w:r>
+    </w:p>
+    <w:p>
+      <w:pPr>
+        <w:ind w:left="260" w:hanging="0"/>
+        <w:spacing w:before="0" w:after="15" w:line="230" w:lineRule="auto"/>
+        <w:shd w:val="clear" w:color="auto" w:fill="F2F2F2"/>
+      </w:pPr>
+      <w:r>
+        <w:rPr>
+          <w:rFonts w:ascii="Consolas" w:hAnsi="Consolas" w:cs="Consolas"/>
+          <w:color w:val="3B3B3B"/>
+          <w:sz w:val="17"/>
+          <w:szCs w:val="17"/>
+        </w:rPr>
+        <w:t xml:space="preserve">    &lt;/View&gt;</w:t>
+      </w:r>
+    </w:p>
+    <w:p>
+      <w:pPr>
+        <w:ind w:left="260" w:hanging="0"/>
+        <w:spacing w:before="0" w:after="15" w:line="230" w:lineRule="auto"/>
+        <w:shd w:val="clear" w:color="auto" w:fill="F2F2F2"/>
+      </w:pPr>
+      <w:r>
+        <w:rPr>
+          <w:rFonts w:ascii="Consolas" w:hAnsi="Consolas" w:cs="Consolas"/>
+          <w:color w:val="3B3B3B"/>
+          <w:sz w:val="17"/>
+          <w:szCs w:val="17"/>
+        </w:rPr>
+        <w:t xml:space="preserve">  )}</w:t>
+      </w:r>
+    </w:p>
+    <w:p>
+      <w:pPr>
+        <w:ind w:left="260" w:hanging="0"/>
+        <w:spacing w:before="0" w:after="15" w:line="230" w:lineRule="auto"/>
+        <w:shd w:val="clear" w:color="auto" w:fill="F2F2F2"/>
+      </w:pPr>
+      <w:r>
+        <w:rPr>
+          <w:rFonts w:ascii="Consolas" w:hAnsi="Consolas" w:cs="Consolas"/>
+          <w:color w:val="3B3B3B"/>
+          <w:sz w:val="17"/>
+          <w:szCs w:val="17"/>
+        </w:rPr>
+        <w:t xml:space="preserve">  onRefresh={refetch} refreshing={loading}</w:t>
+      </w:r>
+    </w:p>
+    <w:p>
+      <w:pPr>
+        <w:ind w:left="260" w:hanging="0"/>
+        <w:spacing w:before="0" w:after="15" w:line="230" w:lineRule="auto"/>
+        <w:shd w:val="clear" w:color="auto" w:fill="F2F2F2"/>
+      </w:pPr>
+      <w:r>
+        <w:rPr>
+          <w:rFonts w:ascii="Consolas" w:hAnsi="Consolas" w:cs="Consolas"/>
+          <w:color w:val="3B3B3B"/>
+          <w:sz w:val="17"/>
+          <w:szCs w:val="17"/>
+        </w:rPr>
+        <w:t xml:space="preserve">/&gt;</w:t>
+      </w:r>
+    </w:p>
+    <w:p>
+      <w:pPr>
+        <w:ind w:left="120" w:hanging="0"/>
+        <w:spacing w:before="50" w:after="110" w:line="230" w:lineRule="auto"/>
+        <w:pBdr>
+          <w:left w:val="single" w:sz="12" w:space="4" w:color="2E5E1F"/>
+        </w:pBdr>
+      </w:pPr>
+      <w:r>
+        <w:rPr>
+          <w:b/>
+          <w:color w:val="2E5E1F"/>
+          <w:sz w:val="18"/>
+          <w:szCs w:val="18"/>
+        </w:rPr>
+        <w:t xml:space="preserve">Interview answer:  </w:t>
+      </w:r>
+      <w:r>
+        <w:rPr>
+          <w:i/>
+          <w:sz w:val="18"/>
+          <w:szCs w:val="18"/>
+        </w:rPr>
+        <w:t xml:space="preserve">React Native reuses React's exact component/hook model but renders real native views - View/Text/FlatList, StyleSheet flexbox, JSI bridge underneath. Expo wraps it with the SDK, instant device preview and EAS cloud builds, with dev-builds for native modules. I built Leemboodi's Fabric Dispatch app on Expo with a Flask REST backend - FlatList virtualization and react-navigation in production.</w:t>
       </w:r>
     </w:p>
     <w:sectPr>

</xml_diff>